<commit_message>
feat: F checked Business_rules_v1
</commit_message>
<xml_diff>
--- a/docs/business_rules_v1.docx
+++ b/docs/business_rules_v1.docx
@@ -1,6 +1,6 @@
 
 <file path=word/document.xml><?xml version="1.0" encoding="utf-8"?>
-<w:document xmlns:wpc="http://schemas.microsoft.com/office/word/2010/wordprocessingCanvas" xmlns:cx="http://schemas.microsoft.com/office/drawing/2014/chartex" xmlns:cx1="http://schemas.microsoft.com/office/drawing/2015/9/8/chartex" xmlns:cx2="http://schemas.microsoft.com/office/drawing/2015/10/21/chartex" xmlns:cx3="http://schemas.microsoft.com/office/drawing/2016/5/9/chartex" xmlns:cx4="http://schemas.microsoft.com/office/drawing/2016/5/10/chartex" xmlns:cx5="http://schemas.microsoft.com/office/drawing/2016/5/11/chartex" xmlns:cx6="http://schemas.microsoft.com/office/drawing/2016/5/12/chartex" xmlns:cx7="http://schemas.microsoft.com/office/drawing/2016/5/13/chartex" xmlns:cx8="http://schemas.microsoft.com/office/drawing/2016/5/14/chartex" xmlns:mc="http://schemas.openxmlformats.org/markup-compatibility/2006" xmlns:aink="http://schemas.microsoft.com/office/drawing/2016/ink" xmlns:am3d="http://schemas.microsoft.com/office/drawing/2017/model3d" xmlns:o="urn:schemas-microsoft-com:office:office" xmlns:oel="http://schemas.microsoft.com/office/2019/extlst" xmlns:r="http://schemas.openxmlformats.org/officeDocument/2006/relationships" xmlns:m="http://schemas.openxmlformats.org/officeDocument/2006/math" xmlns:v="urn:schemas-microsoft-com:vml" xmlns:wp14="http://schemas.microsoft.com/office/word/2010/wordprocessingDrawing" xmlns:wp="http://schemas.openxmlformats.org/drawingml/2006/wordprocessingDrawing" xmlns:w10="urn:schemas-microsoft-com:office:word" xmlns:w="http://schemas.openxmlformats.org/wordprocessingml/2006/main" xmlns:w14="http://schemas.microsoft.com/office/word/2010/wordml" xmlns:w15="http://schemas.microsoft.com/office/word/2012/wordml" xmlns:w16cex="http://schemas.microsoft.com/office/word/2018/wordml/cex" xmlns:w16cid="http://schemas.microsoft.com/office/word/2016/wordml/cid" xmlns:w16="http://schemas.microsoft.com/office/word/2018/wordml" xmlns:w16du="http://schemas.microsoft.com/office/word/2023/wordml/word16du" xmlns:w16sdtdh="http://schemas.microsoft.com/office/word/2020/wordml/sdtdatahash" xmlns:w16sdtfl="http://schemas.microsoft.com/office/word/2024/wordml/sdtformatlock" xmlns:w16se="http://schemas.microsoft.com/office/word/2015/wordml/symex" xmlns:wpg="http://schemas.microsoft.com/office/word/2010/wordprocessingGroup" xmlns:wpi="http://schemas.microsoft.com/office/word/2010/wordprocessingInk" xmlns:wne="http://schemas.microsoft.com/office/word/2006/wordml" xmlns:wps="http://schemas.microsoft.com/office/word/2010/wordprocessingShape" mc:Ignorable="w14 w15 w16se w16cid w16 w16cex w16sdtdh w16sdtfl w16du wp14">
+<w:document xmlns:wpc="http://schemas.microsoft.com/office/word/2010/wordprocessingCanvas" xmlns:cx="http://schemas.microsoft.com/office/drawing/2014/chartex" xmlns:cx1="http://schemas.microsoft.com/office/drawing/2015/9/8/chartex" xmlns:cx2="http://schemas.microsoft.com/office/drawing/2015/10/21/chartex" xmlns:cx3="http://schemas.microsoft.com/office/drawing/2016/5/9/chartex" xmlns:cx4="http://schemas.microsoft.com/office/drawing/2016/5/10/chartex" xmlns:cx5="http://schemas.microsoft.com/office/drawing/2016/5/11/chartex" xmlns:cx6="http://schemas.microsoft.com/office/drawing/2016/5/12/chartex" xmlns:cx7="http://schemas.microsoft.com/office/drawing/2016/5/13/chartex" xmlns:cx8="http://schemas.microsoft.com/office/drawing/2016/5/14/chartex" xmlns:mc="http://schemas.openxmlformats.org/markup-compatibility/2006" xmlns:m="http://schemas.openxmlformats.org/officeDocument/2006/math" xmlns:aink="http://schemas.microsoft.com/office/drawing/2016/ink" xmlns:am3d="http://schemas.microsoft.com/office/drawing/2017/model3d" xmlns:oel="http://schemas.microsoft.com/office/2019/extlst" xmlns:r="http://schemas.openxmlformats.org/officeDocument/2006/relationships" xmlns:wp14="http://schemas.microsoft.com/office/word/2010/wordprocessingDrawing" xmlns:wp="http://schemas.openxmlformats.org/drawingml/2006/wordprocessingDrawing" xmlns:wpg="http://schemas.microsoft.com/office/word/2010/wordprocessingGroup" xmlns:wpi="http://schemas.microsoft.com/office/word/2010/wordprocessingInk" xmlns:wps="http://schemas.microsoft.com/office/word/2010/wordprocessingShape" xmlns:o="urn:schemas-microsoft-com:office:office" xmlns:v="urn:schemas-microsoft-com:vml" xmlns:w10="urn:schemas-microsoft-com:office:word" xmlns:w="http://schemas.openxmlformats.org/wordprocessingml/2006/main" xmlns:w14="http://schemas.microsoft.com/office/word/2010/wordml" xmlns:w15="http://schemas.microsoft.com/office/word/2012/wordml" xmlns:w16cex="http://schemas.microsoft.com/office/word/2018/wordml/cex" xmlns:w16cid="http://schemas.microsoft.com/office/word/2016/wordml/cid" xmlns:w16="http://schemas.microsoft.com/office/word/2018/wordml" xmlns:w16sdtdh="http://schemas.microsoft.com/office/word/2020/wordml/sdtdatahash" xmlns:w16sdtfl="http://schemas.microsoft.com/office/word/2024/wordml/sdtformatlock" xmlns:w16se="http://schemas.microsoft.com/office/word/2015/wordml/symex" xmlns:w16du="http://schemas.microsoft.com/office/word/2023/wordml/word16du" xmlns:wne="http://schemas.microsoft.com/office/word/2006/wordml" mc:Ignorable="w14 w15 w16se w16cid w16 w16cex w16sdtdh w16sdtfl w16du wp14">
   <w:body>
     <w:p>
       <w:pPr>
@@ -115,7 +115,7 @@
     </w:p>
     <w:p>
       <w:pPr>
-        <w:pStyle w:val="1"/>
+        <w:pStyle w:val="Heading1"/>
         <w:rPr>
           <w:color w:val="000000" w:themeColor="text1"/>
         </w:rPr>
@@ -150,12 +150,6 @@
         <w:gridCol w:w="7518"/>
       </w:tblGrid>
       <w:tr>
-        <w:tblPrEx>
-          <w:tblCellMar>
-            <w:top w:w="0" w:type="dxa"/>
-            <w:bottom w:w="0" w:type="dxa"/>
-          </w:tblCellMar>
-        </w:tblPrEx>
         <w:trPr>
           <w:tblHeader/>
         </w:trPr>
@@ -233,12 +227,6 @@
         </w:tc>
       </w:tr>
       <w:tr>
-        <w:tblPrEx>
-          <w:tblCellMar>
-            <w:top w:w="0" w:type="dxa"/>
-            <w:bottom w:w="0" w:type="dxa"/>
-          </w:tblCellMar>
-        </w:tblPrEx>
         <w:tc>
           <w:tcPr>
             <w:tcW w:w="2120" w:type="dxa"/>
@@ -343,12 +331,6 @@
         </w:tc>
       </w:tr>
       <w:tr>
-        <w:tblPrEx>
-          <w:tblCellMar>
-            <w:top w:w="0" w:type="dxa"/>
-            <w:bottom w:w="0" w:type="dxa"/>
-          </w:tblCellMar>
-        </w:tblPrEx>
         <w:tc>
           <w:tcPr>
             <w:tcW w:w="2120" w:type="dxa"/>
@@ -417,12 +399,6 @@
         </w:tc>
       </w:tr>
       <w:tr>
-        <w:tblPrEx>
-          <w:tblCellMar>
-            <w:top w:w="0" w:type="dxa"/>
-            <w:bottom w:w="0" w:type="dxa"/>
-          </w:tblCellMar>
-        </w:tblPrEx>
         <w:tc>
           <w:tcPr>
             <w:tcW w:w="2120" w:type="dxa"/>
@@ -521,12 +497,6 @@
         </w:tc>
       </w:tr>
       <w:tr>
-        <w:tblPrEx>
-          <w:tblCellMar>
-            <w:top w:w="0" w:type="dxa"/>
-            <w:bottom w:w="0" w:type="dxa"/>
-          </w:tblCellMar>
-        </w:tblPrEx>
         <w:tc>
           <w:tcPr>
             <w:tcW w:w="2120" w:type="dxa"/>
@@ -613,12 +583,6 @@
         </w:tc>
       </w:tr>
       <w:tr>
-        <w:tblPrEx>
-          <w:tblCellMar>
-            <w:top w:w="0" w:type="dxa"/>
-            <w:bottom w:w="0" w:type="dxa"/>
-          </w:tblCellMar>
-        </w:tblPrEx>
         <w:tc>
           <w:tcPr>
             <w:tcW w:w="2120" w:type="dxa"/>
@@ -687,12 +651,6 @@
         </w:tc>
       </w:tr>
       <w:tr>
-        <w:tblPrEx>
-          <w:tblCellMar>
-            <w:top w:w="0" w:type="dxa"/>
-            <w:bottom w:w="0" w:type="dxa"/>
-          </w:tblCellMar>
-        </w:tblPrEx>
         <w:tc>
           <w:tcPr>
             <w:tcW w:w="2120" w:type="dxa"/>
@@ -789,7 +747,7 @@
     </w:p>
     <w:p>
       <w:pPr>
-        <w:pStyle w:val="1"/>
+        <w:pStyle w:val="Heading1"/>
         <w:rPr>
           <w:color w:val="000000" w:themeColor="text1"/>
         </w:rPr>
@@ -848,12 +806,6 @@
         <w:gridCol w:w="4818"/>
       </w:tblGrid>
       <w:tr>
-        <w:tblPrEx>
-          <w:tblCellMar>
-            <w:top w:w="0" w:type="dxa"/>
-            <w:bottom w:w="0" w:type="dxa"/>
-          </w:tblCellMar>
-        </w:tblPrEx>
         <w:trPr>
           <w:tblHeader/>
         </w:trPr>
@@ -1005,12 +957,6 @@
         </w:tc>
       </w:tr>
       <w:tr>
-        <w:tblPrEx>
-          <w:tblCellMar>
-            <w:top w:w="0" w:type="dxa"/>
-            <w:bottom w:w="0" w:type="dxa"/>
-          </w:tblCellMar>
-        </w:tblPrEx>
         <w:tc>
           <w:tcPr>
             <w:tcW w:w="2506" w:type="dxa"/>
@@ -1147,12 +1093,6 @@
         </w:tc>
       </w:tr>
       <w:tr>
-        <w:tblPrEx>
-          <w:tblCellMar>
-            <w:top w:w="0" w:type="dxa"/>
-            <w:bottom w:w="0" w:type="dxa"/>
-          </w:tblCellMar>
-        </w:tblPrEx>
         <w:tc>
           <w:tcPr>
             <w:tcW w:w="2506" w:type="dxa"/>
@@ -1211,7 +1151,6 @@
                 <w:color w:val="000000" w:themeColor="text1"/>
               </w:rPr>
             </w:pPr>
-            <w:proofErr w:type="spellStart"/>
             <w:r>
               <w:rPr>
                 <w:color w:val="000000" w:themeColor="text1"/>
@@ -1278,7 +1217,6 @@
                 <w:color w:val="000000" w:themeColor="text1"/>
               </w:rPr>
             </w:pPr>
-            <w:proofErr w:type="spellEnd"/>
             <w:r>
               <w:rPr>
                 <w:color w:val="000000" w:themeColor="text1"/>
@@ -1291,12 +1229,6 @@
         </w:tc>
       </w:tr>
       <w:tr>
-        <w:tblPrEx>
-          <w:tblCellMar>
-            <w:top w:w="0" w:type="dxa"/>
-            <w:bottom w:w="0" w:type="dxa"/>
-          </w:tblCellMar>
-        </w:tblPrEx>
         <w:tc>
           <w:tcPr>
             <w:tcW w:w="2506" w:type="dxa"/>
@@ -1431,12 +1363,6 @@
         </w:tc>
       </w:tr>
       <w:tr>
-        <w:tblPrEx>
-          <w:tblCellMar>
-            <w:top w:w="0" w:type="dxa"/>
-            <w:bottom w:w="0" w:type="dxa"/>
-          </w:tblCellMar>
-        </w:tblPrEx>
         <w:tc>
           <w:tcPr>
             <w:tcW w:w="2506" w:type="dxa"/>
@@ -1573,12 +1499,6 @@
         </w:tc>
       </w:tr>
       <w:tr>
-        <w:tblPrEx>
-          <w:tblCellMar>
-            <w:top w:w="0" w:type="dxa"/>
-            <w:bottom w:w="0" w:type="dxa"/>
-          </w:tblCellMar>
-        </w:tblPrEx>
         <w:tc>
           <w:tcPr>
             <w:tcW w:w="2506" w:type="dxa"/>
@@ -1715,12 +1635,6 @@
         </w:tc>
       </w:tr>
       <w:tr>
-        <w:tblPrEx>
-          <w:tblCellMar>
-            <w:top w:w="0" w:type="dxa"/>
-            <w:bottom w:w="0" w:type="dxa"/>
-          </w:tblCellMar>
-        </w:tblPrEx>
         <w:tc>
           <w:tcPr>
             <w:tcW w:w="2506" w:type="dxa"/>
@@ -1857,12 +1771,6 @@
         </w:tc>
       </w:tr>
       <w:tr>
-        <w:tblPrEx>
-          <w:tblCellMar>
-            <w:top w:w="0" w:type="dxa"/>
-            <w:bottom w:w="0" w:type="dxa"/>
-          </w:tblCellMar>
-        </w:tblPrEx>
         <w:tc>
           <w:tcPr>
             <w:tcW w:w="2506" w:type="dxa"/>
@@ -1999,12 +1907,6 @@
         </w:tc>
       </w:tr>
       <w:tr>
-        <w:tblPrEx>
-          <w:tblCellMar>
-            <w:top w:w="0" w:type="dxa"/>
-            <w:bottom w:w="0" w:type="dxa"/>
-          </w:tblCellMar>
-        </w:tblPrEx>
         <w:tc>
           <w:tcPr>
             <w:tcW w:w="2506" w:type="dxa"/>
@@ -2141,12 +2043,6 @@
         </w:tc>
       </w:tr>
       <w:tr>
-        <w:tblPrEx>
-          <w:tblCellMar>
-            <w:top w:w="0" w:type="dxa"/>
-            <w:bottom w:w="0" w:type="dxa"/>
-          </w:tblCellMar>
-        </w:tblPrEx>
         <w:tc>
           <w:tcPr>
             <w:tcW w:w="2506" w:type="dxa"/>
@@ -2293,7 +2189,7 @@
     </w:p>
     <w:p>
       <w:pPr>
-        <w:pStyle w:val="1"/>
+        <w:pStyle w:val="Heading1"/>
         <w:rPr>
           <w:color w:val="000000" w:themeColor="text1"/>
         </w:rPr>
@@ -2328,12 +2224,6 @@
         <w:gridCol w:w="7518"/>
       </w:tblGrid>
       <w:tr>
-        <w:tblPrEx>
-          <w:tblCellMar>
-            <w:top w:w="0" w:type="dxa"/>
-            <w:bottom w:w="0" w:type="dxa"/>
-          </w:tblCellMar>
-        </w:tblPrEx>
         <w:trPr>
           <w:tblHeader/>
         </w:trPr>
@@ -2411,12 +2301,6 @@
         </w:tc>
       </w:tr>
       <w:tr>
-        <w:tblPrEx>
-          <w:tblCellMar>
-            <w:top w:w="0" w:type="dxa"/>
-            <w:bottom w:w="0" w:type="dxa"/>
-          </w:tblCellMar>
-        </w:tblPrEx>
         <w:tc>
           <w:tcPr>
             <w:tcW w:w="2120" w:type="dxa"/>
@@ -2485,12 +2369,6 @@
         </w:tc>
       </w:tr>
       <w:tr>
-        <w:tblPrEx>
-          <w:tblCellMar>
-            <w:top w:w="0" w:type="dxa"/>
-            <w:bottom w:w="0" w:type="dxa"/>
-          </w:tblCellMar>
-        </w:tblPrEx>
         <w:tc>
           <w:tcPr>
             <w:tcW w:w="2120" w:type="dxa"/>
@@ -2659,12 +2537,6 @@
         </w:tc>
       </w:tr>
       <w:tr>
-        <w:tblPrEx>
-          <w:tblCellMar>
-            <w:top w:w="0" w:type="dxa"/>
-            <w:bottom w:w="0" w:type="dxa"/>
-          </w:tblCellMar>
-        </w:tblPrEx>
         <w:tc>
           <w:tcPr>
             <w:tcW w:w="2120" w:type="dxa"/>
@@ -2734,12 +2606,6 @@
         </w:tc>
       </w:tr>
       <w:tr>
-        <w:tblPrEx>
-          <w:tblCellMar>
-            <w:top w:w="0" w:type="dxa"/>
-            <w:bottom w:w="0" w:type="dxa"/>
-          </w:tblCellMar>
-        </w:tblPrEx>
         <w:tc>
           <w:tcPr>
             <w:tcW w:w="2120" w:type="dxa"/>
@@ -2842,12 +2708,6 @@
         </w:tc>
       </w:tr>
       <w:tr>
-        <w:tblPrEx>
-          <w:tblCellMar>
-            <w:top w:w="0" w:type="dxa"/>
-            <w:bottom w:w="0" w:type="dxa"/>
-          </w:tblCellMar>
-        </w:tblPrEx>
         <w:tc>
           <w:tcPr>
             <w:tcW w:w="2120" w:type="dxa"/>
@@ -2932,12 +2792,6 @@
         </w:tc>
       </w:tr>
       <w:tr>
-        <w:tblPrEx>
-          <w:tblCellMar>
-            <w:top w:w="0" w:type="dxa"/>
-            <w:bottom w:w="0" w:type="dxa"/>
-          </w:tblCellMar>
-        </w:tblPrEx>
         <w:tc>
           <w:tcPr>
             <w:tcW w:w="2120" w:type="dxa"/>
@@ -3036,7 +2890,7 @@
     </w:p>
     <w:p>
       <w:pPr>
-        <w:pStyle w:val="1"/>
+        <w:pStyle w:val="Heading1"/>
         <w:rPr>
           <w:color w:val="000000" w:themeColor="text1"/>
         </w:rPr>
@@ -3071,12 +2925,6 @@
         <w:gridCol w:w="7518"/>
       </w:tblGrid>
       <w:tr>
-        <w:tblPrEx>
-          <w:tblCellMar>
-            <w:top w:w="0" w:type="dxa"/>
-            <w:bottom w:w="0" w:type="dxa"/>
-          </w:tblCellMar>
-        </w:tblPrEx>
         <w:trPr>
           <w:tblHeader/>
         </w:trPr>
@@ -3154,12 +3002,6 @@
         </w:tc>
       </w:tr>
       <w:tr>
-        <w:tblPrEx>
-          <w:tblCellMar>
-            <w:top w:w="0" w:type="dxa"/>
-            <w:bottom w:w="0" w:type="dxa"/>
-          </w:tblCellMar>
-        </w:tblPrEx>
         <w:tc>
           <w:tcPr>
             <w:tcW w:w="2120" w:type="dxa"/>
@@ -3228,12 +3070,6 @@
         </w:tc>
       </w:tr>
       <w:tr>
-        <w:tblPrEx>
-          <w:tblCellMar>
-            <w:top w:w="0" w:type="dxa"/>
-            <w:bottom w:w="0" w:type="dxa"/>
-          </w:tblCellMar>
-        </w:tblPrEx>
         <w:tc>
           <w:tcPr>
             <w:tcW w:w="2120" w:type="dxa"/>
@@ -3436,12 +3272,6 @@
         </w:tc>
       </w:tr>
       <w:tr>
-        <w:tblPrEx>
-          <w:tblCellMar>
-            <w:top w:w="0" w:type="dxa"/>
-            <w:bottom w:w="0" w:type="dxa"/>
-          </w:tblCellMar>
-        </w:tblPrEx>
         <w:tc>
           <w:tcPr>
             <w:tcW w:w="2120" w:type="dxa"/>
@@ -3510,12 +3340,6 @@
         </w:tc>
       </w:tr>
       <w:tr>
-        <w:tblPrEx>
-          <w:tblCellMar>
-            <w:top w:w="0" w:type="dxa"/>
-            <w:bottom w:w="0" w:type="dxa"/>
-          </w:tblCellMar>
-        </w:tblPrEx>
         <w:tc>
           <w:tcPr>
             <w:tcW w:w="2120" w:type="dxa"/>
@@ -3600,12 +3424,6 @@
         </w:tc>
       </w:tr>
       <w:tr>
-        <w:tblPrEx>
-          <w:tblCellMar>
-            <w:top w:w="0" w:type="dxa"/>
-            <w:bottom w:w="0" w:type="dxa"/>
-          </w:tblCellMar>
-        </w:tblPrEx>
         <w:tc>
           <w:tcPr>
             <w:tcW w:w="2120" w:type="dxa"/>
@@ -3690,12 +3508,6 @@
         </w:tc>
       </w:tr>
       <w:tr>
-        <w:tblPrEx>
-          <w:tblCellMar>
-            <w:top w:w="0" w:type="dxa"/>
-            <w:bottom w:w="0" w:type="dxa"/>
-          </w:tblCellMar>
-        </w:tblPrEx>
         <w:tc>
           <w:tcPr>
             <w:tcW w:w="2120" w:type="dxa"/>
@@ -3794,7 +3606,7 @@
     </w:p>
     <w:p>
       <w:pPr>
-        <w:pStyle w:val="1"/>
+        <w:pStyle w:val="Heading1"/>
         <w:rPr>
           <w:color w:val="000000" w:themeColor="text1"/>
         </w:rPr>
@@ -3829,12 +3641,6 @@
         <w:gridCol w:w="7518"/>
       </w:tblGrid>
       <w:tr>
-        <w:tblPrEx>
-          <w:tblCellMar>
-            <w:top w:w="0" w:type="dxa"/>
-            <w:bottom w:w="0" w:type="dxa"/>
-          </w:tblCellMar>
-        </w:tblPrEx>
         <w:trPr>
           <w:tblHeader/>
         </w:trPr>
@@ -3912,12 +3718,6 @@
         </w:tc>
       </w:tr>
       <w:tr>
-        <w:tblPrEx>
-          <w:tblCellMar>
-            <w:top w:w="0" w:type="dxa"/>
-            <w:bottom w:w="0" w:type="dxa"/>
-          </w:tblCellMar>
-        </w:tblPrEx>
         <w:tc>
           <w:tcPr>
             <w:tcW w:w="2120" w:type="dxa"/>
@@ -3986,12 +3786,6 @@
         </w:tc>
       </w:tr>
       <w:tr>
-        <w:tblPrEx>
-          <w:tblCellMar>
-            <w:top w:w="0" w:type="dxa"/>
-            <w:bottom w:w="0" w:type="dxa"/>
-          </w:tblCellMar>
-        </w:tblPrEx>
         <w:tc>
           <w:tcPr>
             <w:tcW w:w="2120" w:type="dxa"/>
@@ -4176,12 +3970,6 @@
         </w:tc>
       </w:tr>
       <w:tr>
-        <w:tblPrEx>
-          <w:tblCellMar>
-            <w:top w:w="0" w:type="dxa"/>
-            <w:bottom w:w="0" w:type="dxa"/>
-          </w:tblCellMar>
-        </w:tblPrEx>
         <w:tc>
           <w:tcPr>
             <w:tcW w:w="2120" w:type="dxa"/>
@@ -4269,12 +4057,6 @@
         </w:tc>
       </w:tr>
       <w:tr>
-        <w:tblPrEx>
-          <w:tblCellMar>
-            <w:top w:w="0" w:type="dxa"/>
-            <w:bottom w:w="0" w:type="dxa"/>
-          </w:tblCellMar>
-        </w:tblPrEx>
         <w:tc>
           <w:tcPr>
             <w:tcW w:w="2120" w:type="dxa"/>
@@ -4395,12 +4177,6 @@
         </w:tc>
       </w:tr>
       <w:tr>
-        <w:tblPrEx>
-          <w:tblCellMar>
-            <w:top w:w="0" w:type="dxa"/>
-            <w:bottom w:w="0" w:type="dxa"/>
-          </w:tblCellMar>
-        </w:tblPrEx>
         <w:tc>
           <w:tcPr>
             <w:tcW w:w="2120" w:type="dxa"/>
@@ -4485,12 +4261,6 @@
         </w:tc>
       </w:tr>
       <w:tr>
-        <w:tblPrEx>
-          <w:tblCellMar>
-            <w:top w:w="0" w:type="dxa"/>
-            <w:bottom w:w="0" w:type="dxa"/>
-          </w:tblCellMar>
-        </w:tblPrEx>
         <w:tc>
           <w:tcPr>
             <w:tcW w:w="2120" w:type="dxa"/>
@@ -4589,7 +4359,7 @@
     </w:p>
     <w:p>
       <w:pPr>
-        <w:pStyle w:val="1"/>
+        <w:pStyle w:val="Heading1"/>
         <w:rPr>
           <w:color w:val="000000" w:themeColor="text1"/>
         </w:rPr>
@@ -4624,12 +4394,6 @@
         <w:gridCol w:w="7518"/>
       </w:tblGrid>
       <w:tr>
-        <w:tblPrEx>
-          <w:tblCellMar>
-            <w:top w:w="0" w:type="dxa"/>
-            <w:bottom w:w="0" w:type="dxa"/>
-          </w:tblCellMar>
-        </w:tblPrEx>
         <w:trPr>
           <w:tblHeader/>
         </w:trPr>
@@ -4707,12 +4471,6 @@
         </w:tc>
       </w:tr>
       <w:tr>
-        <w:tblPrEx>
-          <w:tblCellMar>
-            <w:top w:w="0" w:type="dxa"/>
-            <w:bottom w:w="0" w:type="dxa"/>
-          </w:tblCellMar>
-        </w:tblPrEx>
         <w:tc>
           <w:tcPr>
             <w:tcW w:w="2120" w:type="dxa"/>
@@ -4781,12 +4539,6 @@
         </w:tc>
       </w:tr>
       <w:tr>
-        <w:tblPrEx>
-          <w:tblCellMar>
-            <w:top w:w="0" w:type="dxa"/>
-            <w:bottom w:w="0" w:type="dxa"/>
-          </w:tblCellMar>
-        </w:tblPrEx>
         <w:tc>
           <w:tcPr>
             <w:tcW w:w="2120" w:type="dxa"/>
@@ -4910,12 +4662,6 @@
         </w:tc>
       </w:tr>
       <w:tr>
-        <w:tblPrEx>
-          <w:tblCellMar>
-            <w:top w:w="0" w:type="dxa"/>
-            <w:bottom w:w="0" w:type="dxa"/>
-          </w:tblCellMar>
-        </w:tblPrEx>
         <w:tc>
           <w:tcPr>
             <w:tcW w:w="2120" w:type="dxa"/>
@@ -4984,12 +4730,6 @@
         </w:tc>
       </w:tr>
       <w:tr>
-        <w:tblPrEx>
-          <w:tblCellMar>
-            <w:top w:w="0" w:type="dxa"/>
-            <w:bottom w:w="0" w:type="dxa"/>
-          </w:tblCellMar>
-        </w:tblPrEx>
         <w:tc>
           <w:tcPr>
             <w:tcW w:w="2120" w:type="dxa"/>
@@ -5074,12 +4814,6 @@
         </w:tc>
       </w:tr>
       <w:tr>
-        <w:tblPrEx>
-          <w:tblCellMar>
-            <w:top w:w="0" w:type="dxa"/>
-            <w:bottom w:w="0" w:type="dxa"/>
-          </w:tblCellMar>
-        </w:tblPrEx>
         <w:tc>
           <w:tcPr>
             <w:tcW w:w="2120" w:type="dxa"/>
@@ -5166,12 +4900,6 @@
         </w:tc>
       </w:tr>
       <w:tr>
-        <w:tblPrEx>
-          <w:tblCellMar>
-            <w:top w:w="0" w:type="dxa"/>
-            <w:bottom w:w="0" w:type="dxa"/>
-          </w:tblCellMar>
-        </w:tblPrEx>
         <w:tc>
           <w:tcPr>
             <w:tcW w:w="2120" w:type="dxa"/>
@@ -5270,7 +4998,7 @@
     </w:p>
     <w:p>
       <w:pPr>
-        <w:pStyle w:val="1"/>
+        <w:pStyle w:val="Heading1"/>
         <w:rPr>
           <w:color w:val="000000" w:themeColor="text1"/>
         </w:rPr>
@@ -5298,7 +5026,7 @@
     </w:p>
     <w:tbl>
       <w:tblPr>
-        <w:tblW w:w="9638" w:type="dxa"/>
+        <w:tblW w:w="9678" w:type="dxa"/>
         <w:tblBorders>
           <w:top w:val="single" w:sz="4" w:space="0" w:color="auto"/>
           <w:left w:val="single" w:sz="4" w:space="0" w:color="auto"/>
@@ -5316,17 +5044,11 @@
       </w:tblPr>
       <w:tblGrid>
         <w:gridCol w:w="2120"/>
-        <w:gridCol w:w="3855"/>
-        <w:gridCol w:w="2506"/>
-        <w:gridCol w:w="1157"/>
+        <w:gridCol w:w="2695"/>
+        <w:gridCol w:w="3402"/>
+        <w:gridCol w:w="1461"/>
       </w:tblGrid>
       <w:tr>
-        <w:tblPrEx>
-          <w:tblCellMar>
-            <w:top w:w="0" w:type="dxa"/>
-            <w:bottom w:w="0" w:type="dxa"/>
-          </w:tblCellMar>
-        </w:tblPrEx>
         <w:trPr>
           <w:tblHeader/>
         </w:trPr>
@@ -5368,7 +5090,7 @@
         </w:tc>
         <w:tc>
           <w:tcPr>
-            <w:tcW w:w="3855" w:type="dxa"/>
+            <w:tcW w:w="2695" w:type="dxa"/>
             <w:tcBorders>
               <w:top w:val="single" w:sz="4" w:space="0" w:color="BFC5CE"/>
               <w:left w:val="single" w:sz="4" w:space="0" w:color="BFC5CE"/>
@@ -5404,7 +5126,7 @@
         </w:tc>
         <w:tc>
           <w:tcPr>
-            <w:tcW w:w="2506" w:type="dxa"/>
+            <w:tcW w:w="3402" w:type="dxa"/>
             <w:tcBorders>
               <w:top w:val="single" w:sz="4" w:space="0" w:color="BFC5CE"/>
               <w:left w:val="single" w:sz="4" w:space="0" w:color="BFC5CE"/>
@@ -5440,7 +5162,7 @@
         </w:tc>
         <w:tc>
           <w:tcPr>
-            <w:tcW w:w="1157" w:type="dxa"/>
+            <w:tcW w:w="1461" w:type="dxa"/>
             <w:tcBorders>
               <w:top w:val="single" w:sz="4" w:space="0" w:color="BFC5CE"/>
               <w:left w:val="single" w:sz="4" w:space="0" w:color="BFC5CE"/>
@@ -5476,12 +5198,6 @@
         </w:tc>
       </w:tr>
       <w:tr>
-        <w:tblPrEx>
-          <w:tblCellMar>
-            <w:top w:w="0" w:type="dxa"/>
-            <w:bottom w:w="0" w:type="dxa"/>
-          </w:tblCellMar>
-        </w:tblPrEx>
         <w:tc>
           <w:tcPr>
             <w:tcW w:w="2120" w:type="dxa"/>
@@ -5517,7 +5233,7 @@
         </w:tc>
         <w:tc>
           <w:tcPr>
-            <w:tcW w:w="3855" w:type="dxa"/>
+            <w:tcW w:w="2695" w:type="dxa"/>
             <w:tcBorders>
               <w:top w:val="single" w:sz="4" w:space="0" w:color="BFC5CE"/>
               <w:left w:val="single" w:sz="4" w:space="0" w:color="BFC5CE"/>
@@ -5550,32 +5266,32 @@
         </w:tc>
         <w:tc>
           <w:tcPr>
-            <w:tcW w:w="2506" w:type="dxa"/>
-            <w:tcBorders>
-              <w:top w:val="single" w:sz="4" w:space="0" w:color="BFC5CE"/>
-              <w:left w:val="single" w:sz="4" w:space="0" w:color="BFC5CE"/>
-              <w:bottom w:val="single" w:sz="4" w:space="0" w:color="BFC5CE"/>
-              <w:right w:val="single" w:sz="4" w:space="0" w:color="BFC5CE"/>
-            </w:tcBorders>
-            <w:tcMar>
-              <w:top w:w="50" w:type="dxa"/>
-              <w:left w:w="80" w:type="dxa"/>
-              <w:bottom w:w="50" w:type="dxa"/>
-              <w:right w:w="80" w:type="dxa"/>
-            </w:tcMar>
-          </w:tcPr>
-          <w:p>
-            <w:pPr>
-              <w:spacing w:after="20"/>
-              <w:rPr>
-                <w:color w:val="000000" w:themeColor="text1"/>
-              </w:rPr>
-            </w:pPr>
-          </w:p>
-        </w:tc>
-        <w:tc>
-          <w:tcPr>
-            <w:tcW w:w="1157" w:type="dxa"/>
+            <w:tcW w:w="3402" w:type="dxa"/>
+            <w:tcBorders>
+              <w:top w:val="single" w:sz="4" w:space="0" w:color="BFC5CE"/>
+              <w:left w:val="single" w:sz="4" w:space="0" w:color="BFC5CE"/>
+              <w:bottom w:val="single" w:sz="4" w:space="0" w:color="BFC5CE"/>
+              <w:right w:val="single" w:sz="4" w:space="0" w:color="BFC5CE"/>
+            </w:tcBorders>
+            <w:tcMar>
+              <w:top w:w="50" w:type="dxa"/>
+              <w:left w:w="80" w:type="dxa"/>
+              <w:bottom w:w="50" w:type="dxa"/>
+              <w:right w:w="80" w:type="dxa"/>
+            </w:tcMar>
+          </w:tcPr>
+          <w:p>
+            <w:pPr>
+              <w:spacing w:after="20"/>
+              <w:rPr>
+                <w:color w:val="000000" w:themeColor="text1"/>
+              </w:rPr>
+            </w:pPr>
+          </w:p>
+        </w:tc>
+        <w:tc>
+          <w:tcPr>
+            <w:tcW w:w="1461" w:type="dxa"/>
             <w:tcBorders>
               <w:top w:val="single" w:sz="4" w:space="0" w:color="BFC5CE"/>
               <w:left w:val="single" w:sz="4" w:space="0" w:color="BFC5CE"/>
@@ -5600,12 +5316,6 @@
         </w:tc>
       </w:tr>
       <w:tr>
-        <w:tblPrEx>
-          <w:tblCellMar>
-            <w:top w:w="0" w:type="dxa"/>
-            <w:bottom w:w="0" w:type="dxa"/>
-          </w:tblCellMar>
-        </w:tblPrEx>
         <w:tc>
           <w:tcPr>
             <w:tcW w:w="2120" w:type="dxa"/>
@@ -5641,7 +5351,7 @@
         </w:tc>
         <w:tc>
           <w:tcPr>
-            <w:tcW w:w="3855" w:type="dxa"/>
+            <w:tcW w:w="2695" w:type="dxa"/>
             <w:tcBorders>
               <w:top w:val="single" w:sz="4" w:space="0" w:color="BFC5CE"/>
               <w:left w:val="single" w:sz="4" w:space="0" w:color="BFC5CE"/>
@@ -5674,32 +5384,32 @@
         </w:tc>
         <w:tc>
           <w:tcPr>
-            <w:tcW w:w="2506" w:type="dxa"/>
-            <w:tcBorders>
-              <w:top w:val="single" w:sz="4" w:space="0" w:color="BFC5CE"/>
-              <w:left w:val="single" w:sz="4" w:space="0" w:color="BFC5CE"/>
-              <w:bottom w:val="single" w:sz="4" w:space="0" w:color="BFC5CE"/>
-              <w:right w:val="single" w:sz="4" w:space="0" w:color="BFC5CE"/>
-            </w:tcBorders>
-            <w:tcMar>
-              <w:top w:w="50" w:type="dxa"/>
-              <w:left w:w="80" w:type="dxa"/>
-              <w:bottom w:w="50" w:type="dxa"/>
-              <w:right w:w="80" w:type="dxa"/>
-            </w:tcMar>
-          </w:tcPr>
-          <w:p>
-            <w:pPr>
-              <w:spacing w:after="20"/>
-              <w:rPr>
-                <w:color w:val="000000" w:themeColor="text1"/>
-              </w:rPr>
-            </w:pPr>
-          </w:p>
-        </w:tc>
-        <w:tc>
-          <w:tcPr>
-            <w:tcW w:w="1157" w:type="dxa"/>
+            <w:tcW w:w="3402" w:type="dxa"/>
+            <w:tcBorders>
+              <w:top w:val="single" w:sz="4" w:space="0" w:color="BFC5CE"/>
+              <w:left w:val="single" w:sz="4" w:space="0" w:color="BFC5CE"/>
+              <w:bottom w:val="single" w:sz="4" w:space="0" w:color="BFC5CE"/>
+              <w:right w:val="single" w:sz="4" w:space="0" w:color="BFC5CE"/>
+            </w:tcBorders>
+            <w:tcMar>
+              <w:top w:w="50" w:type="dxa"/>
+              <w:left w:w="80" w:type="dxa"/>
+              <w:bottom w:w="50" w:type="dxa"/>
+              <w:right w:w="80" w:type="dxa"/>
+            </w:tcMar>
+          </w:tcPr>
+          <w:p>
+            <w:pPr>
+              <w:spacing w:after="20"/>
+              <w:rPr>
+                <w:color w:val="000000" w:themeColor="text1"/>
+              </w:rPr>
+            </w:pPr>
+          </w:p>
+        </w:tc>
+        <w:tc>
+          <w:tcPr>
+            <w:tcW w:w="1461" w:type="dxa"/>
             <w:tcBorders>
               <w:top w:val="single" w:sz="4" w:space="0" w:color="BFC5CE"/>
               <w:left w:val="single" w:sz="4" w:space="0" w:color="BFC5CE"/>
@@ -5724,12 +5434,6 @@
         </w:tc>
       </w:tr>
       <w:tr>
-        <w:tblPrEx>
-          <w:tblCellMar>
-            <w:top w:w="0" w:type="dxa"/>
-            <w:bottom w:w="0" w:type="dxa"/>
-          </w:tblCellMar>
-        </w:tblPrEx>
         <w:tc>
           <w:tcPr>
             <w:tcW w:w="2120" w:type="dxa"/>
@@ -5765,7 +5469,7 @@
         </w:tc>
         <w:tc>
           <w:tcPr>
-            <w:tcW w:w="3855" w:type="dxa"/>
+            <w:tcW w:w="2695" w:type="dxa"/>
             <w:tcBorders>
               <w:top w:val="single" w:sz="4" w:space="0" w:color="BFC5CE"/>
               <w:left w:val="single" w:sz="4" w:space="0" w:color="BFC5CE"/>
@@ -5798,52 +5502,380 @@
         </w:tc>
         <w:tc>
           <w:tcPr>
-            <w:tcW w:w="2506" w:type="dxa"/>
-            <w:tcBorders>
-              <w:top w:val="single" w:sz="4" w:space="0" w:color="BFC5CE"/>
-              <w:left w:val="single" w:sz="4" w:space="0" w:color="BFC5CE"/>
-              <w:bottom w:val="single" w:sz="4" w:space="0" w:color="BFC5CE"/>
-              <w:right w:val="single" w:sz="4" w:space="0" w:color="BFC5CE"/>
-            </w:tcBorders>
-            <w:tcMar>
-              <w:top w:w="50" w:type="dxa"/>
-              <w:left w:w="80" w:type="dxa"/>
-              <w:bottom w:w="50" w:type="dxa"/>
-              <w:right w:w="80" w:type="dxa"/>
-            </w:tcMar>
-          </w:tcPr>
-          <w:p>
-            <w:pPr>
-              <w:spacing w:after="20"/>
-              <w:rPr>
-                <w:color w:val="000000" w:themeColor="text1"/>
-              </w:rPr>
-            </w:pPr>
-          </w:p>
-        </w:tc>
-        <w:tc>
-          <w:tcPr>
-            <w:tcW w:w="1157" w:type="dxa"/>
-            <w:tcBorders>
-              <w:top w:val="single" w:sz="4" w:space="0" w:color="BFC5CE"/>
-              <w:left w:val="single" w:sz="4" w:space="0" w:color="BFC5CE"/>
-              <w:bottom w:val="single" w:sz="4" w:space="0" w:color="BFC5CE"/>
-              <w:right w:val="single" w:sz="4" w:space="0" w:color="BFC5CE"/>
-            </w:tcBorders>
-            <w:tcMar>
-              <w:top w:w="50" w:type="dxa"/>
-              <w:left w:w="80" w:type="dxa"/>
-              <w:bottom w:w="50" w:type="dxa"/>
-              <w:right w:w="80" w:type="dxa"/>
-            </w:tcMar>
-          </w:tcPr>
-          <w:p>
-            <w:pPr>
-              <w:spacing w:after="20"/>
-              <w:rPr>
-                <w:color w:val="000000" w:themeColor="text1"/>
-              </w:rPr>
-            </w:pPr>
+            <w:tcW w:w="3402" w:type="dxa"/>
+            <w:tcBorders>
+              <w:top w:val="single" w:sz="4" w:space="0" w:color="BFC5CE"/>
+              <w:left w:val="single" w:sz="4" w:space="0" w:color="BFC5CE"/>
+              <w:bottom w:val="single" w:sz="4" w:space="0" w:color="BFC5CE"/>
+              <w:right w:val="single" w:sz="4" w:space="0" w:color="BFC5CE"/>
+            </w:tcBorders>
+            <w:tcMar>
+              <w:top w:w="50" w:type="dxa"/>
+              <w:left w:w="80" w:type="dxa"/>
+              <w:bottom w:w="50" w:type="dxa"/>
+              <w:right w:w="80" w:type="dxa"/>
+            </w:tcMar>
+          </w:tcPr>
+          <w:p>
+            <w:pPr>
+              <w:pStyle w:val="ListParagraph"/>
+              <w:numPr>
+                <w:ilvl w:val="0"/>
+                <w:numId w:val="2"/>
+              </w:numPr>
+              <w:spacing w:after="20"/>
+              <w:ind w:left="208" w:hanging="208"/>
+              <w:rPr>
+                <w:color w:val="000000" w:themeColor="text1"/>
+                <w:sz w:val="18"/>
+                <w:szCs w:val="18"/>
+              </w:rPr>
+            </w:pPr>
+            <w:r>
+              <w:rPr>
+                <w:color w:val="000000" w:themeColor="text1"/>
+                <w:sz w:val="18"/>
+                <w:szCs w:val="18"/>
+              </w:rPr>
+              <w:t xml:space="preserve">It seems like </w:t>
+            </w:r>
+            <w:r>
+              <w:rPr>
+                <w:color w:val="000000" w:themeColor="text1"/>
+                <w:sz w:val="18"/>
+                <w:szCs w:val="18"/>
+              </w:rPr>
+              <w:t>"target ≤ 53" in section 1 conflicts with UC1 "≥ 53 is high"</w:t>
+            </w:r>
+            <w:r>
+              <w:rPr>
+                <w:color w:val="000000" w:themeColor="text1"/>
+                <w:sz w:val="18"/>
+                <w:szCs w:val="18"/>
+              </w:rPr>
+              <w:t>. I think it’s better to</w:t>
+            </w:r>
+            <w:r>
+              <w:rPr>
+                <w:color w:val="000000" w:themeColor="text1"/>
+                <w:sz w:val="18"/>
+                <w:szCs w:val="18"/>
+              </w:rPr>
+              <w:t xml:space="preserve"> use "53 or more is high" everywhere.</w:t>
+            </w:r>
+          </w:p>
+          <w:p>
+            <w:pPr>
+              <w:pStyle w:val="ListParagraph"/>
+              <w:numPr>
+                <w:ilvl w:val="0"/>
+                <w:numId w:val="2"/>
+              </w:numPr>
+              <w:spacing w:after="20"/>
+              <w:ind w:left="208" w:hanging="208"/>
+              <w:rPr>
+                <w:color w:val="000000" w:themeColor="text1"/>
+                <w:sz w:val="18"/>
+                <w:szCs w:val="18"/>
+              </w:rPr>
+            </w:pPr>
+            <w:r>
+              <w:rPr>
+                <w:color w:val="000000" w:themeColor="text1"/>
+                <w:sz w:val="18"/>
+                <w:szCs w:val="18"/>
+              </w:rPr>
+              <w:t xml:space="preserve">UC4(a) says "no delivery record in </w:t>
+            </w:r>
+            <w:proofErr w:type="spellStart"/>
+            <w:r>
+              <w:rPr>
+                <w:color w:val="000000" w:themeColor="text1"/>
+                <w:sz w:val="18"/>
+                <w:szCs w:val="18"/>
+              </w:rPr>
+              <w:t>src_</w:t>
+            </w:r>
+            <w:proofErr w:type="gramStart"/>
+            <w:r>
+              <w:rPr>
+                <w:color w:val="000000" w:themeColor="text1"/>
+                <w:sz w:val="18"/>
+                <w:szCs w:val="18"/>
+              </w:rPr>
+              <w:t>lab.result</w:t>
+            </w:r>
+            <w:proofErr w:type="gramEnd"/>
+            <w:r>
+              <w:rPr>
+                <w:color w:val="000000" w:themeColor="text1"/>
+                <w:sz w:val="18"/>
+                <w:szCs w:val="18"/>
+              </w:rPr>
+              <w:t>_delivery</w:t>
+            </w:r>
+            <w:proofErr w:type="spellEnd"/>
+            <w:r>
+              <w:rPr>
+                <w:color w:val="000000" w:themeColor="text1"/>
+                <w:sz w:val="18"/>
+                <w:szCs w:val="18"/>
+              </w:rPr>
+              <w:t xml:space="preserve">". </w:t>
+            </w:r>
+            <w:r>
+              <w:rPr>
+                <w:color w:val="000000" w:themeColor="text1"/>
+                <w:sz w:val="18"/>
+                <w:szCs w:val="18"/>
+              </w:rPr>
+              <w:t xml:space="preserve">I think </w:t>
+            </w:r>
+            <w:r>
+              <w:rPr>
+                <w:color w:val="000000" w:themeColor="text1"/>
+                <w:sz w:val="18"/>
+                <w:szCs w:val="18"/>
+              </w:rPr>
+              <w:t xml:space="preserve">Views must read only curated tables, so change it to "no delivery, i.e. </w:t>
+            </w:r>
+            <w:proofErr w:type="spellStart"/>
+            <w:r>
+              <w:rPr>
+                <w:color w:val="000000" w:themeColor="text1"/>
+                <w:sz w:val="18"/>
+                <w:szCs w:val="18"/>
+              </w:rPr>
+              <w:lastRenderedPageBreak/>
+              <w:t>fact_lab_</w:t>
+            </w:r>
+            <w:proofErr w:type="gramStart"/>
+            <w:r>
+              <w:rPr>
+                <w:color w:val="000000" w:themeColor="text1"/>
+                <w:sz w:val="18"/>
+                <w:szCs w:val="18"/>
+              </w:rPr>
+              <w:t>result.result</w:t>
+            </w:r>
+            <w:proofErr w:type="gramEnd"/>
+            <w:r>
+              <w:rPr>
+                <w:color w:val="000000" w:themeColor="text1"/>
+                <w:sz w:val="18"/>
+                <w:szCs w:val="18"/>
+              </w:rPr>
+              <w:t>_returned_flag</w:t>
+            </w:r>
+            <w:proofErr w:type="spellEnd"/>
+            <w:r>
+              <w:rPr>
+                <w:color w:val="000000" w:themeColor="text1"/>
+                <w:sz w:val="18"/>
+                <w:szCs w:val="18"/>
+              </w:rPr>
+              <w:t xml:space="preserve"> = false".</w:t>
+            </w:r>
+          </w:p>
+          <w:p>
+            <w:pPr>
+              <w:pStyle w:val="ListParagraph"/>
+              <w:numPr>
+                <w:ilvl w:val="0"/>
+                <w:numId w:val="2"/>
+              </w:numPr>
+              <w:spacing w:after="20"/>
+              <w:ind w:left="208" w:hanging="208"/>
+              <w:rPr>
+                <w:color w:val="000000" w:themeColor="text1"/>
+              </w:rPr>
+            </w:pPr>
+            <w:r>
+              <w:rPr>
+                <w:color w:val="000000" w:themeColor="text1"/>
+                <w:sz w:val="18"/>
+                <w:szCs w:val="18"/>
+              </w:rPr>
+              <w:t xml:space="preserve">Add one identity row: a golden patient is a row of </w:t>
+            </w:r>
+            <w:proofErr w:type="spellStart"/>
+            <w:proofErr w:type="gramStart"/>
+            <w:r>
+              <w:rPr>
+                <w:color w:val="000000" w:themeColor="text1"/>
+                <w:sz w:val="18"/>
+                <w:szCs w:val="18"/>
+              </w:rPr>
+              <w:t>cleansed.patient</w:t>
+            </w:r>
+            <w:proofErr w:type="gramEnd"/>
+            <w:r>
+              <w:rPr>
+                <w:color w:val="000000" w:themeColor="text1"/>
+                <w:sz w:val="18"/>
+                <w:szCs w:val="18"/>
+              </w:rPr>
+              <w:t>_master</w:t>
+            </w:r>
+            <w:proofErr w:type="spellEnd"/>
+            <w:r>
+              <w:rPr>
+                <w:color w:val="000000" w:themeColor="text1"/>
+                <w:sz w:val="18"/>
+                <w:szCs w:val="18"/>
+              </w:rPr>
+              <w:t xml:space="preserve">, built    only from GP records (18 GP records → 17 masters; GP-0008 and GP-0009 are one person). Every GP record is LINKED to its own master with </w:t>
+            </w:r>
+            <w:proofErr w:type="spellStart"/>
+            <w:r>
+              <w:rPr>
+                <w:color w:val="000000" w:themeColor="text1"/>
+                <w:sz w:val="18"/>
+                <w:szCs w:val="18"/>
+              </w:rPr>
+              <w:t>match_rule</w:t>
+            </w:r>
+            <w:proofErr w:type="spellEnd"/>
+            <w:r>
+              <w:rPr>
+                <w:color w:val="000000" w:themeColor="text1"/>
+                <w:sz w:val="18"/>
+                <w:szCs w:val="18"/>
+              </w:rPr>
+              <w:t xml:space="preserve"> 'GP'. Lab and pharmacy</w:t>
+            </w:r>
+            <w:r>
+              <w:rPr>
+                <w:color w:val="000000" w:themeColor="text1"/>
+                <w:sz w:val="18"/>
+                <w:szCs w:val="18"/>
+              </w:rPr>
+              <w:t xml:space="preserve"> </w:t>
+            </w:r>
+            <w:r>
+              <w:rPr>
+                <w:color w:val="000000" w:themeColor="text1"/>
+                <w:sz w:val="18"/>
+                <w:szCs w:val="18"/>
+              </w:rPr>
+              <w:t>records are linked by R1 (same 10-digit Medicare) or R2 (same dob, family name and first</w:t>
+            </w:r>
+            <w:r>
+              <w:rPr>
+                <w:color w:val="000000" w:themeColor="text1"/>
+                <w:sz w:val="18"/>
+                <w:szCs w:val="18"/>
+              </w:rPr>
+              <w:t xml:space="preserve"> </w:t>
+            </w:r>
+            <w:r>
+              <w:rPr>
+                <w:color w:val="000000" w:themeColor="text1"/>
+                <w:sz w:val="18"/>
+                <w:szCs w:val="18"/>
+              </w:rPr>
+              <w:t xml:space="preserve">letter of given name, Medicare not conflicting); </w:t>
+            </w:r>
+            <w:proofErr w:type="spellStart"/>
+            <w:r>
+              <w:rPr>
+                <w:color w:val="000000" w:themeColor="text1"/>
+                <w:sz w:val="18"/>
+                <w:szCs w:val="18"/>
+              </w:rPr>
+              <w:t>match_rule</w:t>
+            </w:r>
+            <w:proofErr w:type="spellEnd"/>
+            <w:r>
+              <w:rPr>
+                <w:color w:val="000000" w:themeColor="text1"/>
+                <w:sz w:val="18"/>
+                <w:szCs w:val="18"/>
+              </w:rPr>
+              <w:t xml:space="preserve"> is R1 or R2, and NULL for</w:t>
+            </w:r>
+            <w:r>
+              <w:rPr>
+                <w:color w:val="000000" w:themeColor="text1"/>
+                <w:sz w:val="18"/>
+                <w:szCs w:val="18"/>
+              </w:rPr>
+              <w:t xml:space="preserve"> </w:t>
+            </w:r>
+            <w:r>
+              <w:rPr>
+                <w:color w:val="000000" w:themeColor="text1"/>
+                <w:sz w:val="18"/>
+                <w:szCs w:val="18"/>
+              </w:rPr>
+              <w:t>REVIEW and UNMATCHED. A lab or pharmacy record contributes to a use case only when</w:t>
+            </w:r>
+            <w:r>
+              <w:rPr>
+                <w:color w:val="000000" w:themeColor="text1"/>
+                <w:sz w:val="18"/>
+                <w:szCs w:val="18"/>
+              </w:rPr>
+              <w:t xml:space="preserve"> </w:t>
+            </w:r>
+            <w:r>
+              <w:rPr>
+                <w:color w:val="000000" w:themeColor="text1"/>
+                <w:sz w:val="18"/>
+                <w:szCs w:val="18"/>
+              </w:rPr>
+              <w:t xml:space="preserve">LINKED. Note P06 Daniel Nguyen is still a golden patient (NO_TEST_ON_RECORD) even though   PATH0006 is REVIEW – the current wording "golden patients, i.e. source records with </w:t>
+            </w:r>
+            <w:proofErr w:type="spellStart"/>
+            <w:r>
+              <w:rPr>
+                <w:color w:val="000000" w:themeColor="text1"/>
+                <w:sz w:val="18"/>
+                <w:szCs w:val="18"/>
+              </w:rPr>
+              <w:t>match_status</w:t>
+            </w:r>
+            <w:proofErr w:type="spellEnd"/>
+            <w:r>
+              <w:rPr>
+                <w:color w:val="000000" w:themeColor="text1"/>
+                <w:sz w:val="18"/>
+                <w:szCs w:val="18"/>
+              </w:rPr>
+              <w:t xml:space="preserve"> LINKED" reads as if he is dropped.</w:t>
+            </w:r>
+          </w:p>
+        </w:tc>
+        <w:tc>
+          <w:tcPr>
+            <w:tcW w:w="1461" w:type="dxa"/>
+            <w:tcBorders>
+              <w:top w:val="single" w:sz="4" w:space="0" w:color="BFC5CE"/>
+              <w:left w:val="single" w:sz="4" w:space="0" w:color="BFC5CE"/>
+              <w:bottom w:val="single" w:sz="4" w:space="0" w:color="BFC5CE"/>
+              <w:right w:val="single" w:sz="4" w:space="0" w:color="BFC5CE"/>
+            </w:tcBorders>
+            <w:tcMar>
+              <w:top w:w="50" w:type="dxa"/>
+              <w:left w:w="80" w:type="dxa"/>
+              <w:bottom w:w="50" w:type="dxa"/>
+              <w:right w:w="80" w:type="dxa"/>
+            </w:tcMar>
+          </w:tcPr>
+          <w:p>
+            <w:pPr>
+              <w:spacing w:after="20"/>
+              <w:rPr>
+                <w:color w:val="000000" w:themeColor="text1"/>
+              </w:rPr>
+            </w:pPr>
+            <w:r>
+              <w:rPr>
+                <w:color w:val="000000" w:themeColor="text1"/>
+              </w:rPr>
+              <w:lastRenderedPageBreak/>
+              <w:t>07/10/2026</w:t>
+            </w:r>
           </w:p>
         </w:tc>
       </w:tr>
@@ -5852,7 +5884,6 @@
       <w:pPr>
         <w:spacing w:after="100"/>
         <w:rPr>
-          <w:rFonts w:hint="eastAsia"/>
           <w:color w:val="000000" w:themeColor="text1"/>
         </w:rPr>
       </w:pPr>
@@ -5869,7 +5900,7 @@
 </file>
 
 <file path=word/endnotes.xml><?xml version="1.0" encoding="utf-8"?>
-<w:endnotes xmlns:wpc="http://schemas.microsoft.com/office/word/2010/wordprocessingCanvas" xmlns:cx="http://schemas.microsoft.com/office/drawing/2014/chartex" xmlns:cx1="http://schemas.microsoft.com/office/drawing/2015/9/8/chartex" xmlns:cx2="http://schemas.microsoft.com/office/drawing/2015/10/21/chartex" xmlns:cx3="http://schemas.microsoft.com/office/drawing/2016/5/9/chartex" xmlns:cx4="http://schemas.microsoft.com/office/drawing/2016/5/10/chartex" xmlns:cx5="http://schemas.microsoft.com/office/drawing/2016/5/11/chartex" xmlns:cx6="http://schemas.microsoft.com/office/drawing/2016/5/12/chartex" xmlns:cx7="http://schemas.microsoft.com/office/drawing/2016/5/13/chartex" xmlns:cx8="http://schemas.microsoft.com/office/drawing/2016/5/14/chartex" xmlns:mc="http://schemas.openxmlformats.org/markup-compatibility/2006" xmlns:aink="http://schemas.microsoft.com/office/drawing/2016/ink" xmlns:am3d="http://schemas.microsoft.com/office/drawing/2017/model3d" xmlns:o="urn:schemas-microsoft-com:office:office" xmlns:oel="http://schemas.microsoft.com/office/2019/extlst" xmlns:r="http://schemas.openxmlformats.org/officeDocument/2006/relationships" xmlns:m="http://schemas.openxmlformats.org/officeDocument/2006/math" xmlns:v="urn:schemas-microsoft-com:vml" xmlns:wp14="http://schemas.microsoft.com/office/word/2010/wordprocessingDrawing" xmlns:wp="http://schemas.openxmlformats.org/drawingml/2006/wordprocessingDrawing" xmlns:w10="urn:schemas-microsoft-com:office:word" xmlns:w="http://schemas.openxmlformats.org/wordprocessingml/2006/main" xmlns:w14="http://schemas.microsoft.com/office/word/2010/wordml" xmlns:w15="http://schemas.microsoft.com/office/word/2012/wordml" xmlns:w16cex="http://schemas.microsoft.com/office/word/2018/wordml/cex" xmlns:w16cid="http://schemas.microsoft.com/office/word/2016/wordml/cid" xmlns:w16="http://schemas.microsoft.com/office/word/2018/wordml" xmlns:w16du="http://schemas.microsoft.com/office/word/2023/wordml/word16du" xmlns:w16sdtdh="http://schemas.microsoft.com/office/word/2020/wordml/sdtdatahash" xmlns:w16sdtfl="http://schemas.microsoft.com/office/word/2024/wordml/sdtformatlock" xmlns:w16se="http://schemas.microsoft.com/office/word/2015/wordml/symex" xmlns:wpg="http://schemas.microsoft.com/office/word/2010/wordprocessingGroup" xmlns:wpi="http://schemas.microsoft.com/office/word/2010/wordprocessingInk" xmlns:wne="http://schemas.microsoft.com/office/word/2006/wordml" xmlns:wps="http://schemas.microsoft.com/office/word/2010/wordprocessingShape" mc:Ignorable="w14 w15 w16se w16cid w16 w16cex w16sdtdh w16sdtfl w16du wp14">
+<w:endnotes xmlns:wpc="http://schemas.microsoft.com/office/word/2010/wordprocessingCanvas" xmlns:cx="http://schemas.microsoft.com/office/drawing/2014/chartex" xmlns:cx1="http://schemas.microsoft.com/office/drawing/2015/9/8/chartex" xmlns:cx2="http://schemas.microsoft.com/office/drawing/2015/10/21/chartex" xmlns:cx3="http://schemas.microsoft.com/office/drawing/2016/5/9/chartex" xmlns:cx4="http://schemas.microsoft.com/office/drawing/2016/5/10/chartex" xmlns:cx5="http://schemas.microsoft.com/office/drawing/2016/5/11/chartex" xmlns:cx6="http://schemas.microsoft.com/office/drawing/2016/5/12/chartex" xmlns:cx7="http://schemas.microsoft.com/office/drawing/2016/5/13/chartex" xmlns:cx8="http://schemas.microsoft.com/office/drawing/2016/5/14/chartex" xmlns:mc="http://schemas.openxmlformats.org/markup-compatibility/2006" xmlns:m="http://schemas.openxmlformats.org/officeDocument/2006/math" xmlns:aink="http://schemas.microsoft.com/office/drawing/2016/ink" xmlns:am3d="http://schemas.microsoft.com/office/drawing/2017/model3d" xmlns:oel="http://schemas.microsoft.com/office/2019/extlst" xmlns:r="http://schemas.openxmlformats.org/officeDocument/2006/relationships" xmlns:wp14="http://schemas.microsoft.com/office/word/2010/wordprocessingDrawing" xmlns:wp="http://schemas.openxmlformats.org/drawingml/2006/wordprocessingDrawing" xmlns:wpg="http://schemas.microsoft.com/office/word/2010/wordprocessingGroup" xmlns:wpi="http://schemas.microsoft.com/office/word/2010/wordprocessingInk" xmlns:wps="http://schemas.microsoft.com/office/word/2010/wordprocessingShape" xmlns:o="urn:schemas-microsoft-com:office:office" xmlns:v="urn:schemas-microsoft-com:vml" xmlns:w10="urn:schemas-microsoft-com:office:word" xmlns:w="http://schemas.openxmlformats.org/wordprocessingml/2006/main" xmlns:w14="http://schemas.microsoft.com/office/word/2010/wordml" xmlns:w15="http://schemas.microsoft.com/office/word/2012/wordml" xmlns:w16cex="http://schemas.microsoft.com/office/word/2018/wordml/cex" xmlns:w16cid="http://schemas.microsoft.com/office/word/2016/wordml/cid" xmlns:w16="http://schemas.microsoft.com/office/word/2018/wordml" xmlns:w16sdtdh="http://schemas.microsoft.com/office/word/2020/wordml/sdtdatahash" xmlns:w16sdtfl="http://schemas.microsoft.com/office/word/2024/wordml/sdtformatlock" xmlns:w16se="http://schemas.microsoft.com/office/word/2015/wordml/symex" xmlns:w16du="http://schemas.microsoft.com/office/word/2023/wordml/word16du" xmlns:wne="http://schemas.microsoft.com/office/word/2006/wordml" mc:Ignorable="w14 w15 w16se w16cid w16 w16cex w16sdtdh w16sdtfl w16du wp14">
   <w:endnote w:type="separator" w:id="-1">
     <w:p>
       <w:r>
@@ -5888,7 +5919,7 @@
 </file>
 
 <file path=word/footer1.xml><?xml version="1.0" encoding="utf-8"?>
-<w:ftr xmlns:wpc="http://schemas.microsoft.com/office/word/2010/wordprocessingCanvas" xmlns:cx="http://schemas.microsoft.com/office/drawing/2014/chartex" xmlns:cx1="http://schemas.microsoft.com/office/drawing/2015/9/8/chartex" xmlns:cx2="http://schemas.microsoft.com/office/drawing/2015/10/21/chartex" xmlns:cx3="http://schemas.microsoft.com/office/drawing/2016/5/9/chartex" xmlns:cx4="http://schemas.microsoft.com/office/drawing/2016/5/10/chartex" xmlns:cx5="http://schemas.microsoft.com/office/drawing/2016/5/11/chartex" xmlns:cx6="http://schemas.microsoft.com/office/drawing/2016/5/12/chartex" xmlns:cx7="http://schemas.microsoft.com/office/drawing/2016/5/13/chartex" xmlns:cx8="http://schemas.microsoft.com/office/drawing/2016/5/14/chartex" xmlns:mc="http://schemas.openxmlformats.org/markup-compatibility/2006" xmlns:aink="http://schemas.microsoft.com/office/drawing/2016/ink" xmlns:am3d="http://schemas.microsoft.com/office/drawing/2017/model3d" xmlns:o="urn:schemas-microsoft-com:office:office" xmlns:oel="http://schemas.microsoft.com/office/2019/extlst" xmlns:r="http://schemas.openxmlformats.org/officeDocument/2006/relationships" xmlns:m="http://schemas.openxmlformats.org/officeDocument/2006/math" xmlns:v="urn:schemas-microsoft-com:vml" xmlns:wp14="http://schemas.microsoft.com/office/word/2010/wordprocessingDrawing" xmlns:wp="http://schemas.openxmlformats.org/drawingml/2006/wordprocessingDrawing" xmlns:w10="urn:schemas-microsoft-com:office:word" xmlns:w="http://schemas.openxmlformats.org/wordprocessingml/2006/main" xmlns:w14="http://schemas.microsoft.com/office/word/2010/wordml" xmlns:w15="http://schemas.microsoft.com/office/word/2012/wordml" xmlns:w16cex="http://schemas.microsoft.com/office/word/2018/wordml/cex" xmlns:w16cid="http://schemas.microsoft.com/office/word/2016/wordml/cid" xmlns:w16="http://schemas.microsoft.com/office/word/2018/wordml" xmlns:w16du="http://schemas.microsoft.com/office/word/2023/wordml/word16du" xmlns:w16sdtdh="http://schemas.microsoft.com/office/word/2020/wordml/sdtdatahash" xmlns:w16sdtfl="http://schemas.microsoft.com/office/word/2024/wordml/sdtformatlock" xmlns:w16se="http://schemas.microsoft.com/office/word/2015/wordml/symex" xmlns:wpg="http://schemas.microsoft.com/office/word/2010/wordprocessingGroup" xmlns:wpi="http://schemas.microsoft.com/office/word/2010/wordprocessingInk" xmlns:wne="http://schemas.microsoft.com/office/word/2006/wordml" xmlns:wps="http://schemas.microsoft.com/office/word/2010/wordprocessingShape" mc:Ignorable="w14 w15 w16se w16cid w16 w16cex w16sdtdh w16sdtfl w16du wp14">
+<w:ftr xmlns:wpc="http://schemas.microsoft.com/office/word/2010/wordprocessingCanvas" xmlns:cx="http://schemas.microsoft.com/office/drawing/2014/chartex" xmlns:cx1="http://schemas.microsoft.com/office/drawing/2015/9/8/chartex" xmlns:cx2="http://schemas.microsoft.com/office/drawing/2015/10/21/chartex" xmlns:cx3="http://schemas.microsoft.com/office/drawing/2016/5/9/chartex" xmlns:cx4="http://schemas.microsoft.com/office/drawing/2016/5/10/chartex" xmlns:cx5="http://schemas.microsoft.com/office/drawing/2016/5/11/chartex" xmlns:cx6="http://schemas.microsoft.com/office/drawing/2016/5/12/chartex" xmlns:cx7="http://schemas.microsoft.com/office/drawing/2016/5/13/chartex" xmlns:cx8="http://schemas.microsoft.com/office/drawing/2016/5/14/chartex" xmlns:mc="http://schemas.openxmlformats.org/markup-compatibility/2006" xmlns:m="http://schemas.openxmlformats.org/officeDocument/2006/math" xmlns:aink="http://schemas.microsoft.com/office/drawing/2016/ink" xmlns:am3d="http://schemas.microsoft.com/office/drawing/2017/model3d" xmlns:oel="http://schemas.microsoft.com/office/2019/extlst" xmlns:r="http://schemas.openxmlformats.org/officeDocument/2006/relationships" xmlns:wp14="http://schemas.microsoft.com/office/word/2010/wordprocessingDrawing" xmlns:wp="http://schemas.openxmlformats.org/drawingml/2006/wordprocessingDrawing" xmlns:wpg="http://schemas.microsoft.com/office/word/2010/wordprocessingGroup" xmlns:wpi="http://schemas.microsoft.com/office/word/2010/wordprocessingInk" xmlns:wps="http://schemas.microsoft.com/office/word/2010/wordprocessingShape" xmlns:o="urn:schemas-microsoft-com:office:office" xmlns:v="urn:schemas-microsoft-com:vml" xmlns:w10="urn:schemas-microsoft-com:office:word" xmlns:w="http://schemas.openxmlformats.org/wordprocessingml/2006/main" xmlns:w14="http://schemas.microsoft.com/office/word/2010/wordml" xmlns:w15="http://schemas.microsoft.com/office/word/2012/wordml" xmlns:w16cex="http://schemas.microsoft.com/office/word/2018/wordml/cex" xmlns:w16cid="http://schemas.microsoft.com/office/word/2016/wordml/cid" xmlns:w16="http://schemas.microsoft.com/office/word/2018/wordml" xmlns:w16sdtdh="http://schemas.microsoft.com/office/word/2020/wordml/sdtdatahash" xmlns:w16sdtfl="http://schemas.microsoft.com/office/word/2024/wordml/sdtformatlock" xmlns:w16se="http://schemas.microsoft.com/office/word/2015/wordml/symex" xmlns:w16du="http://schemas.microsoft.com/office/word/2023/wordml/word16du" xmlns:wne="http://schemas.microsoft.com/office/word/2006/wordml" mc:Ignorable="w14 w15 w16se w16cid w16 w16cex w16sdtdh w16sdtfl w16du wp14">
   <w:p>
     <w:pPr>
       <w:jc w:val="right"/>
@@ -5983,7 +6014,7 @@
 </file>
 
 <file path=word/footnotes.xml><?xml version="1.0" encoding="utf-8"?>
-<w:footnotes xmlns:wpc="http://schemas.microsoft.com/office/word/2010/wordprocessingCanvas" xmlns:cx="http://schemas.microsoft.com/office/drawing/2014/chartex" xmlns:cx1="http://schemas.microsoft.com/office/drawing/2015/9/8/chartex" xmlns:cx2="http://schemas.microsoft.com/office/drawing/2015/10/21/chartex" xmlns:cx3="http://schemas.microsoft.com/office/drawing/2016/5/9/chartex" xmlns:cx4="http://schemas.microsoft.com/office/drawing/2016/5/10/chartex" xmlns:cx5="http://schemas.microsoft.com/office/drawing/2016/5/11/chartex" xmlns:cx6="http://schemas.microsoft.com/office/drawing/2016/5/12/chartex" xmlns:cx7="http://schemas.microsoft.com/office/drawing/2016/5/13/chartex" xmlns:cx8="http://schemas.microsoft.com/office/drawing/2016/5/14/chartex" xmlns:mc="http://schemas.openxmlformats.org/markup-compatibility/2006" xmlns:aink="http://schemas.microsoft.com/office/drawing/2016/ink" xmlns:am3d="http://schemas.microsoft.com/office/drawing/2017/model3d" xmlns:o="urn:schemas-microsoft-com:office:office" xmlns:oel="http://schemas.microsoft.com/office/2019/extlst" xmlns:r="http://schemas.openxmlformats.org/officeDocument/2006/relationships" xmlns:m="http://schemas.openxmlformats.org/officeDocument/2006/math" xmlns:v="urn:schemas-microsoft-com:vml" xmlns:wp14="http://schemas.microsoft.com/office/word/2010/wordprocessingDrawing" xmlns:wp="http://schemas.openxmlformats.org/drawingml/2006/wordprocessingDrawing" xmlns:w10="urn:schemas-microsoft-com:office:word" xmlns:w="http://schemas.openxmlformats.org/wordprocessingml/2006/main" xmlns:w14="http://schemas.microsoft.com/office/word/2010/wordml" xmlns:w15="http://schemas.microsoft.com/office/word/2012/wordml" xmlns:w16cex="http://schemas.microsoft.com/office/word/2018/wordml/cex" xmlns:w16cid="http://schemas.microsoft.com/office/word/2016/wordml/cid" xmlns:w16="http://schemas.microsoft.com/office/word/2018/wordml" xmlns:w16du="http://schemas.microsoft.com/office/word/2023/wordml/word16du" xmlns:w16sdtdh="http://schemas.microsoft.com/office/word/2020/wordml/sdtdatahash" xmlns:w16sdtfl="http://schemas.microsoft.com/office/word/2024/wordml/sdtformatlock" xmlns:w16se="http://schemas.microsoft.com/office/word/2015/wordml/symex" xmlns:wpg="http://schemas.microsoft.com/office/word/2010/wordprocessingGroup" xmlns:wpi="http://schemas.microsoft.com/office/word/2010/wordprocessingInk" xmlns:wne="http://schemas.microsoft.com/office/word/2006/wordml" xmlns:wps="http://schemas.microsoft.com/office/word/2010/wordprocessingShape" mc:Ignorable="w14 w15 w16se w16cid w16 w16cex w16sdtdh w16sdtfl w16du wp14">
+<w:footnotes xmlns:wpc="http://schemas.microsoft.com/office/word/2010/wordprocessingCanvas" xmlns:cx="http://schemas.microsoft.com/office/drawing/2014/chartex" xmlns:cx1="http://schemas.microsoft.com/office/drawing/2015/9/8/chartex" xmlns:cx2="http://schemas.microsoft.com/office/drawing/2015/10/21/chartex" xmlns:cx3="http://schemas.microsoft.com/office/drawing/2016/5/9/chartex" xmlns:cx4="http://schemas.microsoft.com/office/drawing/2016/5/10/chartex" xmlns:cx5="http://schemas.microsoft.com/office/drawing/2016/5/11/chartex" xmlns:cx6="http://schemas.microsoft.com/office/drawing/2016/5/12/chartex" xmlns:cx7="http://schemas.microsoft.com/office/drawing/2016/5/13/chartex" xmlns:cx8="http://schemas.microsoft.com/office/drawing/2016/5/14/chartex" xmlns:mc="http://schemas.openxmlformats.org/markup-compatibility/2006" xmlns:m="http://schemas.openxmlformats.org/officeDocument/2006/math" xmlns:aink="http://schemas.microsoft.com/office/drawing/2016/ink" xmlns:am3d="http://schemas.microsoft.com/office/drawing/2017/model3d" xmlns:oel="http://schemas.microsoft.com/office/2019/extlst" xmlns:r="http://schemas.openxmlformats.org/officeDocument/2006/relationships" xmlns:wp14="http://schemas.microsoft.com/office/word/2010/wordprocessingDrawing" xmlns:wp="http://schemas.openxmlformats.org/drawingml/2006/wordprocessingDrawing" xmlns:wpg="http://schemas.microsoft.com/office/word/2010/wordprocessingGroup" xmlns:wpi="http://schemas.microsoft.com/office/word/2010/wordprocessingInk" xmlns:wps="http://schemas.microsoft.com/office/word/2010/wordprocessingShape" xmlns:o="urn:schemas-microsoft-com:office:office" xmlns:v="urn:schemas-microsoft-com:vml" xmlns:w10="urn:schemas-microsoft-com:office:word" xmlns:w="http://schemas.openxmlformats.org/wordprocessingml/2006/main" xmlns:w14="http://schemas.microsoft.com/office/word/2010/wordml" xmlns:w15="http://schemas.microsoft.com/office/word/2012/wordml" xmlns:w16cex="http://schemas.microsoft.com/office/word/2018/wordml/cex" xmlns:w16cid="http://schemas.microsoft.com/office/word/2016/wordml/cid" xmlns:w16="http://schemas.microsoft.com/office/word/2018/wordml" xmlns:w16sdtdh="http://schemas.microsoft.com/office/word/2020/wordml/sdtdatahash" xmlns:w16sdtfl="http://schemas.microsoft.com/office/word/2024/wordml/sdtformatlock" xmlns:w16se="http://schemas.microsoft.com/office/word/2015/wordml/symex" xmlns:w16du="http://schemas.microsoft.com/office/word/2023/wordml/word16du" xmlns:wne="http://schemas.microsoft.com/office/word/2006/wordml" mc:Ignorable="w14 w15 w16se w16cid w16 w16cex w16sdtdh w16sdtfl w16du wp14">
   <w:footnote w:type="separator" w:id="-1">
     <w:p>
       <w:r>
@@ -6002,8 +6033,97 @@
 </file>
 
 <file path=word/numbering.xml><?xml version="1.0" encoding="utf-8"?>
-<w:numbering xmlns:wpc="http://schemas.microsoft.com/office/word/2010/wordprocessingCanvas" xmlns:cx="http://schemas.microsoft.com/office/drawing/2014/chartex" xmlns:cx1="http://schemas.microsoft.com/office/drawing/2015/9/8/chartex" xmlns:cx2="http://schemas.microsoft.com/office/drawing/2015/10/21/chartex" xmlns:cx3="http://schemas.microsoft.com/office/drawing/2016/5/9/chartex" xmlns:cx4="http://schemas.microsoft.com/office/drawing/2016/5/10/chartex" xmlns:cx5="http://schemas.microsoft.com/office/drawing/2016/5/11/chartex" xmlns:cx6="http://schemas.microsoft.com/office/drawing/2016/5/12/chartex" xmlns:cx7="http://schemas.microsoft.com/office/drawing/2016/5/13/chartex" xmlns:cx8="http://schemas.microsoft.com/office/drawing/2016/5/14/chartex" xmlns:mc="http://schemas.openxmlformats.org/markup-compatibility/2006" xmlns:aink="http://schemas.microsoft.com/office/drawing/2016/ink" xmlns:am3d="http://schemas.microsoft.com/office/drawing/2017/model3d" xmlns:o="urn:schemas-microsoft-com:office:office" xmlns:oel="http://schemas.microsoft.com/office/2019/extlst" xmlns:r="http://schemas.openxmlformats.org/officeDocument/2006/relationships" xmlns:m="http://schemas.openxmlformats.org/officeDocument/2006/math" xmlns:v="urn:schemas-microsoft-com:vml" xmlns:wp14="http://schemas.microsoft.com/office/word/2010/wordprocessingDrawing" xmlns:wp="http://schemas.openxmlformats.org/drawingml/2006/wordprocessingDrawing" xmlns:w10="urn:schemas-microsoft-com:office:word" xmlns:w="http://schemas.openxmlformats.org/wordprocessingml/2006/main" xmlns:w14="http://schemas.microsoft.com/office/word/2010/wordml" xmlns:w15="http://schemas.microsoft.com/office/word/2012/wordml" xmlns:w16cex="http://schemas.microsoft.com/office/word/2018/wordml/cex" xmlns:w16cid="http://schemas.microsoft.com/office/word/2016/wordml/cid" xmlns:w16="http://schemas.microsoft.com/office/word/2018/wordml" xmlns:w16du="http://schemas.microsoft.com/office/word/2023/wordml/word16du" xmlns:w16sdtdh="http://schemas.microsoft.com/office/word/2020/wordml/sdtdatahash" xmlns:w16sdtfl="http://schemas.microsoft.com/office/word/2024/wordml/sdtformatlock" xmlns:w16se="http://schemas.microsoft.com/office/word/2015/wordml/symex" xmlns:wpg="http://schemas.microsoft.com/office/word/2010/wordprocessingGroup" xmlns:wpi="http://schemas.microsoft.com/office/word/2010/wordprocessingInk" xmlns:wne="http://schemas.microsoft.com/office/word/2006/wordml" xmlns:wps="http://schemas.microsoft.com/office/word/2010/wordprocessingShape" mc:Ignorable="w14 w15 w16se w16cid w16 w16cex w16sdtdh w16sdtfl w16du wp14">
+<w:numbering xmlns:wpc="http://schemas.microsoft.com/office/word/2010/wordprocessingCanvas" xmlns:cx="http://schemas.microsoft.com/office/drawing/2014/chartex" xmlns:cx1="http://schemas.microsoft.com/office/drawing/2015/9/8/chartex" xmlns:cx2="http://schemas.microsoft.com/office/drawing/2015/10/21/chartex" xmlns:cx3="http://schemas.microsoft.com/office/drawing/2016/5/9/chartex" xmlns:cx4="http://schemas.microsoft.com/office/drawing/2016/5/10/chartex" xmlns:cx5="http://schemas.microsoft.com/office/drawing/2016/5/11/chartex" xmlns:cx6="http://schemas.microsoft.com/office/drawing/2016/5/12/chartex" xmlns:cx7="http://schemas.microsoft.com/office/drawing/2016/5/13/chartex" xmlns:cx8="http://schemas.microsoft.com/office/drawing/2016/5/14/chartex" xmlns:mc="http://schemas.openxmlformats.org/markup-compatibility/2006" xmlns:m="http://schemas.openxmlformats.org/officeDocument/2006/math" xmlns:aink="http://schemas.microsoft.com/office/drawing/2016/ink" xmlns:am3d="http://schemas.microsoft.com/office/drawing/2017/model3d" xmlns:oel="http://schemas.microsoft.com/office/2019/extlst" xmlns:r="http://schemas.openxmlformats.org/officeDocument/2006/relationships" xmlns:wp14="http://schemas.microsoft.com/office/word/2010/wordprocessingDrawing" xmlns:wp="http://schemas.openxmlformats.org/drawingml/2006/wordprocessingDrawing" xmlns:wpg="http://schemas.microsoft.com/office/word/2010/wordprocessingGroup" xmlns:wpi="http://schemas.microsoft.com/office/word/2010/wordprocessingInk" xmlns:wps="http://schemas.microsoft.com/office/word/2010/wordprocessingShape" xmlns:o="urn:schemas-microsoft-com:office:office" xmlns:v="urn:schemas-microsoft-com:vml" xmlns:w10="urn:schemas-microsoft-com:office:word" xmlns:w="http://schemas.openxmlformats.org/wordprocessingml/2006/main" xmlns:w14="http://schemas.microsoft.com/office/word/2010/wordml" xmlns:w15="http://schemas.microsoft.com/office/word/2012/wordml" xmlns:w16cex="http://schemas.microsoft.com/office/word/2018/wordml/cex" xmlns:w16cid="http://schemas.microsoft.com/office/word/2016/wordml/cid" xmlns:w16="http://schemas.microsoft.com/office/word/2018/wordml" xmlns:w16sdtdh="http://schemas.microsoft.com/office/word/2020/wordml/sdtdatahash" xmlns:w16sdtfl="http://schemas.microsoft.com/office/word/2024/wordml/sdtformatlock" xmlns:w16se="http://schemas.microsoft.com/office/word/2015/wordml/symex" xmlns:w16du="http://schemas.microsoft.com/office/word/2023/wordml/word16du" xmlns:wne="http://schemas.microsoft.com/office/word/2006/wordml" mc:Ignorable="w14 w15 w16se w16cid w16 w16cex w16sdtdh w16sdtfl w16du wp14">
   <w:abstractNum w:abstractNumId="0" w15:restartNumberingAfterBreak="0">
+    <w:nsid w:val="260A082B"/>
+    <w:multiLevelType w:val="hybridMultilevel"/>
+    <w:tmpl w:val="DF66D018"/>
+    <w:lvl w:ilvl="0" w:tplc="0809000F">
+      <w:start w:val="1"/>
+      <w:numFmt w:val="decimal"/>
+      <w:lvlText w:val="%1."/>
+      <w:lvlJc w:val="left"/>
+      <w:pPr>
+        <w:ind w:left="720" w:hanging="360"/>
+      </w:pPr>
+      <w:rPr>
+        <w:rFonts w:hint="default"/>
+      </w:rPr>
+    </w:lvl>
+    <w:lvl w:ilvl="1" w:tplc="08090019" w:tentative="1">
+      <w:start w:val="1"/>
+      <w:numFmt w:val="lowerLetter"/>
+      <w:lvlText w:val="%2."/>
+      <w:lvlJc w:val="left"/>
+      <w:pPr>
+        <w:ind w:left="1440" w:hanging="360"/>
+      </w:pPr>
+    </w:lvl>
+    <w:lvl w:ilvl="2" w:tplc="0809001B" w:tentative="1">
+      <w:start w:val="1"/>
+      <w:numFmt w:val="lowerRoman"/>
+      <w:lvlText w:val="%3."/>
+      <w:lvlJc w:val="right"/>
+      <w:pPr>
+        <w:ind w:left="2160" w:hanging="180"/>
+      </w:pPr>
+    </w:lvl>
+    <w:lvl w:ilvl="3" w:tplc="0809000F" w:tentative="1">
+      <w:start w:val="1"/>
+      <w:numFmt w:val="decimal"/>
+      <w:lvlText w:val="%4."/>
+      <w:lvlJc w:val="left"/>
+      <w:pPr>
+        <w:ind w:left="2880" w:hanging="360"/>
+      </w:pPr>
+    </w:lvl>
+    <w:lvl w:ilvl="4" w:tplc="08090019" w:tentative="1">
+      <w:start w:val="1"/>
+      <w:numFmt w:val="lowerLetter"/>
+      <w:lvlText w:val="%5."/>
+      <w:lvlJc w:val="left"/>
+      <w:pPr>
+        <w:ind w:left="3600" w:hanging="360"/>
+      </w:pPr>
+    </w:lvl>
+    <w:lvl w:ilvl="5" w:tplc="0809001B" w:tentative="1">
+      <w:start w:val="1"/>
+      <w:numFmt w:val="lowerRoman"/>
+      <w:lvlText w:val="%6."/>
+      <w:lvlJc w:val="right"/>
+      <w:pPr>
+        <w:ind w:left="4320" w:hanging="180"/>
+      </w:pPr>
+    </w:lvl>
+    <w:lvl w:ilvl="6" w:tplc="0809000F" w:tentative="1">
+      <w:start w:val="1"/>
+      <w:numFmt w:val="decimal"/>
+      <w:lvlText w:val="%7."/>
+      <w:lvlJc w:val="left"/>
+      <w:pPr>
+        <w:ind w:left="5040" w:hanging="360"/>
+      </w:pPr>
+    </w:lvl>
+    <w:lvl w:ilvl="7" w:tplc="08090019" w:tentative="1">
+      <w:start w:val="1"/>
+      <w:numFmt w:val="lowerLetter"/>
+      <w:lvlText w:val="%8."/>
+      <w:lvlJc w:val="left"/>
+      <w:pPr>
+        <w:ind w:left="5760" w:hanging="360"/>
+      </w:pPr>
+    </w:lvl>
+    <w:lvl w:ilvl="8" w:tplc="0809001B" w:tentative="1">
+      <w:start w:val="1"/>
+      <w:numFmt w:val="lowerRoman"/>
+      <w:lvlText w:val="%9."/>
+      <w:lvlJc w:val="right"/>
+      <w:pPr>
+        <w:ind w:left="6480" w:hanging="180"/>
+      </w:pPr>
+    </w:lvl>
+  </w:abstractNum>
+  <w:abstractNum w:abstractNumId="1" w15:restartNumberingAfterBreak="0">
     <w:nsid w:val="32232E53"/>
     <w:multiLevelType w:val="hybridMultilevel"/>
     <w:tmpl w:val="A18AD98E"/>
@@ -6057,7 +6177,7 @@
       <w:lvlJc w:val="left"/>
     </w:lvl>
   </w:abstractNum>
-  <w:abstractNum w:abstractNumId="1" w15:restartNumberingAfterBreak="0">
+  <w:abstractNum w:abstractNumId="2" w15:restartNumberingAfterBreak="0">
     <w:nsid w:val="390E7BDE"/>
     <w:multiLevelType w:val="hybridMultilevel"/>
     <w:tmpl w:val="89120742"/>
@@ -6111,7 +6231,7 @@
       <w:lvlJc w:val="left"/>
     </w:lvl>
   </w:abstractNum>
-  <w:abstractNum w:abstractNumId="2" w15:restartNumberingAfterBreak="0">
+  <w:abstractNum w:abstractNumId="3" w15:restartNumberingAfterBreak="0">
     <w:nsid w:val="3C136AD1"/>
     <w:multiLevelType w:val="hybridMultilevel"/>
     <w:tmpl w:val="561841A6"/>
@@ -6165,7 +6285,7 @@
       <w:lvlJc w:val="left"/>
     </w:lvl>
   </w:abstractNum>
-  <w:abstractNum w:abstractNumId="3" w15:restartNumberingAfterBreak="0">
+  <w:abstractNum w:abstractNumId="4" w15:restartNumberingAfterBreak="0">
     <w:nsid w:val="4D7D0219"/>
     <w:multiLevelType w:val="hybridMultilevel"/>
     <w:tmpl w:val="56C67584"/>
@@ -6219,7 +6339,7 @@
       <w:lvlJc w:val="left"/>
     </w:lvl>
   </w:abstractNum>
-  <w:abstractNum w:abstractNumId="4" w15:restartNumberingAfterBreak="0">
+  <w:abstractNum w:abstractNumId="5" w15:restartNumberingAfterBreak="0">
     <w:nsid w:val="5BF45D62"/>
     <w:multiLevelType w:val="hybridMultilevel"/>
     <w:tmpl w:val="84620FC2"/>
@@ -6277,7 +6397,7 @@
       <w:lvlJc w:val="left"/>
     </w:lvl>
   </w:abstractNum>
-  <w:abstractNum w:abstractNumId="5" w15:restartNumberingAfterBreak="0">
+  <w:abstractNum w:abstractNumId="6" w15:restartNumberingAfterBreak="0">
     <w:nsid w:val="6478163F"/>
     <w:multiLevelType w:val="hybridMultilevel"/>
     <w:tmpl w:val="595EBD3C"/>
@@ -6331,7 +6451,7 @@
       <w:lvlJc w:val="left"/>
     </w:lvl>
   </w:abstractNum>
-  <w:abstractNum w:abstractNumId="6" w15:restartNumberingAfterBreak="0">
+  <w:abstractNum w:abstractNumId="7" w15:restartNumberingAfterBreak="0">
     <w:nsid w:val="6B25353E"/>
     <w:multiLevelType w:val="hybridMultilevel"/>
     <w:tmpl w:val="D286DBF2"/>
@@ -6417,7 +6537,7 @@
       </w:pPr>
     </w:lvl>
   </w:abstractNum>
-  <w:abstractNum w:abstractNumId="7" w15:restartNumberingAfterBreak="0">
+  <w:abstractNum w:abstractNumId="8" w15:restartNumberingAfterBreak="0">
     <w:nsid w:val="771B1F7B"/>
     <w:multiLevelType w:val="hybridMultilevel"/>
     <w:tmpl w:val="B30A3670"/>
@@ -6472,16 +6592,19 @@
     </w:lvl>
   </w:abstractNum>
   <w:num w:numId="1" w16cid:durableId="1915315829">
-    <w:abstractNumId w:val="6"/>
+    <w:abstractNumId w:val="7"/>
     <w:lvlOverride w:ilvl="0">
       <w:startOverride w:val="1"/>
     </w:lvlOverride>
+  </w:num>
+  <w:num w:numId="2" w16cid:durableId="1911695768">
+    <w:abstractNumId w:val="0"/>
   </w:num>
 </w:numbering>
 </file>
 
 <file path=word/styles.xml><?xml version="1.0" encoding="utf-8"?>
-<w:styles xmlns:mc="http://schemas.openxmlformats.org/markup-compatibility/2006" xmlns:r="http://schemas.openxmlformats.org/officeDocument/2006/relationships" xmlns:w="http://schemas.openxmlformats.org/wordprocessingml/2006/main" xmlns:w14="http://schemas.microsoft.com/office/word/2010/wordml" xmlns:w15="http://schemas.microsoft.com/office/word/2012/wordml" xmlns:w16cex="http://schemas.microsoft.com/office/word/2018/wordml/cex" xmlns:w16cid="http://schemas.microsoft.com/office/word/2016/wordml/cid" xmlns:w16="http://schemas.microsoft.com/office/word/2018/wordml" xmlns:w16du="http://schemas.microsoft.com/office/word/2023/wordml/word16du" xmlns:w16sdtdh="http://schemas.microsoft.com/office/word/2020/wordml/sdtdatahash" xmlns:w16sdtfl="http://schemas.microsoft.com/office/word/2024/wordml/sdtformatlock" xmlns:w16se="http://schemas.microsoft.com/office/word/2015/wordml/symex" mc:Ignorable="w14 w15 w16se w16cid w16 w16cex w16sdtdh w16sdtfl w16du">
+<w:styles xmlns:mc="http://schemas.openxmlformats.org/markup-compatibility/2006" xmlns:r="http://schemas.openxmlformats.org/officeDocument/2006/relationships" xmlns:w="http://schemas.openxmlformats.org/wordprocessingml/2006/main" xmlns:w14="http://schemas.microsoft.com/office/word/2010/wordml" xmlns:w15="http://schemas.microsoft.com/office/word/2012/wordml" xmlns:w16cex="http://schemas.microsoft.com/office/word/2018/wordml/cex" xmlns:w16cid="http://schemas.microsoft.com/office/word/2016/wordml/cid" xmlns:w16="http://schemas.microsoft.com/office/word/2018/wordml" xmlns:w16sdtdh="http://schemas.microsoft.com/office/word/2020/wordml/sdtdatahash" xmlns:w16sdtfl="http://schemas.microsoft.com/office/word/2024/wordml/sdtformatlock" xmlns:w16se="http://schemas.microsoft.com/office/word/2015/wordml/symex" xmlns:w16du="http://schemas.microsoft.com/office/word/2023/wordml/word16du" mc:Ignorable="w14 w15 w16se w16cid w16 w16cex w16sdtdh w16sdtfl w16du">
   <w:docDefaults>
     <w:rPrDefault>
       <w:rPr>
@@ -6871,14 +6994,14 @@
     <w:lsdException w:name="Unresolved Mention" w:semiHidden="1" w:unhideWhenUsed="1"/>
     <w:lsdException w:name="Smart Link" w:semiHidden="1" w:unhideWhenUsed="1"/>
   </w:latentStyles>
-  <w:style w:type="paragraph" w:default="1" w:styleId="a">
+  <w:style w:type="paragraph" w:default="1" w:styleId="Normal">
     <w:name w:val="Normal"/>
     <w:qFormat/>
   </w:style>
-  <w:style w:type="paragraph" w:styleId="1">
+  <w:style w:type="paragraph" w:styleId="Heading1">
     <w:name w:val="heading 1"/>
-    <w:basedOn w:val="a"/>
-    <w:next w:val="a"/>
+    <w:basedOn w:val="Normal"/>
+    <w:next w:val="Normal"/>
     <w:uiPriority w:val="9"/>
     <w:qFormat/>
     <w:pPr>
@@ -6894,10 +7017,10 @@
       <w:szCs w:val="30"/>
     </w:rPr>
   </w:style>
-  <w:style w:type="paragraph" w:styleId="2">
+  <w:style w:type="paragraph" w:styleId="Heading2">
     <w:name w:val="heading 2"/>
-    <w:basedOn w:val="a"/>
-    <w:next w:val="a"/>
+    <w:basedOn w:val="Normal"/>
+    <w:next w:val="Normal"/>
     <w:uiPriority w:val="9"/>
     <w:semiHidden/>
     <w:unhideWhenUsed/>
@@ -6915,10 +7038,10 @@
       <w:szCs w:val="25"/>
     </w:rPr>
   </w:style>
-  <w:style w:type="paragraph" w:styleId="3">
+  <w:style w:type="paragraph" w:styleId="Heading3">
     <w:name w:val="heading 3"/>
-    <w:basedOn w:val="a"/>
-    <w:next w:val="a"/>
+    <w:basedOn w:val="Normal"/>
+    <w:next w:val="Normal"/>
     <w:uiPriority w:val="9"/>
     <w:semiHidden/>
     <w:unhideWhenUsed/>
@@ -6936,10 +7059,10 @@
       <w:szCs w:val="22"/>
     </w:rPr>
   </w:style>
-  <w:style w:type="paragraph" w:styleId="4">
+  <w:style w:type="paragraph" w:styleId="Heading4">
     <w:name w:val="heading 4"/>
-    <w:basedOn w:val="a"/>
-    <w:next w:val="a"/>
+    <w:basedOn w:val="Normal"/>
+    <w:next w:val="Normal"/>
     <w:uiPriority w:val="9"/>
     <w:semiHidden/>
     <w:unhideWhenUsed/>
@@ -6953,10 +7076,10 @@
       <w:color w:val="2E74B5"/>
     </w:rPr>
   </w:style>
-  <w:style w:type="paragraph" w:styleId="5">
+  <w:style w:type="paragraph" w:styleId="Heading5">
     <w:name w:val="heading 5"/>
-    <w:basedOn w:val="a"/>
-    <w:next w:val="a"/>
+    <w:basedOn w:val="Normal"/>
+    <w:next w:val="Normal"/>
     <w:uiPriority w:val="9"/>
     <w:semiHidden/>
     <w:unhideWhenUsed/>
@@ -6968,10 +7091,10 @@
       <w:color w:val="2E74B5"/>
     </w:rPr>
   </w:style>
-  <w:style w:type="paragraph" w:styleId="6">
+  <w:style w:type="paragraph" w:styleId="Heading6">
     <w:name w:val="heading 6"/>
-    <w:basedOn w:val="a"/>
-    <w:next w:val="a"/>
+    <w:basedOn w:val="Normal"/>
+    <w:next w:val="Normal"/>
     <w:uiPriority w:val="9"/>
     <w:semiHidden/>
     <w:unhideWhenUsed/>
@@ -6983,13 +7106,13 @@
       <w:color w:val="1F4D78"/>
     </w:rPr>
   </w:style>
-  <w:style w:type="character" w:default="1" w:styleId="a0">
+  <w:style w:type="character" w:default="1" w:styleId="DefaultParagraphFont">
     <w:name w:val="Default Paragraph Font"/>
     <w:uiPriority w:val="1"/>
     <w:semiHidden/>
     <w:unhideWhenUsed/>
   </w:style>
-  <w:style w:type="table" w:default="1" w:styleId="a1">
+  <w:style w:type="table" w:default="1" w:styleId="TableNormal">
     <w:name w:val="Normal Table"/>
     <w:uiPriority w:val="99"/>
     <w:semiHidden/>
@@ -7004,16 +7127,16 @@
       </w:tblCellMar>
     </w:tblPr>
   </w:style>
-  <w:style w:type="numbering" w:default="1" w:styleId="a2">
+  <w:style w:type="numbering" w:default="1" w:styleId="NoList">
     <w:name w:val="No List"/>
     <w:uiPriority w:val="99"/>
     <w:semiHidden/>
     <w:unhideWhenUsed/>
   </w:style>
-  <w:style w:type="paragraph" w:styleId="a3">
+  <w:style w:type="paragraph" w:styleId="Title">
     <w:name w:val="Title"/>
-    <w:basedOn w:val="a"/>
-    <w:next w:val="a"/>
+    <w:basedOn w:val="Normal"/>
+    <w:next w:val="Normal"/>
     <w:uiPriority w:val="10"/>
     <w:qFormat/>
     <w:rPr>
@@ -7021,22 +7144,22 @@
       <w:szCs w:val="56"/>
     </w:rPr>
   </w:style>
-  <w:style w:type="paragraph" w:customStyle="1" w:styleId="10">
+  <w:style w:type="paragraph" w:customStyle="1" w:styleId="1">
     <w:name w:val="要点1"/>
-    <w:basedOn w:val="a"/>
-    <w:next w:val="a"/>
+    <w:basedOn w:val="Normal"/>
+    <w:next w:val="Normal"/>
     <w:qFormat/>
     <w:rPr>
       <w:b/>
       <w:bCs/>
     </w:rPr>
   </w:style>
-  <w:style w:type="paragraph" w:styleId="a4">
+  <w:style w:type="paragraph" w:styleId="ListParagraph">
     <w:name w:val="List Paragraph"/>
-    <w:basedOn w:val="a"/>
+    <w:basedOn w:val="Normal"/>
     <w:qFormat/>
   </w:style>
-  <w:style w:type="character" w:styleId="a5">
+  <w:style w:type="character" w:styleId="Hyperlink">
     <w:name w:val="Hyperlink"/>
     <w:uiPriority w:val="99"/>
     <w:unhideWhenUsed/>
@@ -7045,7 +7168,7 @@
       <w:u w:val="single"/>
     </w:rPr>
   </w:style>
-  <w:style w:type="character" w:styleId="a6">
+  <w:style w:type="character" w:styleId="FootnoteReference">
     <w:name w:val="footnote reference"/>
     <w:uiPriority w:val="99"/>
     <w:semiHidden/>
@@ -7054,10 +7177,10 @@
       <w:vertAlign w:val="superscript"/>
     </w:rPr>
   </w:style>
-  <w:style w:type="paragraph" w:styleId="a7">
+  <w:style w:type="paragraph" w:styleId="FootnoteText">
     <w:name w:val="footnote text"/>
-    <w:basedOn w:val="a"/>
-    <w:link w:val="a8"/>
+    <w:basedOn w:val="Normal"/>
+    <w:link w:val="FootnoteTextChar"/>
     <w:uiPriority w:val="99"/>
     <w:semiHidden/>
     <w:unhideWhenUsed/>
@@ -7066,9 +7189,9 @@
       <w:szCs w:val="20"/>
     </w:rPr>
   </w:style>
-  <w:style w:type="character" w:customStyle="1" w:styleId="a8">
-    <w:name w:val="脚注文本 字符"/>
-    <w:link w:val="a7"/>
+  <w:style w:type="character" w:customStyle="1" w:styleId="FootnoteTextChar">
+    <w:name w:val="Footnote Text Char"/>
+    <w:link w:val="FootnoteText"/>
     <w:uiPriority w:val="99"/>
     <w:semiHidden/>
     <w:unhideWhenUsed/>
@@ -7077,7 +7200,7 @@
       <w:szCs w:val="20"/>
     </w:rPr>
   </w:style>
-  <w:style w:type="character" w:styleId="a9">
+  <w:style w:type="character" w:styleId="EndnoteReference">
     <w:name w:val="endnote reference"/>
     <w:uiPriority w:val="99"/>
     <w:semiHidden/>
@@ -7086,10 +7209,10 @@
       <w:vertAlign w:val="superscript"/>
     </w:rPr>
   </w:style>
-  <w:style w:type="paragraph" w:styleId="aa">
+  <w:style w:type="paragraph" w:styleId="EndnoteText">
     <w:name w:val="endnote text"/>
-    <w:basedOn w:val="a"/>
-    <w:link w:val="ab"/>
+    <w:basedOn w:val="Normal"/>
+    <w:link w:val="EndnoteTextChar"/>
     <w:uiPriority w:val="99"/>
     <w:semiHidden/>
     <w:unhideWhenUsed/>
@@ -7098,9 +7221,9 @@
       <w:szCs w:val="20"/>
     </w:rPr>
   </w:style>
-  <w:style w:type="character" w:customStyle="1" w:styleId="ab">
-    <w:name w:val="尾注文本 字符"/>
-    <w:link w:val="aa"/>
+  <w:style w:type="character" w:customStyle="1" w:styleId="EndnoteTextChar">
+    <w:name w:val="Endnote Text Char"/>
+    <w:link w:val="EndnoteText"/>
     <w:uiPriority w:val="99"/>
     <w:semiHidden/>
     <w:unhideWhenUsed/>

</xml_diff>

<commit_message>
F1/comment business rules (#6)
* feat: F checked Business_rules_v1

* F: evidence rules (F-2) in evidence/README.md

* feat: F1 test_plan_v1.1 updated

* F1: test_plan updated

* F1: evidence updated

* F: feedback from xiaolong accepted

* F: test_plan v1.1 deleted

* F: revoke C_source_counts

* F: feedback from xialong (14:40) appllied
</commit_message>
<xml_diff>
--- a/docs/business_rules_v1.docx
+++ b/docs/business_rules_v1.docx
@@ -1,6 +1,6 @@
 
 <file path=word/document.xml><?xml version="1.0" encoding="utf-8"?>
-<w:document xmlns:wpc="http://schemas.microsoft.com/office/word/2010/wordprocessingCanvas" xmlns:cx="http://schemas.microsoft.com/office/drawing/2014/chartex" xmlns:cx1="http://schemas.microsoft.com/office/drawing/2015/9/8/chartex" xmlns:cx2="http://schemas.microsoft.com/office/drawing/2015/10/21/chartex" xmlns:cx3="http://schemas.microsoft.com/office/drawing/2016/5/9/chartex" xmlns:cx4="http://schemas.microsoft.com/office/drawing/2016/5/10/chartex" xmlns:cx5="http://schemas.microsoft.com/office/drawing/2016/5/11/chartex" xmlns:cx6="http://schemas.microsoft.com/office/drawing/2016/5/12/chartex" xmlns:cx7="http://schemas.microsoft.com/office/drawing/2016/5/13/chartex" xmlns:cx8="http://schemas.microsoft.com/office/drawing/2016/5/14/chartex" xmlns:mc="http://schemas.openxmlformats.org/markup-compatibility/2006" xmlns:aink="http://schemas.microsoft.com/office/drawing/2016/ink" xmlns:am3d="http://schemas.microsoft.com/office/drawing/2017/model3d" xmlns:o="urn:schemas-microsoft-com:office:office" xmlns:oel="http://schemas.microsoft.com/office/2019/extlst" xmlns:r="http://schemas.openxmlformats.org/officeDocument/2006/relationships" xmlns:m="http://schemas.openxmlformats.org/officeDocument/2006/math" xmlns:v="urn:schemas-microsoft-com:vml" xmlns:wp14="http://schemas.microsoft.com/office/word/2010/wordprocessingDrawing" xmlns:wp="http://schemas.openxmlformats.org/drawingml/2006/wordprocessingDrawing" xmlns:w10="urn:schemas-microsoft-com:office:word" xmlns:w="http://schemas.openxmlformats.org/wordprocessingml/2006/main" xmlns:w14="http://schemas.microsoft.com/office/word/2010/wordml" xmlns:w15="http://schemas.microsoft.com/office/word/2012/wordml" xmlns:w16cex="http://schemas.microsoft.com/office/word/2018/wordml/cex" xmlns:w16cid="http://schemas.microsoft.com/office/word/2016/wordml/cid" xmlns:w16="http://schemas.microsoft.com/office/word/2018/wordml" xmlns:w16du="http://schemas.microsoft.com/office/word/2023/wordml/word16du" xmlns:w16sdtdh="http://schemas.microsoft.com/office/word/2020/wordml/sdtdatahash" xmlns:w16sdtfl="http://schemas.microsoft.com/office/word/2024/wordml/sdtformatlock" xmlns:w16se="http://schemas.microsoft.com/office/word/2015/wordml/symex" xmlns:wpg="http://schemas.microsoft.com/office/word/2010/wordprocessingGroup" xmlns:wpi="http://schemas.microsoft.com/office/word/2010/wordprocessingInk" xmlns:wne="http://schemas.microsoft.com/office/word/2006/wordml" xmlns:wps="http://schemas.microsoft.com/office/word/2010/wordprocessingShape" mc:Ignorable="w14 w15 w16se w16cid w16 w16cex w16sdtdh w16sdtfl w16du wp14">
+<w:document xmlns:wpc="http://schemas.microsoft.com/office/word/2010/wordprocessingCanvas" xmlns:cx="http://schemas.microsoft.com/office/drawing/2014/chartex" xmlns:cx1="http://schemas.microsoft.com/office/drawing/2015/9/8/chartex" xmlns:cx2="http://schemas.microsoft.com/office/drawing/2015/10/21/chartex" xmlns:cx3="http://schemas.microsoft.com/office/drawing/2016/5/9/chartex" xmlns:cx4="http://schemas.microsoft.com/office/drawing/2016/5/10/chartex" xmlns:cx5="http://schemas.microsoft.com/office/drawing/2016/5/11/chartex" xmlns:cx6="http://schemas.microsoft.com/office/drawing/2016/5/12/chartex" xmlns:cx7="http://schemas.microsoft.com/office/drawing/2016/5/13/chartex" xmlns:cx8="http://schemas.microsoft.com/office/drawing/2016/5/14/chartex" xmlns:mc="http://schemas.openxmlformats.org/markup-compatibility/2006" xmlns:m="http://schemas.openxmlformats.org/officeDocument/2006/math" xmlns:aink="http://schemas.microsoft.com/office/drawing/2016/ink" xmlns:am3d="http://schemas.microsoft.com/office/drawing/2017/model3d" xmlns:oel="http://schemas.microsoft.com/office/2019/extlst" xmlns:r="http://schemas.openxmlformats.org/officeDocument/2006/relationships" xmlns:wp14="http://schemas.microsoft.com/office/word/2010/wordprocessingDrawing" xmlns:wp="http://schemas.openxmlformats.org/drawingml/2006/wordprocessingDrawing" xmlns:wpg="http://schemas.microsoft.com/office/word/2010/wordprocessingGroup" xmlns:wpi="http://schemas.microsoft.com/office/word/2010/wordprocessingInk" xmlns:wps="http://schemas.microsoft.com/office/word/2010/wordprocessingShape" xmlns:o="urn:schemas-microsoft-com:office:office" xmlns:v="urn:schemas-microsoft-com:vml" xmlns:w10="urn:schemas-microsoft-com:office:word" xmlns:w="http://schemas.openxmlformats.org/wordprocessingml/2006/main" xmlns:w14="http://schemas.microsoft.com/office/word/2010/wordml" xmlns:w15="http://schemas.microsoft.com/office/word/2012/wordml" xmlns:w16cex="http://schemas.microsoft.com/office/word/2018/wordml/cex" xmlns:w16cid="http://schemas.microsoft.com/office/word/2016/wordml/cid" xmlns:w16="http://schemas.microsoft.com/office/word/2018/wordml" xmlns:w16sdtdh="http://schemas.microsoft.com/office/word/2020/wordml/sdtdatahash" xmlns:w16sdtfl="http://schemas.microsoft.com/office/word/2024/wordml/sdtformatlock" xmlns:w16se="http://schemas.microsoft.com/office/word/2015/wordml/symex" xmlns:w16du="http://schemas.microsoft.com/office/word/2023/wordml/word16du" xmlns:wne="http://schemas.microsoft.com/office/word/2006/wordml" mc:Ignorable="w14 w15 w16se w16cid w16 w16cex w16sdtdh w16sdtfl w16du wp14">
   <w:body>
     <w:p>
       <w:pPr>
@@ -115,7 +115,7 @@
     </w:p>
     <w:p>
       <w:pPr>
-        <w:pStyle w:val="1"/>
+        <w:pStyle w:val="Heading1"/>
         <w:rPr>
           <w:color w:val="000000" w:themeColor="text1"/>
         </w:rPr>
@@ -150,12 +150,6 @@
         <w:gridCol w:w="7518"/>
       </w:tblGrid>
       <w:tr>
-        <w:tblPrEx>
-          <w:tblCellMar>
-            <w:top w:w="0" w:type="dxa"/>
-            <w:bottom w:w="0" w:type="dxa"/>
-          </w:tblCellMar>
-        </w:tblPrEx>
         <w:trPr>
           <w:tblHeader/>
         </w:trPr>
@@ -233,12 +227,6 @@
         </w:tc>
       </w:tr>
       <w:tr>
-        <w:tblPrEx>
-          <w:tblCellMar>
-            <w:top w:w="0" w:type="dxa"/>
-            <w:bottom w:w="0" w:type="dxa"/>
-          </w:tblCellMar>
-        </w:tblPrEx>
         <w:tc>
           <w:tcPr>
             <w:tcW w:w="2120" w:type="dxa"/>
@@ -343,12 +331,6 @@
         </w:tc>
       </w:tr>
       <w:tr>
-        <w:tblPrEx>
-          <w:tblCellMar>
-            <w:top w:w="0" w:type="dxa"/>
-            <w:bottom w:w="0" w:type="dxa"/>
-          </w:tblCellMar>
-        </w:tblPrEx>
         <w:tc>
           <w:tcPr>
             <w:tcW w:w="2120" w:type="dxa"/>
@@ -417,12 +399,6 @@
         </w:tc>
       </w:tr>
       <w:tr>
-        <w:tblPrEx>
-          <w:tblCellMar>
-            <w:top w:w="0" w:type="dxa"/>
-            <w:bottom w:w="0" w:type="dxa"/>
-          </w:tblCellMar>
-        </w:tblPrEx>
         <w:tc>
           <w:tcPr>
             <w:tcW w:w="2120" w:type="dxa"/>
@@ -521,12 +497,6 @@
         </w:tc>
       </w:tr>
       <w:tr>
-        <w:tblPrEx>
-          <w:tblCellMar>
-            <w:top w:w="0" w:type="dxa"/>
-            <w:bottom w:w="0" w:type="dxa"/>
-          </w:tblCellMar>
-        </w:tblPrEx>
         <w:tc>
           <w:tcPr>
             <w:tcW w:w="2120" w:type="dxa"/>
@@ -613,12 +583,6 @@
         </w:tc>
       </w:tr>
       <w:tr>
-        <w:tblPrEx>
-          <w:tblCellMar>
-            <w:top w:w="0" w:type="dxa"/>
-            <w:bottom w:w="0" w:type="dxa"/>
-          </w:tblCellMar>
-        </w:tblPrEx>
         <w:tc>
           <w:tcPr>
             <w:tcW w:w="2120" w:type="dxa"/>
@@ -687,12 +651,6 @@
         </w:tc>
       </w:tr>
       <w:tr>
-        <w:tblPrEx>
-          <w:tblCellMar>
-            <w:top w:w="0" w:type="dxa"/>
-            <w:bottom w:w="0" w:type="dxa"/>
-          </w:tblCellMar>
-        </w:tblPrEx>
         <w:tc>
           <w:tcPr>
             <w:tcW w:w="2120" w:type="dxa"/>
@@ -789,7 +747,7 @@
     </w:p>
     <w:p>
       <w:pPr>
-        <w:pStyle w:val="1"/>
+        <w:pStyle w:val="Heading1"/>
         <w:rPr>
           <w:color w:val="000000" w:themeColor="text1"/>
         </w:rPr>
@@ -848,12 +806,6 @@
         <w:gridCol w:w="4818"/>
       </w:tblGrid>
       <w:tr>
-        <w:tblPrEx>
-          <w:tblCellMar>
-            <w:top w:w="0" w:type="dxa"/>
-            <w:bottom w:w="0" w:type="dxa"/>
-          </w:tblCellMar>
-        </w:tblPrEx>
         <w:trPr>
           <w:tblHeader/>
         </w:trPr>
@@ -1005,12 +957,6 @@
         </w:tc>
       </w:tr>
       <w:tr>
-        <w:tblPrEx>
-          <w:tblCellMar>
-            <w:top w:w="0" w:type="dxa"/>
-            <w:bottom w:w="0" w:type="dxa"/>
-          </w:tblCellMar>
-        </w:tblPrEx>
         <w:tc>
           <w:tcPr>
             <w:tcW w:w="2506" w:type="dxa"/>
@@ -1147,12 +1093,6 @@
         </w:tc>
       </w:tr>
       <w:tr>
-        <w:tblPrEx>
-          <w:tblCellMar>
-            <w:top w:w="0" w:type="dxa"/>
-            <w:bottom w:w="0" w:type="dxa"/>
-          </w:tblCellMar>
-        </w:tblPrEx>
         <w:tc>
           <w:tcPr>
             <w:tcW w:w="2506" w:type="dxa"/>
@@ -1211,7 +1151,6 @@
                 <w:color w:val="000000" w:themeColor="text1"/>
               </w:rPr>
             </w:pPr>
-            <w:proofErr w:type="spellStart"/>
             <w:r>
               <w:rPr>
                 <w:color w:val="000000" w:themeColor="text1"/>
@@ -1278,7 +1217,6 @@
                 <w:color w:val="000000" w:themeColor="text1"/>
               </w:rPr>
             </w:pPr>
-            <w:proofErr w:type="spellEnd"/>
             <w:r>
               <w:rPr>
                 <w:color w:val="000000" w:themeColor="text1"/>
@@ -1291,12 +1229,6 @@
         </w:tc>
       </w:tr>
       <w:tr>
-        <w:tblPrEx>
-          <w:tblCellMar>
-            <w:top w:w="0" w:type="dxa"/>
-            <w:bottom w:w="0" w:type="dxa"/>
-          </w:tblCellMar>
-        </w:tblPrEx>
         <w:tc>
           <w:tcPr>
             <w:tcW w:w="2506" w:type="dxa"/>
@@ -1431,12 +1363,6 @@
         </w:tc>
       </w:tr>
       <w:tr>
-        <w:tblPrEx>
-          <w:tblCellMar>
-            <w:top w:w="0" w:type="dxa"/>
-            <w:bottom w:w="0" w:type="dxa"/>
-          </w:tblCellMar>
-        </w:tblPrEx>
         <w:tc>
           <w:tcPr>
             <w:tcW w:w="2506" w:type="dxa"/>
@@ -1573,12 +1499,6 @@
         </w:tc>
       </w:tr>
       <w:tr>
-        <w:tblPrEx>
-          <w:tblCellMar>
-            <w:top w:w="0" w:type="dxa"/>
-            <w:bottom w:w="0" w:type="dxa"/>
-          </w:tblCellMar>
-        </w:tblPrEx>
         <w:tc>
           <w:tcPr>
             <w:tcW w:w="2506" w:type="dxa"/>
@@ -1715,12 +1635,6 @@
         </w:tc>
       </w:tr>
       <w:tr>
-        <w:tblPrEx>
-          <w:tblCellMar>
-            <w:top w:w="0" w:type="dxa"/>
-            <w:bottom w:w="0" w:type="dxa"/>
-          </w:tblCellMar>
-        </w:tblPrEx>
         <w:tc>
           <w:tcPr>
             <w:tcW w:w="2506" w:type="dxa"/>
@@ -1857,12 +1771,6 @@
         </w:tc>
       </w:tr>
       <w:tr>
-        <w:tblPrEx>
-          <w:tblCellMar>
-            <w:top w:w="0" w:type="dxa"/>
-            <w:bottom w:w="0" w:type="dxa"/>
-          </w:tblCellMar>
-        </w:tblPrEx>
         <w:tc>
           <w:tcPr>
             <w:tcW w:w="2506" w:type="dxa"/>
@@ -1999,12 +1907,6 @@
         </w:tc>
       </w:tr>
       <w:tr>
-        <w:tblPrEx>
-          <w:tblCellMar>
-            <w:top w:w="0" w:type="dxa"/>
-            <w:bottom w:w="0" w:type="dxa"/>
-          </w:tblCellMar>
-        </w:tblPrEx>
         <w:tc>
           <w:tcPr>
             <w:tcW w:w="2506" w:type="dxa"/>
@@ -2141,12 +2043,6 @@
         </w:tc>
       </w:tr>
       <w:tr>
-        <w:tblPrEx>
-          <w:tblCellMar>
-            <w:top w:w="0" w:type="dxa"/>
-            <w:bottom w:w="0" w:type="dxa"/>
-          </w:tblCellMar>
-        </w:tblPrEx>
         <w:tc>
           <w:tcPr>
             <w:tcW w:w="2506" w:type="dxa"/>
@@ -2293,7 +2189,7 @@
     </w:p>
     <w:p>
       <w:pPr>
-        <w:pStyle w:val="1"/>
+        <w:pStyle w:val="Heading1"/>
         <w:rPr>
           <w:color w:val="000000" w:themeColor="text1"/>
         </w:rPr>
@@ -2328,12 +2224,6 @@
         <w:gridCol w:w="7518"/>
       </w:tblGrid>
       <w:tr>
-        <w:tblPrEx>
-          <w:tblCellMar>
-            <w:top w:w="0" w:type="dxa"/>
-            <w:bottom w:w="0" w:type="dxa"/>
-          </w:tblCellMar>
-        </w:tblPrEx>
         <w:trPr>
           <w:tblHeader/>
         </w:trPr>
@@ -2411,12 +2301,6 @@
         </w:tc>
       </w:tr>
       <w:tr>
-        <w:tblPrEx>
-          <w:tblCellMar>
-            <w:top w:w="0" w:type="dxa"/>
-            <w:bottom w:w="0" w:type="dxa"/>
-          </w:tblCellMar>
-        </w:tblPrEx>
         <w:tc>
           <w:tcPr>
             <w:tcW w:w="2120" w:type="dxa"/>
@@ -2485,12 +2369,6 @@
         </w:tc>
       </w:tr>
       <w:tr>
-        <w:tblPrEx>
-          <w:tblCellMar>
-            <w:top w:w="0" w:type="dxa"/>
-            <w:bottom w:w="0" w:type="dxa"/>
-          </w:tblCellMar>
-        </w:tblPrEx>
         <w:tc>
           <w:tcPr>
             <w:tcW w:w="2120" w:type="dxa"/>
@@ -2659,12 +2537,6 @@
         </w:tc>
       </w:tr>
       <w:tr>
-        <w:tblPrEx>
-          <w:tblCellMar>
-            <w:top w:w="0" w:type="dxa"/>
-            <w:bottom w:w="0" w:type="dxa"/>
-          </w:tblCellMar>
-        </w:tblPrEx>
         <w:tc>
           <w:tcPr>
             <w:tcW w:w="2120" w:type="dxa"/>
@@ -2734,12 +2606,6 @@
         </w:tc>
       </w:tr>
       <w:tr>
-        <w:tblPrEx>
-          <w:tblCellMar>
-            <w:top w:w="0" w:type="dxa"/>
-            <w:bottom w:w="0" w:type="dxa"/>
-          </w:tblCellMar>
-        </w:tblPrEx>
         <w:tc>
           <w:tcPr>
             <w:tcW w:w="2120" w:type="dxa"/>
@@ -2842,12 +2708,6 @@
         </w:tc>
       </w:tr>
       <w:tr>
-        <w:tblPrEx>
-          <w:tblCellMar>
-            <w:top w:w="0" w:type="dxa"/>
-            <w:bottom w:w="0" w:type="dxa"/>
-          </w:tblCellMar>
-        </w:tblPrEx>
         <w:tc>
           <w:tcPr>
             <w:tcW w:w="2120" w:type="dxa"/>
@@ -2932,12 +2792,6 @@
         </w:tc>
       </w:tr>
       <w:tr>
-        <w:tblPrEx>
-          <w:tblCellMar>
-            <w:top w:w="0" w:type="dxa"/>
-            <w:bottom w:w="0" w:type="dxa"/>
-          </w:tblCellMar>
-        </w:tblPrEx>
         <w:tc>
           <w:tcPr>
             <w:tcW w:w="2120" w:type="dxa"/>
@@ -3036,7 +2890,7 @@
     </w:p>
     <w:p>
       <w:pPr>
-        <w:pStyle w:val="1"/>
+        <w:pStyle w:val="Heading1"/>
         <w:rPr>
           <w:color w:val="000000" w:themeColor="text1"/>
         </w:rPr>
@@ -3071,12 +2925,6 @@
         <w:gridCol w:w="7518"/>
       </w:tblGrid>
       <w:tr>
-        <w:tblPrEx>
-          <w:tblCellMar>
-            <w:top w:w="0" w:type="dxa"/>
-            <w:bottom w:w="0" w:type="dxa"/>
-          </w:tblCellMar>
-        </w:tblPrEx>
         <w:trPr>
           <w:tblHeader/>
         </w:trPr>
@@ -3154,12 +3002,6 @@
         </w:tc>
       </w:tr>
       <w:tr>
-        <w:tblPrEx>
-          <w:tblCellMar>
-            <w:top w:w="0" w:type="dxa"/>
-            <w:bottom w:w="0" w:type="dxa"/>
-          </w:tblCellMar>
-        </w:tblPrEx>
         <w:tc>
           <w:tcPr>
             <w:tcW w:w="2120" w:type="dxa"/>
@@ -3228,12 +3070,6 @@
         </w:tc>
       </w:tr>
       <w:tr>
-        <w:tblPrEx>
-          <w:tblCellMar>
-            <w:top w:w="0" w:type="dxa"/>
-            <w:bottom w:w="0" w:type="dxa"/>
-          </w:tblCellMar>
-        </w:tblPrEx>
         <w:tc>
           <w:tcPr>
             <w:tcW w:w="2120" w:type="dxa"/>
@@ -3436,12 +3272,6 @@
         </w:tc>
       </w:tr>
       <w:tr>
-        <w:tblPrEx>
-          <w:tblCellMar>
-            <w:top w:w="0" w:type="dxa"/>
-            <w:bottom w:w="0" w:type="dxa"/>
-          </w:tblCellMar>
-        </w:tblPrEx>
         <w:tc>
           <w:tcPr>
             <w:tcW w:w="2120" w:type="dxa"/>
@@ -3510,12 +3340,6 @@
         </w:tc>
       </w:tr>
       <w:tr>
-        <w:tblPrEx>
-          <w:tblCellMar>
-            <w:top w:w="0" w:type="dxa"/>
-            <w:bottom w:w="0" w:type="dxa"/>
-          </w:tblCellMar>
-        </w:tblPrEx>
         <w:tc>
           <w:tcPr>
             <w:tcW w:w="2120" w:type="dxa"/>
@@ -3600,12 +3424,6 @@
         </w:tc>
       </w:tr>
       <w:tr>
-        <w:tblPrEx>
-          <w:tblCellMar>
-            <w:top w:w="0" w:type="dxa"/>
-            <w:bottom w:w="0" w:type="dxa"/>
-          </w:tblCellMar>
-        </w:tblPrEx>
         <w:tc>
           <w:tcPr>
             <w:tcW w:w="2120" w:type="dxa"/>
@@ -3690,12 +3508,6 @@
         </w:tc>
       </w:tr>
       <w:tr>
-        <w:tblPrEx>
-          <w:tblCellMar>
-            <w:top w:w="0" w:type="dxa"/>
-            <w:bottom w:w="0" w:type="dxa"/>
-          </w:tblCellMar>
-        </w:tblPrEx>
         <w:tc>
           <w:tcPr>
             <w:tcW w:w="2120" w:type="dxa"/>
@@ -3794,7 +3606,7 @@
     </w:p>
     <w:p>
       <w:pPr>
-        <w:pStyle w:val="1"/>
+        <w:pStyle w:val="Heading1"/>
         <w:rPr>
           <w:color w:val="000000" w:themeColor="text1"/>
         </w:rPr>
@@ -3829,12 +3641,6 @@
         <w:gridCol w:w="7518"/>
       </w:tblGrid>
       <w:tr>
-        <w:tblPrEx>
-          <w:tblCellMar>
-            <w:top w:w="0" w:type="dxa"/>
-            <w:bottom w:w="0" w:type="dxa"/>
-          </w:tblCellMar>
-        </w:tblPrEx>
         <w:trPr>
           <w:tblHeader/>
         </w:trPr>
@@ -3912,12 +3718,6 @@
         </w:tc>
       </w:tr>
       <w:tr>
-        <w:tblPrEx>
-          <w:tblCellMar>
-            <w:top w:w="0" w:type="dxa"/>
-            <w:bottom w:w="0" w:type="dxa"/>
-          </w:tblCellMar>
-        </w:tblPrEx>
         <w:tc>
           <w:tcPr>
             <w:tcW w:w="2120" w:type="dxa"/>
@@ -3986,12 +3786,6 @@
         </w:tc>
       </w:tr>
       <w:tr>
-        <w:tblPrEx>
-          <w:tblCellMar>
-            <w:top w:w="0" w:type="dxa"/>
-            <w:bottom w:w="0" w:type="dxa"/>
-          </w:tblCellMar>
-        </w:tblPrEx>
         <w:tc>
           <w:tcPr>
             <w:tcW w:w="2120" w:type="dxa"/>
@@ -4176,12 +3970,6 @@
         </w:tc>
       </w:tr>
       <w:tr>
-        <w:tblPrEx>
-          <w:tblCellMar>
-            <w:top w:w="0" w:type="dxa"/>
-            <w:bottom w:w="0" w:type="dxa"/>
-          </w:tblCellMar>
-        </w:tblPrEx>
         <w:tc>
           <w:tcPr>
             <w:tcW w:w="2120" w:type="dxa"/>
@@ -4269,12 +4057,6 @@
         </w:tc>
       </w:tr>
       <w:tr>
-        <w:tblPrEx>
-          <w:tblCellMar>
-            <w:top w:w="0" w:type="dxa"/>
-            <w:bottom w:w="0" w:type="dxa"/>
-          </w:tblCellMar>
-        </w:tblPrEx>
         <w:tc>
           <w:tcPr>
             <w:tcW w:w="2120" w:type="dxa"/>
@@ -4395,12 +4177,6 @@
         </w:tc>
       </w:tr>
       <w:tr>
-        <w:tblPrEx>
-          <w:tblCellMar>
-            <w:top w:w="0" w:type="dxa"/>
-            <w:bottom w:w="0" w:type="dxa"/>
-          </w:tblCellMar>
-        </w:tblPrEx>
         <w:tc>
           <w:tcPr>
             <w:tcW w:w="2120" w:type="dxa"/>
@@ -4485,12 +4261,6 @@
         </w:tc>
       </w:tr>
       <w:tr>
-        <w:tblPrEx>
-          <w:tblCellMar>
-            <w:top w:w="0" w:type="dxa"/>
-            <w:bottom w:w="0" w:type="dxa"/>
-          </w:tblCellMar>
-        </w:tblPrEx>
         <w:tc>
           <w:tcPr>
             <w:tcW w:w="2120" w:type="dxa"/>
@@ -4589,7 +4359,7 @@
     </w:p>
     <w:p>
       <w:pPr>
-        <w:pStyle w:val="1"/>
+        <w:pStyle w:val="Heading1"/>
         <w:rPr>
           <w:color w:val="000000" w:themeColor="text1"/>
         </w:rPr>
@@ -4624,12 +4394,6 @@
         <w:gridCol w:w="7518"/>
       </w:tblGrid>
       <w:tr>
-        <w:tblPrEx>
-          <w:tblCellMar>
-            <w:top w:w="0" w:type="dxa"/>
-            <w:bottom w:w="0" w:type="dxa"/>
-          </w:tblCellMar>
-        </w:tblPrEx>
         <w:trPr>
           <w:tblHeader/>
         </w:trPr>
@@ -4707,12 +4471,6 @@
         </w:tc>
       </w:tr>
       <w:tr>
-        <w:tblPrEx>
-          <w:tblCellMar>
-            <w:top w:w="0" w:type="dxa"/>
-            <w:bottom w:w="0" w:type="dxa"/>
-          </w:tblCellMar>
-        </w:tblPrEx>
         <w:tc>
           <w:tcPr>
             <w:tcW w:w="2120" w:type="dxa"/>
@@ -4781,12 +4539,6 @@
         </w:tc>
       </w:tr>
       <w:tr>
-        <w:tblPrEx>
-          <w:tblCellMar>
-            <w:top w:w="0" w:type="dxa"/>
-            <w:bottom w:w="0" w:type="dxa"/>
-          </w:tblCellMar>
-        </w:tblPrEx>
         <w:tc>
           <w:tcPr>
             <w:tcW w:w="2120" w:type="dxa"/>
@@ -4910,12 +4662,6 @@
         </w:tc>
       </w:tr>
       <w:tr>
-        <w:tblPrEx>
-          <w:tblCellMar>
-            <w:top w:w="0" w:type="dxa"/>
-            <w:bottom w:w="0" w:type="dxa"/>
-          </w:tblCellMar>
-        </w:tblPrEx>
         <w:tc>
           <w:tcPr>
             <w:tcW w:w="2120" w:type="dxa"/>
@@ -4984,12 +4730,6 @@
         </w:tc>
       </w:tr>
       <w:tr>
-        <w:tblPrEx>
-          <w:tblCellMar>
-            <w:top w:w="0" w:type="dxa"/>
-            <w:bottom w:w="0" w:type="dxa"/>
-          </w:tblCellMar>
-        </w:tblPrEx>
         <w:tc>
           <w:tcPr>
             <w:tcW w:w="2120" w:type="dxa"/>
@@ -5074,12 +4814,6 @@
         </w:tc>
       </w:tr>
       <w:tr>
-        <w:tblPrEx>
-          <w:tblCellMar>
-            <w:top w:w="0" w:type="dxa"/>
-            <w:bottom w:w="0" w:type="dxa"/>
-          </w:tblCellMar>
-        </w:tblPrEx>
         <w:tc>
           <w:tcPr>
             <w:tcW w:w="2120" w:type="dxa"/>
@@ -5166,12 +4900,6 @@
         </w:tc>
       </w:tr>
       <w:tr>
-        <w:tblPrEx>
-          <w:tblCellMar>
-            <w:top w:w="0" w:type="dxa"/>
-            <w:bottom w:w="0" w:type="dxa"/>
-          </w:tblCellMar>
-        </w:tblPrEx>
         <w:tc>
           <w:tcPr>
             <w:tcW w:w="2120" w:type="dxa"/>
@@ -5270,7 +4998,7 @@
     </w:p>
     <w:p>
       <w:pPr>
-        <w:pStyle w:val="1"/>
+        <w:pStyle w:val="Heading1"/>
         <w:rPr>
           <w:color w:val="000000" w:themeColor="text1"/>
         </w:rPr>
@@ -5298,7 +5026,7 @@
     </w:p>
     <w:tbl>
       <w:tblPr>
-        <w:tblW w:w="9638" w:type="dxa"/>
+        <w:tblW w:w="9678" w:type="dxa"/>
         <w:tblBorders>
           <w:top w:val="single" w:sz="4" w:space="0" w:color="auto"/>
           <w:left w:val="single" w:sz="4" w:space="0" w:color="auto"/>
@@ -5316,17 +5044,11 @@
       </w:tblPr>
       <w:tblGrid>
         <w:gridCol w:w="2120"/>
-        <w:gridCol w:w="3855"/>
-        <w:gridCol w:w="2506"/>
-        <w:gridCol w:w="1157"/>
+        <w:gridCol w:w="2695"/>
+        <w:gridCol w:w="3402"/>
+        <w:gridCol w:w="1461"/>
       </w:tblGrid>
       <w:tr>
-        <w:tblPrEx>
-          <w:tblCellMar>
-            <w:top w:w="0" w:type="dxa"/>
-            <w:bottom w:w="0" w:type="dxa"/>
-          </w:tblCellMar>
-        </w:tblPrEx>
         <w:trPr>
           <w:tblHeader/>
         </w:trPr>
@@ -5368,7 +5090,7 @@
         </w:tc>
         <w:tc>
           <w:tcPr>
-            <w:tcW w:w="3855" w:type="dxa"/>
+            <w:tcW w:w="2695" w:type="dxa"/>
             <w:tcBorders>
               <w:top w:val="single" w:sz="4" w:space="0" w:color="BFC5CE"/>
               <w:left w:val="single" w:sz="4" w:space="0" w:color="BFC5CE"/>
@@ -5404,7 +5126,7 @@
         </w:tc>
         <w:tc>
           <w:tcPr>
-            <w:tcW w:w="2506" w:type="dxa"/>
+            <w:tcW w:w="3402" w:type="dxa"/>
             <w:tcBorders>
               <w:top w:val="single" w:sz="4" w:space="0" w:color="BFC5CE"/>
               <w:left w:val="single" w:sz="4" w:space="0" w:color="BFC5CE"/>
@@ -5440,7 +5162,7 @@
         </w:tc>
         <w:tc>
           <w:tcPr>
-            <w:tcW w:w="1157" w:type="dxa"/>
+            <w:tcW w:w="1461" w:type="dxa"/>
             <w:tcBorders>
               <w:top w:val="single" w:sz="4" w:space="0" w:color="BFC5CE"/>
               <w:left w:val="single" w:sz="4" w:space="0" w:color="BFC5CE"/>
@@ -5476,12 +5198,6 @@
         </w:tc>
       </w:tr>
       <w:tr>
-        <w:tblPrEx>
-          <w:tblCellMar>
-            <w:top w:w="0" w:type="dxa"/>
-            <w:bottom w:w="0" w:type="dxa"/>
-          </w:tblCellMar>
-        </w:tblPrEx>
         <w:tc>
           <w:tcPr>
             <w:tcW w:w="2120" w:type="dxa"/>
@@ -5517,7 +5233,7 @@
         </w:tc>
         <w:tc>
           <w:tcPr>
-            <w:tcW w:w="3855" w:type="dxa"/>
+            <w:tcW w:w="2695" w:type="dxa"/>
             <w:tcBorders>
               <w:top w:val="single" w:sz="4" w:space="0" w:color="BFC5CE"/>
               <w:left w:val="single" w:sz="4" w:space="0" w:color="BFC5CE"/>
@@ -5550,32 +5266,32 @@
         </w:tc>
         <w:tc>
           <w:tcPr>
-            <w:tcW w:w="2506" w:type="dxa"/>
-            <w:tcBorders>
-              <w:top w:val="single" w:sz="4" w:space="0" w:color="BFC5CE"/>
-              <w:left w:val="single" w:sz="4" w:space="0" w:color="BFC5CE"/>
-              <w:bottom w:val="single" w:sz="4" w:space="0" w:color="BFC5CE"/>
-              <w:right w:val="single" w:sz="4" w:space="0" w:color="BFC5CE"/>
-            </w:tcBorders>
-            <w:tcMar>
-              <w:top w:w="50" w:type="dxa"/>
-              <w:left w:w="80" w:type="dxa"/>
-              <w:bottom w:w="50" w:type="dxa"/>
-              <w:right w:w="80" w:type="dxa"/>
-            </w:tcMar>
-          </w:tcPr>
-          <w:p>
-            <w:pPr>
-              <w:spacing w:after="20"/>
-              <w:rPr>
-                <w:color w:val="000000" w:themeColor="text1"/>
-              </w:rPr>
-            </w:pPr>
-          </w:p>
-        </w:tc>
-        <w:tc>
-          <w:tcPr>
-            <w:tcW w:w="1157" w:type="dxa"/>
+            <w:tcW w:w="3402" w:type="dxa"/>
+            <w:tcBorders>
+              <w:top w:val="single" w:sz="4" w:space="0" w:color="BFC5CE"/>
+              <w:left w:val="single" w:sz="4" w:space="0" w:color="BFC5CE"/>
+              <w:bottom w:val="single" w:sz="4" w:space="0" w:color="BFC5CE"/>
+              <w:right w:val="single" w:sz="4" w:space="0" w:color="BFC5CE"/>
+            </w:tcBorders>
+            <w:tcMar>
+              <w:top w:w="50" w:type="dxa"/>
+              <w:left w:w="80" w:type="dxa"/>
+              <w:bottom w:w="50" w:type="dxa"/>
+              <w:right w:w="80" w:type="dxa"/>
+            </w:tcMar>
+          </w:tcPr>
+          <w:p>
+            <w:pPr>
+              <w:spacing w:after="20"/>
+              <w:rPr>
+                <w:color w:val="000000" w:themeColor="text1"/>
+              </w:rPr>
+            </w:pPr>
+          </w:p>
+        </w:tc>
+        <w:tc>
+          <w:tcPr>
+            <w:tcW w:w="1461" w:type="dxa"/>
             <w:tcBorders>
               <w:top w:val="single" w:sz="4" w:space="0" w:color="BFC5CE"/>
               <w:left w:val="single" w:sz="4" w:space="0" w:color="BFC5CE"/>
@@ -5600,12 +5316,6 @@
         </w:tc>
       </w:tr>
       <w:tr>
-        <w:tblPrEx>
-          <w:tblCellMar>
-            <w:top w:w="0" w:type="dxa"/>
-            <w:bottom w:w="0" w:type="dxa"/>
-          </w:tblCellMar>
-        </w:tblPrEx>
         <w:tc>
           <w:tcPr>
             <w:tcW w:w="2120" w:type="dxa"/>
@@ -5641,7 +5351,7 @@
         </w:tc>
         <w:tc>
           <w:tcPr>
-            <w:tcW w:w="3855" w:type="dxa"/>
+            <w:tcW w:w="2695" w:type="dxa"/>
             <w:tcBorders>
               <w:top w:val="single" w:sz="4" w:space="0" w:color="BFC5CE"/>
               <w:left w:val="single" w:sz="4" w:space="0" w:color="BFC5CE"/>
@@ -5674,32 +5384,32 @@
         </w:tc>
         <w:tc>
           <w:tcPr>
-            <w:tcW w:w="2506" w:type="dxa"/>
-            <w:tcBorders>
-              <w:top w:val="single" w:sz="4" w:space="0" w:color="BFC5CE"/>
-              <w:left w:val="single" w:sz="4" w:space="0" w:color="BFC5CE"/>
-              <w:bottom w:val="single" w:sz="4" w:space="0" w:color="BFC5CE"/>
-              <w:right w:val="single" w:sz="4" w:space="0" w:color="BFC5CE"/>
-            </w:tcBorders>
-            <w:tcMar>
-              <w:top w:w="50" w:type="dxa"/>
-              <w:left w:w="80" w:type="dxa"/>
-              <w:bottom w:w="50" w:type="dxa"/>
-              <w:right w:w="80" w:type="dxa"/>
-            </w:tcMar>
-          </w:tcPr>
-          <w:p>
-            <w:pPr>
-              <w:spacing w:after="20"/>
-              <w:rPr>
-                <w:color w:val="000000" w:themeColor="text1"/>
-              </w:rPr>
-            </w:pPr>
-          </w:p>
-        </w:tc>
-        <w:tc>
-          <w:tcPr>
-            <w:tcW w:w="1157" w:type="dxa"/>
+            <w:tcW w:w="3402" w:type="dxa"/>
+            <w:tcBorders>
+              <w:top w:val="single" w:sz="4" w:space="0" w:color="BFC5CE"/>
+              <w:left w:val="single" w:sz="4" w:space="0" w:color="BFC5CE"/>
+              <w:bottom w:val="single" w:sz="4" w:space="0" w:color="BFC5CE"/>
+              <w:right w:val="single" w:sz="4" w:space="0" w:color="BFC5CE"/>
+            </w:tcBorders>
+            <w:tcMar>
+              <w:top w:w="50" w:type="dxa"/>
+              <w:left w:w="80" w:type="dxa"/>
+              <w:bottom w:w="50" w:type="dxa"/>
+              <w:right w:w="80" w:type="dxa"/>
+            </w:tcMar>
+          </w:tcPr>
+          <w:p>
+            <w:pPr>
+              <w:spacing w:after="20"/>
+              <w:rPr>
+                <w:color w:val="000000" w:themeColor="text1"/>
+              </w:rPr>
+            </w:pPr>
+          </w:p>
+        </w:tc>
+        <w:tc>
+          <w:tcPr>
+            <w:tcW w:w="1461" w:type="dxa"/>
             <w:tcBorders>
               <w:top w:val="single" w:sz="4" w:space="0" w:color="BFC5CE"/>
               <w:left w:val="single" w:sz="4" w:space="0" w:color="BFC5CE"/>
@@ -5724,12 +5434,6 @@
         </w:tc>
       </w:tr>
       <w:tr>
-        <w:tblPrEx>
-          <w:tblCellMar>
-            <w:top w:w="0" w:type="dxa"/>
-            <w:bottom w:w="0" w:type="dxa"/>
-          </w:tblCellMar>
-        </w:tblPrEx>
         <w:tc>
           <w:tcPr>
             <w:tcW w:w="2120" w:type="dxa"/>
@@ -5765,7 +5469,7 @@
         </w:tc>
         <w:tc>
           <w:tcPr>
-            <w:tcW w:w="3855" w:type="dxa"/>
+            <w:tcW w:w="2695" w:type="dxa"/>
             <w:tcBorders>
               <w:top w:val="single" w:sz="4" w:space="0" w:color="BFC5CE"/>
               <w:left w:val="single" w:sz="4" w:space="0" w:color="BFC5CE"/>
@@ -5798,52 +5502,380 @@
         </w:tc>
         <w:tc>
           <w:tcPr>
-            <w:tcW w:w="2506" w:type="dxa"/>
-            <w:tcBorders>
-              <w:top w:val="single" w:sz="4" w:space="0" w:color="BFC5CE"/>
-              <w:left w:val="single" w:sz="4" w:space="0" w:color="BFC5CE"/>
-              <w:bottom w:val="single" w:sz="4" w:space="0" w:color="BFC5CE"/>
-              <w:right w:val="single" w:sz="4" w:space="0" w:color="BFC5CE"/>
-            </w:tcBorders>
-            <w:tcMar>
-              <w:top w:w="50" w:type="dxa"/>
-              <w:left w:w="80" w:type="dxa"/>
-              <w:bottom w:w="50" w:type="dxa"/>
-              <w:right w:w="80" w:type="dxa"/>
-            </w:tcMar>
-          </w:tcPr>
-          <w:p>
-            <w:pPr>
-              <w:spacing w:after="20"/>
-              <w:rPr>
-                <w:color w:val="000000" w:themeColor="text1"/>
-              </w:rPr>
-            </w:pPr>
-          </w:p>
-        </w:tc>
-        <w:tc>
-          <w:tcPr>
-            <w:tcW w:w="1157" w:type="dxa"/>
-            <w:tcBorders>
-              <w:top w:val="single" w:sz="4" w:space="0" w:color="BFC5CE"/>
-              <w:left w:val="single" w:sz="4" w:space="0" w:color="BFC5CE"/>
-              <w:bottom w:val="single" w:sz="4" w:space="0" w:color="BFC5CE"/>
-              <w:right w:val="single" w:sz="4" w:space="0" w:color="BFC5CE"/>
-            </w:tcBorders>
-            <w:tcMar>
-              <w:top w:w="50" w:type="dxa"/>
-              <w:left w:w="80" w:type="dxa"/>
-              <w:bottom w:w="50" w:type="dxa"/>
-              <w:right w:w="80" w:type="dxa"/>
-            </w:tcMar>
-          </w:tcPr>
-          <w:p>
-            <w:pPr>
-              <w:spacing w:after="20"/>
-              <w:rPr>
-                <w:color w:val="000000" w:themeColor="text1"/>
-              </w:rPr>
-            </w:pPr>
+            <w:tcW w:w="3402" w:type="dxa"/>
+            <w:tcBorders>
+              <w:top w:val="single" w:sz="4" w:space="0" w:color="BFC5CE"/>
+              <w:left w:val="single" w:sz="4" w:space="0" w:color="BFC5CE"/>
+              <w:bottom w:val="single" w:sz="4" w:space="0" w:color="BFC5CE"/>
+              <w:right w:val="single" w:sz="4" w:space="0" w:color="BFC5CE"/>
+            </w:tcBorders>
+            <w:tcMar>
+              <w:top w:w="50" w:type="dxa"/>
+              <w:left w:w="80" w:type="dxa"/>
+              <w:bottom w:w="50" w:type="dxa"/>
+              <w:right w:w="80" w:type="dxa"/>
+            </w:tcMar>
+          </w:tcPr>
+          <w:p>
+            <w:pPr>
+              <w:pStyle w:val="ListParagraph"/>
+              <w:numPr>
+                <w:ilvl w:val="0"/>
+                <w:numId w:val="2"/>
+              </w:numPr>
+              <w:spacing w:after="20"/>
+              <w:ind w:left="208" w:hanging="208"/>
+              <w:rPr>
+                <w:color w:val="000000" w:themeColor="text1"/>
+                <w:sz w:val="18"/>
+                <w:szCs w:val="18"/>
+              </w:rPr>
+            </w:pPr>
+            <w:r>
+              <w:rPr>
+                <w:color w:val="000000" w:themeColor="text1"/>
+                <w:sz w:val="18"/>
+                <w:szCs w:val="18"/>
+              </w:rPr>
+              <w:t xml:space="preserve">It seems like </w:t>
+            </w:r>
+            <w:r>
+              <w:rPr>
+                <w:color w:val="000000" w:themeColor="text1"/>
+                <w:sz w:val="18"/>
+                <w:szCs w:val="18"/>
+              </w:rPr>
+              <w:t>"target ≤ 53" in section 1 conflicts with UC1 "≥ 53 is high"</w:t>
+            </w:r>
+            <w:r>
+              <w:rPr>
+                <w:color w:val="000000" w:themeColor="text1"/>
+                <w:sz w:val="18"/>
+                <w:szCs w:val="18"/>
+              </w:rPr>
+              <w:t>. I think it’s better to</w:t>
+            </w:r>
+            <w:r>
+              <w:rPr>
+                <w:color w:val="000000" w:themeColor="text1"/>
+                <w:sz w:val="18"/>
+                <w:szCs w:val="18"/>
+              </w:rPr>
+              <w:t xml:space="preserve"> use "53 or more is high" everywhere.</w:t>
+            </w:r>
+          </w:p>
+          <w:p>
+            <w:pPr>
+              <w:pStyle w:val="ListParagraph"/>
+              <w:numPr>
+                <w:ilvl w:val="0"/>
+                <w:numId w:val="2"/>
+              </w:numPr>
+              <w:spacing w:after="20"/>
+              <w:ind w:left="208" w:hanging="208"/>
+              <w:rPr>
+                <w:color w:val="000000" w:themeColor="text1"/>
+                <w:sz w:val="18"/>
+                <w:szCs w:val="18"/>
+              </w:rPr>
+            </w:pPr>
+            <w:r>
+              <w:rPr>
+                <w:color w:val="000000" w:themeColor="text1"/>
+                <w:sz w:val="18"/>
+                <w:szCs w:val="18"/>
+              </w:rPr>
+              <w:t xml:space="preserve">UC4(a) says "no delivery record in </w:t>
+            </w:r>
+            <w:proofErr w:type="spellStart"/>
+            <w:r>
+              <w:rPr>
+                <w:color w:val="000000" w:themeColor="text1"/>
+                <w:sz w:val="18"/>
+                <w:szCs w:val="18"/>
+              </w:rPr>
+              <w:t>src_</w:t>
+            </w:r>
+            <w:proofErr w:type="gramStart"/>
+            <w:r>
+              <w:rPr>
+                <w:color w:val="000000" w:themeColor="text1"/>
+                <w:sz w:val="18"/>
+                <w:szCs w:val="18"/>
+              </w:rPr>
+              <w:t>lab.result</w:t>
+            </w:r>
+            <w:proofErr w:type="gramEnd"/>
+            <w:r>
+              <w:rPr>
+                <w:color w:val="000000" w:themeColor="text1"/>
+                <w:sz w:val="18"/>
+                <w:szCs w:val="18"/>
+              </w:rPr>
+              <w:t>_delivery</w:t>
+            </w:r>
+            <w:proofErr w:type="spellEnd"/>
+            <w:r>
+              <w:rPr>
+                <w:color w:val="000000" w:themeColor="text1"/>
+                <w:sz w:val="18"/>
+                <w:szCs w:val="18"/>
+              </w:rPr>
+              <w:t xml:space="preserve">". </w:t>
+            </w:r>
+            <w:r>
+              <w:rPr>
+                <w:color w:val="000000" w:themeColor="text1"/>
+                <w:sz w:val="18"/>
+                <w:szCs w:val="18"/>
+              </w:rPr>
+              <w:t xml:space="preserve">I think </w:t>
+            </w:r>
+            <w:r>
+              <w:rPr>
+                <w:color w:val="000000" w:themeColor="text1"/>
+                <w:sz w:val="18"/>
+                <w:szCs w:val="18"/>
+              </w:rPr>
+              <w:t xml:space="preserve">Views must read only curated tables, so change it to "no delivery, i.e. </w:t>
+            </w:r>
+            <w:proofErr w:type="spellStart"/>
+            <w:r>
+              <w:rPr>
+                <w:color w:val="000000" w:themeColor="text1"/>
+                <w:sz w:val="18"/>
+                <w:szCs w:val="18"/>
+              </w:rPr>
+              <w:lastRenderedPageBreak/>
+              <w:t>fact_lab_</w:t>
+            </w:r>
+            <w:proofErr w:type="gramStart"/>
+            <w:r>
+              <w:rPr>
+                <w:color w:val="000000" w:themeColor="text1"/>
+                <w:sz w:val="18"/>
+                <w:szCs w:val="18"/>
+              </w:rPr>
+              <w:t>result.result</w:t>
+            </w:r>
+            <w:proofErr w:type="gramEnd"/>
+            <w:r>
+              <w:rPr>
+                <w:color w:val="000000" w:themeColor="text1"/>
+                <w:sz w:val="18"/>
+                <w:szCs w:val="18"/>
+              </w:rPr>
+              <w:t>_returned_flag</w:t>
+            </w:r>
+            <w:proofErr w:type="spellEnd"/>
+            <w:r>
+              <w:rPr>
+                <w:color w:val="000000" w:themeColor="text1"/>
+                <w:sz w:val="18"/>
+                <w:szCs w:val="18"/>
+              </w:rPr>
+              <w:t xml:space="preserve"> = false".</w:t>
+            </w:r>
+          </w:p>
+          <w:p>
+            <w:pPr>
+              <w:pStyle w:val="ListParagraph"/>
+              <w:numPr>
+                <w:ilvl w:val="0"/>
+                <w:numId w:val="2"/>
+              </w:numPr>
+              <w:spacing w:after="20"/>
+              <w:ind w:left="208" w:hanging="208"/>
+              <w:rPr>
+                <w:color w:val="000000" w:themeColor="text1"/>
+              </w:rPr>
+            </w:pPr>
+            <w:r>
+              <w:rPr>
+                <w:color w:val="000000" w:themeColor="text1"/>
+                <w:sz w:val="18"/>
+                <w:szCs w:val="18"/>
+              </w:rPr>
+              <w:t xml:space="preserve">Add one identity row: a golden patient is a row of </w:t>
+            </w:r>
+            <w:proofErr w:type="spellStart"/>
+            <w:proofErr w:type="gramStart"/>
+            <w:r>
+              <w:rPr>
+                <w:color w:val="000000" w:themeColor="text1"/>
+                <w:sz w:val="18"/>
+                <w:szCs w:val="18"/>
+              </w:rPr>
+              <w:t>cleansed.patient</w:t>
+            </w:r>
+            <w:proofErr w:type="gramEnd"/>
+            <w:r>
+              <w:rPr>
+                <w:color w:val="000000" w:themeColor="text1"/>
+                <w:sz w:val="18"/>
+                <w:szCs w:val="18"/>
+              </w:rPr>
+              <w:t>_master</w:t>
+            </w:r>
+            <w:proofErr w:type="spellEnd"/>
+            <w:r>
+              <w:rPr>
+                <w:color w:val="000000" w:themeColor="text1"/>
+                <w:sz w:val="18"/>
+                <w:szCs w:val="18"/>
+              </w:rPr>
+              <w:t xml:space="preserve">, built    only from GP records (18 GP records → 17 masters; GP-0008 and GP-0009 are one person). Every GP record is LINKED to its own master with </w:t>
+            </w:r>
+            <w:proofErr w:type="spellStart"/>
+            <w:r>
+              <w:rPr>
+                <w:color w:val="000000" w:themeColor="text1"/>
+                <w:sz w:val="18"/>
+                <w:szCs w:val="18"/>
+              </w:rPr>
+              <w:t>match_rule</w:t>
+            </w:r>
+            <w:proofErr w:type="spellEnd"/>
+            <w:r>
+              <w:rPr>
+                <w:color w:val="000000" w:themeColor="text1"/>
+                <w:sz w:val="18"/>
+                <w:szCs w:val="18"/>
+              </w:rPr>
+              <w:t xml:space="preserve"> 'GP'. Lab and pharmacy</w:t>
+            </w:r>
+            <w:r>
+              <w:rPr>
+                <w:color w:val="000000" w:themeColor="text1"/>
+                <w:sz w:val="18"/>
+                <w:szCs w:val="18"/>
+              </w:rPr>
+              <w:t xml:space="preserve"> </w:t>
+            </w:r>
+            <w:r>
+              <w:rPr>
+                <w:color w:val="000000" w:themeColor="text1"/>
+                <w:sz w:val="18"/>
+                <w:szCs w:val="18"/>
+              </w:rPr>
+              <w:t>records are linked by R1 (same 10-digit Medicare) or R2 (same dob, family name and first</w:t>
+            </w:r>
+            <w:r>
+              <w:rPr>
+                <w:color w:val="000000" w:themeColor="text1"/>
+                <w:sz w:val="18"/>
+                <w:szCs w:val="18"/>
+              </w:rPr>
+              <w:t xml:space="preserve"> </w:t>
+            </w:r>
+            <w:r>
+              <w:rPr>
+                <w:color w:val="000000" w:themeColor="text1"/>
+                <w:sz w:val="18"/>
+                <w:szCs w:val="18"/>
+              </w:rPr>
+              <w:t xml:space="preserve">letter of given name, Medicare not conflicting); </w:t>
+            </w:r>
+            <w:proofErr w:type="spellStart"/>
+            <w:r>
+              <w:rPr>
+                <w:color w:val="000000" w:themeColor="text1"/>
+                <w:sz w:val="18"/>
+                <w:szCs w:val="18"/>
+              </w:rPr>
+              <w:t>match_rule</w:t>
+            </w:r>
+            <w:proofErr w:type="spellEnd"/>
+            <w:r>
+              <w:rPr>
+                <w:color w:val="000000" w:themeColor="text1"/>
+                <w:sz w:val="18"/>
+                <w:szCs w:val="18"/>
+              </w:rPr>
+              <w:t xml:space="preserve"> is R1 or R2, and NULL for</w:t>
+            </w:r>
+            <w:r>
+              <w:rPr>
+                <w:color w:val="000000" w:themeColor="text1"/>
+                <w:sz w:val="18"/>
+                <w:szCs w:val="18"/>
+              </w:rPr>
+              <w:t xml:space="preserve"> </w:t>
+            </w:r>
+            <w:r>
+              <w:rPr>
+                <w:color w:val="000000" w:themeColor="text1"/>
+                <w:sz w:val="18"/>
+                <w:szCs w:val="18"/>
+              </w:rPr>
+              <w:t>REVIEW and UNMATCHED. A lab or pharmacy record contributes to a use case only when</w:t>
+            </w:r>
+            <w:r>
+              <w:rPr>
+                <w:color w:val="000000" w:themeColor="text1"/>
+                <w:sz w:val="18"/>
+                <w:szCs w:val="18"/>
+              </w:rPr>
+              <w:t xml:space="preserve"> </w:t>
+            </w:r>
+            <w:r>
+              <w:rPr>
+                <w:color w:val="000000" w:themeColor="text1"/>
+                <w:sz w:val="18"/>
+                <w:szCs w:val="18"/>
+              </w:rPr>
+              <w:t xml:space="preserve">LINKED. Note P06 Daniel Nguyen is still a golden patient (NO_TEST_ON_RECORD) even though   PATH0006 is REVIEW – the current wording "golden patients, i.e. source records with </w:t>
+            </w:r>
+            <w:proofErr w:type="spellStart"/>
+            <w:r>
+              <w:rPr>
+                <w:color w:val="000000" w:themeColor="text1"/>
+                <w:sz w:val="18"/>
+                <w:szCs w:val="18"/>
+              </w:rPr>
+              <w:t>match_status</w:t>
+            </w:r>
+            <w:proofErr w:type="spellEnd"/>
+            <w:r>
+              <w:rPr>
+                <w:color w:val="000000" w:themeColor="text1"/>
+                <w:sz w:val="18"/>
+                <w:szCs w:val="18"/>
+              </w:rPr>
+              <w:t xml:space="preserve"> LINKED" reads as if he is dropped.</w:t>
+            </w:r>
+          </w:p>
+        </w:tc>
+        <w:tc>
+          <w:tcPr>
+            <w:tcW w:w="1461" w:type="dxa"/>
+            <w:tcBorders>
+              <w:top w:val="single" w:sz="4" w:space="0" w:color="BFC5CE"/>
+              <w:left w:val="single" w:sz="4" w:space="0" w:color="BFC5CE"/>
+              <w:bottom w:val="single" w:sz="4" w:space="0" w:color="BFC5CE"/>
+              <w:right w:val="single" w:sz="4" w:space="0" w:color="BFC5CE"/>
+            </w:tcBorders>
+            <w:tcMar>
+              <w:top w:w="50" w:type="dxa"/>
+              <w:left w:w="80" w:type="dxa"/>
+              <w:bottom w:w="50" w:type="dxa"/>
+              <w:right w:w="80" w:type="dxa"/>
+            </w:tcMar>
+          </w:tcPr>
+          <w:p>
+            <w:pPr>
+              <w:spacing w:after="20"/>
+              <w:rPr>
+                <w:color w:val="000000" w:themeColor="text1"/>
+              </w:rPr>
+            </w:pPr>
+            <w:r>
+              <w:rPr>
+                <w:color w:val="000000" w:themeColor="text1"/>
+              </w:rPr>
+              <w:lastRenderedPageBreak/>
+              <w:t>07/10/2026</w:t>
+            </w:r>
           </w:p>
         </w:tc>
       </w:tr>
@@ -5852,7 +5884,6 @@
       <w:pPr>
         <w:spacing w:after="100"/>
         <w:rPr>
-          <w:rFonts w:hint="eastAsia"/>
           <w:color w:val="000000" w:themeColor="text1"/>
         </w:rPr>
       </w:pPr>
@@ -5869,7 +5900,7 @@
 </file>
 
 <file path=word/endnotes.xml><?xml version="1.0" encoding="utf-8"?>
-<w:endnotes xmlns:wpc="http://schemas.microsoft.com/office/word/2010/wordprocessingCanvas" xmlns:cx="http://schemas.microsoft.com/office/drawing/2014/chartex" xmlns:cx1="http://schemas.microsoft.com/office/drawing/2015/9/8/chartex" xmlns:cx2="http://schemas.microsoft.com/office/drawing/2015/10/21/chartex" xmlns:cx3="http://schemas.microsoft.com/office/drawing/2016/5/9/chartex" xmlns:cx4="http://schemas.microsoft.com/office/drawing/2016/5/10/chartex" xmlns:cx5="http://schemas.microsoft.com/office/drawing/2016/5/11/chartex" xmlns:cx6="http://schemas.microsoft.com/office/drawing/2016/5/12/chartex" xmlns:cx7="http://schemas.microsoft.com/office/drawing/2016/5/13/chartex" xmlns:cx8="http://schemas.microsoft.com/office/drawing/2016/5/14/chartex" xmlns:mc="http://schemas.openxmlformats.org/markup-compatibility/2006" xmlns:aink="http://schemas.microsoft.com/office/drawing/2016/ink" xmlns:am3d="http://schemas.microsoft.com/office/drawing/2017/model3d" xmlns:o="urn:schemas-microsoft-com:office:office" xmlns:oel="http://schemas.microsoft.com/office/2019/extlst" xmlns:r="http://schemas.openxmlformats.org/officeDocument/2006/relationships" xmlns:m="http://schemas.openxmlformats.org/officeDocument/2006/math" xmlns:v="urn:schemas-microsoft-com:vml" xmlns:wp14="http://schemas.microsoft.com/office/word/2010/wordprocessingDrawing" xmlns:wp="http://schemas.openxmlformats.org/drawingml/2006/wordprocessingDrawing" xmlns:w10="urn:schemas-microsoft-com:office:word" xmlns:w="http://schemas.openxmlformats.org/wordprocessingml/2006/main" xmlns:w14="http://schemas.microsoft.com/office/word/2010/wordml" xmlns:w15="http://schemas.microsoft.com/office/word/2012/wordml" xmlns:w16cex="http://schemas.microsoft.com/office/word/2018/wordml/cex" xmlns:w16cid="http://schemas.microsoft.com/office/word/2016/wordml/cid" xmlns:w16="http://schemas.microsoft.com/office/word/2018/wordml" xmlns:w16du="http://schemas.microsoft.com/office/word/2023/wordml/word16du" xmlns:w16sdtdh="http://schemas.microsoft.com/office/word/2020/wordml/sdtdatahash" xmlns:w16sdtfl="http://schemas.microsoft.com/office/word/2024/wordml/sdtformatlock" xmlns:w16se="http://schemas.microsoft.com/office/word/2015/wordml/symex" xmlns:wpg="http://schemas.microsoft.com/office/word/2010/wordprocessingGroup" xmlns:wpi="http://schemas.microsoft.com/office/word/2010/wordprocessingInk" xmlns:wne="http://schemas.microsoft.com/office/word/2006/wordml" xmlns:wps="http://schemas.microsoft.com/office/word/2010/wordprocessingShape" mc:Ignorable="w14 w15 w16se w16cid w16 w16cex w16sdtdh w16sdtfl w16du wp14">
+<w:endnotes xmlns:wpc="http://schemas.microsoft.com/office/word/2010/wordprocessingCanvas" xmlns:cx="http://schemas.microsoft.com/office/drawing/2014/chartex" xmlns:cx1="http://schemas.microsoft.com/office/drawing/2015/9/8/chartex" xmlns:cx2="http://schemas.microsoft.com/office/drawing/2015/10/21/chartex" xmlns:cx3="http://schemas.microsoft.com/office/drawing/2016/5/9/chartex" xmlns:cx4="http://schemas.microsoft.com/office/drawing/2016/5/10/chartex" xmlns:cx5="http://schemas.microsoft.com/office/drawing/2016/5/11/chartex" xmlns:cx6="http://schemas.microsoft.com/office/drawing/2016/5/12/chartex" xmlns:cx7="http://schemas.microsoft.com/office/drawing/2016/5/13/chartex" xmlns:cx8="http://schemas.microsoft.com/office/drawing/2016/5/14/chartex" xmlns:mc="http://schemas.openxmlformats.org/markup-compatibility/2006" xmlns:m="http://schemas.openxmlformats.org/officeDocument/2006/math" xmlns:aink="http://schemas.microsoft.com/office/drawing/2016/ink" xmlns:am3d="http://schemas.microsoft.com/office/drawing/2017/model3d" xmlns:oel="http://schemas.microsoft.com/office/2019/extlst" xmlns:r="http://schemas.openxmlformats.org/officeDocument/2006/relationships" xmlns:wp14="http://schemas.microsoft.com/office/word/2010/wordprocessingDrawing" xmlns:wp="http://schemas.openxmlformats.org/drawingml/2006/wordprocessingDrawing" xmlns:wpg="http://schemas.microsoft.com/office/word/2010/wordprocessingGroup" xmlns:wpi="http://schemas.microsoft.com/office/word/2010/wordprocessingInk" xmlns:wps="http://schemas.microsoft.com/office/word/2010/wordprocessingShape" xmlns:o="urn:schemas-microsoft-com:office:office" xmlns:v="urn:schemas-microsoft-com:vml" xmlns:w10="urn:schemas-microsoft-com:office:word" xmlns:w="http://schemas.openxmlformats.org/wordprocessingml/2006/main" xmlns:w14="http://schemas.microsoft.com/office/word/2010/wordml" xmlns:w15="http://schemas.microsoft.com/office/word/2012/wordml" xmlns:w16cex="http://schemas.microsoft.com/office/word/2018/wordml/cex" xmlns:w16cid="http://schemas.microsoft.com/office/word/2016/wordml/cid" xmlns:w16="http://schemas.microsoft.com/office/word/2018/wordml" xmlns:w16sdtdh="http://schemas.microsoft.com/office/word/2020/wordml/sdtdatahash" xmlns:w16sdtfl="http://schemas.microsoft.com/office/word/2024/wordml/sdtformatlock" xmlns:w16se="http://schemas.microsoft.com/office/word/2015/wordml/symex" xmlns:w16du="http://schemas.microsoft.com/office/word/2023/wordml/word16du" xmlns:wne="http://schemas.microsoft.com/office/word/2006/wordml" mc:Ignorable="w14 w15 w16se w16cid w16 w16cex w16sdtdh w16sdtfl w16du wp14">
   <w:endnote w:type="separator" w:id="-1">
     <w:p>
       <w:r>
@@ -5888,7 +5919,7 @@
 </file>
 
 <file path=word/footer1.xml><?xml version="1.0" encoding="utf-8"?>
-<w:ftr xmlns:wpc="http://schemas.microsoft.com/office/word/2010/wordprocessingCanvas" xmlns:cx="http://schemas.microsoft.com/office/drawing/2014/chartex" xmlns:cx1="http://schemas.microsoft.com/office/drawing/2015/9/8/chartex" xmlns:cx2="http://schemas.microsoft.com/office/drawing/2015/10/21/chartex" xmlns:cx3="http://schemas.microsoft.com/office/drawing/2016/5/9/chartex" xmlns:cx4="http://schemas.microsoft.com/office/drawing/2016/5/10/chartex" xmlns:cx5="http://schemas.microsoft.com/office/drawing/2016/5/11/chartex" xmlns:cx6="http://schemas.microsoft.com/office/drawing/2016/5/12/chartex" xmlns:cx7="http://schemas.microsoft.com/office/drawing/2016/5/13/chartex" xmlns:cx8="http://schemas.microsoft.com/office/drawing/2016/5/14/chartex" xmlns:mc="http://schemas.openxmlformats.org/markup-compatibility/2006" xmlns:aink="http://schemas.microsoft.com/office/drawing/2016/ink" xmlns:am3d="http://schemas.microsoft.com/office/drawing/2017/model3d" xmlns:o="urn:schemas-microsoft-com:office:office" xmlns:oel="http://schemas.microsoft.com/office/2019/extlst" xmlns:r="http://schemas.openxmlformats.org/officeDocument/2006/relationships" xmlns:m="http://schemas.openxmlformats.org/officeDocument/2006/math" xmlns:v="urn:schemas-microsoft-com:vml" xmlns:wp14="http://schemas.microsoft.com/office/word/2010/wordprocessingDrawing" xmlns:wp="http://schemas.openxmlformats.org/drawingml/2006/wordprocessingDrawing" xmlns:w10="urn:schemas-microsoft-com:office:word" xmlns:w="http://schemas.openxmlformats.org/wordprocessingml/2006/main" xmlns:w14="http://schemas.microsoft.com/office/word/2010/wordml" xmlns:w15="http://schemas.microsoft.com/office/word/2012/wordml" xmlns:w16cex="http://schemas.microsoft.com/office/word/2018/wordml/cex" xmlns:w16cid="http://schemas.microsoft.com/office/word/2016/wordml/cid" xmlns:w16="http://schemas.microsoft.com/office/word/2018/wordml" xmlns:w16du="http://schemas.microsoft.com/office/word/2023/wordml/word16du" xmlns:w16sdtdh="http://schemas.microsoft.com/office/word/2020/wordml/sdtdatahash" xmlns:w16sdtfl="http://schemas.microsoft.com/office/word/2024/wordml/sdtformatlock" xmlns:w16se="http://schemas.microsoft.com/office/word/2015/wordml/symex" xmlns:wpg="http://schemas.microsoft.com/office/word/2010/wordprocessingGroup" xmlns:wpi="http://schemas.microsoft.com/office/word/2010/wordprocessingInk" xmlns:wne="http://schemas.microsoft.com/office/word/2006/wordml" xmlns:wps="http://schemas.microsoft.com/office/word/2010/wordprocessingShape" mc:Ignorable="w14 w15 w16se w16cid w16 w16cex w16sdtdh w16sdtfl w16du wp14">
+<w:ftr xmlns:wpc="http://schemas.microsoft.com/office/word/2010/wordprocessingCanvas" xmlns:cx="http://schemas.microsoft.com/office/drawing/2014/chartex" xmlns:cx1="http://schemas.microsoft.com/office/drawing/2015/9/8/chartex" xmlns:cx2="http://schemas.microsoft.com/office/drawing/2015/10/21/chartex" xmlns:cx3="http://schemas.microsoft.com/office/drawing/2016/5/9/chartex" xmlns:cx4="http://schemas.microsoft.com/office/drawing/2016/5/10/chartex" xmlns:cx5="http://schemas.microsoft.com/office/drawing/2016/5/11/chartex" xmlns:cx6="http://schemas.microsoft.com/office/drawing/2016/5/12/chartex" xmlns:cx7="http://schemas.microsoft.com/office/drawing/2016/5/13/chartex" xmlns:cx8="http://schemas.microsoft.com/office/drawing/2016/5/14/chartex" xmlns:mc="http://schemas.openxmlformats.org/markup-compatibility/2006" xmlns:m="http://schemas.openxmlformats.org/officeDocument/2006/math" xmlns:aink="http://schemas.microsoft.com/office/drawing/2016/ink" xmlns:am3d="http://schemas.microsoft.com/office/drawing/2017/model3d" xmlns:oel="http://schemas.microsoft.com/office/2019/extlst" xmlns:r="http://schemas.openxmlformats.org/officeDocument/2006/relationships" xmlns:wp14="http://schemas.microsoft.com/office/word/2010/wordprocessingDrawing" xmlns:wp="http://schemas.openxmlformats.org/drawingml/2006/wordprocessingDrawing" xmlns:wpg="http://schemas.microsoft.com/office/word/2010/wordprocessingGroup" xmlns:wpi="http://schemas.microsoft.com/office/word/2010/wordprocessingInk" xmlns:wps="http://schemas.microsoft.com/office/word/2010/wordprocessingShape" xmlns:o="urn:schemas-microsoft-com:office:office" xmlns:v="urn:schemas-microsoft-com:vml" xmlns:w10="urn:schemas-microsoft-com:office:word" xmlns:w="http://schemas.openxmlformats.org/wordprocessingml/2006/main" xmlns:w14="http://schemas.microsoft.com/office/word/2010/wordml" xmlns:w15="http://schemas.microsoft.com/office/word/2012/wordml" xmlns:w16cex="http://schemas.microsoft.com/office/word/2018/wordml/cex" xmlns:w16cid="http://schemas.microsoft.com/office/word/2016/wordml/cid" xmlns:w16="http://schemas.microsoft.com/office/word/2018/wordml" xmlns:w16sdtdh="http://schemas.microsoft.com/office/word/2020/wordml/sdtdatahash" xmlns:w16sdtfl="http://schemas.microsoft.com/office/word/2024/wordml/sdtformatlock" xmlns:w16se="http://schemas.microsoft.com/office/word/2015/wordml/symex" xmlns:w16du="http://schemas.microsoft.com/office/word/2023/wordml/word16du" xmlns:wne="http://schemas.microsoft.com/office/word/2006/wordml" mc:Ignorable="w14 w15 w16se w16cid w16 w16cex w16sdtdh w16sdtfl w16du wp14">
   <w:p>
     <w:pPr>
       <w:jc w:val="right"/>
@@ -5983,7 +6014,7 @@
 </file>
 
 <file path=word/footnotes.xml><?xml version="1.0" encoding="utf-8"?>
-<w:footnotes xmlns:wpc="http://schemas.microsoft.com/office/word/2010/wordprocessingCanvas" xmlns:cx="http://schemas.microsoft.com/office/drawing/2014/chartex" xmlns:cx1="http://schemas.microsoft.com/office/drawing/2015/9/8/chartex" xmlns:cx2="http://schemas.microsoft.com/office/drawing/2015/10/21/chartex" xmlns:cx3="http://schemas.microsoft.com/office/drawing/2016/5/9/chartex" xmlns:cx4="http://schemas.microsoft.com/office/drawing/2016/5/10/chartex" xmlns:cx5="http://schemas.microsoft.com/office/drawing/2016/5/11/chartex" xmlns:cx6="http://schemas.microsoft.com/office/drawing/2016/5/12/chartex" xmlns:cx7="http://schemas.microsoft.com/office/drawing/2016/5/13/chartex" xmlns:cx8="http://schemas.microsoft.com/office/drawing/2016/5/14/chartex" xmlns:mc="http://schemas.openxmlformats.org/markup-compatibility/2006" xmlns:aink="http://schemas.microsoft.com/office/drawing/2016/ink" xmlns:am3d="http://schemas.microsoft.com/office/drawing/2017/model3d" xmlns:o="urn:schemas-microsoft-com:office:office" xmlns:oel="http://schemas.microsoft.com/office/2019/extlst" xmlns:r="http://schemas.openxmlformats.org/officeDocument/2006/relationships" xmlns:m="http://schemas.openxmlformats.org/officeDocument/2006/math" xmlns:v="urn:schemas-microsoft-com:vml" xmlns:wp14="http://schemas.microsoft.com/office/word/2010/wordprocessingDrawing" xmlns:wp="http://schemas.openxmlformats.org/drawingml/2006/wordprocessingDrawing" xmlns:w10="urn:schemas-microsoft-com:office:word" xmlns:w="http://schemas.openxmlformats.org/wordprocessingml/2006/main" xmlns:w14="http://schemas.microsoft.com/office/word/2010/wordml" xmlns:w15="http://schemas.microsoft.com/office/word/2012/wordml" xmlns:w16cex="http://schemas.microsoft.com/office/word/2018/wordml/cex" xmlns:w16cid="http://schemas.microsoft.com/office/word/2016/wordml/cid" xmlns:w16="http://schemas.microsoft.com/office/word/2018/wordml" xmlns:w16du="http://schemas.microsoft.com/office/word/2023/wordml/word16du" xmlns:w16sdtdh="http://schemas.microsoft.com/office/word/2020/wordml/sdtdatahash" xmlns:w16sdtfl="http://schemas.microsoft.com/office/word/2024/wordml/sdtformatlock" xmlns:w16se="http://schemas.microsoft.com/office/word/2015/wordml/symex" xmlns:wpg="http://schemas.microsoft.com/office/word/2010/wordprocessingGroup" xmlns:wpi="http://schemas.microsoft.com/office/word/2010/wordprocessingInk" xmlns:wne="http://schemas.microsoft.com/office/word/2006/wordml" xmlns:wps="http://schemas.microsoft.com/office/word/2010/wordprocessingShape" mc:Ignorable="w14 w15 w16se w16cid w16 w16cex w16sdtdh w16sdtfl w16du wp14">
+<w:footnotes xmlns:wpc="http://schemas.microsoft.com/office/word/2010/wordprocessingCanvas" xmlns:cx="http://schemas.microsoft.com/office/drawing/2014/chartex" xmlns:cx1="http://schemas.microsoft.com/office/drawing/2015/9/8/chartex" xmlns:cx2="http://schemas.microsoft.com/office/drawing/2015/10/21/chartex" xmlns:cx3="http://schemas.microsoft.com/office/drawing/2016/5/9/chartex" xmlns:cx4="http://schemas.microsoft.com/office/drawing/2016/5/10/chartex" xmlns:cx5="http://schemas.microsoft.com/office/drawing/2016/5/11/chartex" xmlns:cx6="http://schemas.microsoft.com/office/drawing/2016/5/12/chartex" xmlns:cx7="http://schemas.microsoft.com/office/drawing/2016/5/13/chartex" xmlns:cx8="http://schemas.microsoft.com/office/drawing/2016/5/14/chartex" xmlns:mc="http://schemas.openxmlformats.org/markup-compatibility/2006" xmlns:m="http://schemas.openxmlformats.org/officeDocument/2006/math" xmlns:aink="http://schemas.microsoft.com/office/drawing/2016/ink" xmlns:am3d="http://schemas.microsoft.com/office/drawing/2017/model3d" xmlns:oel="http://schemas.microsoft.com/office/2019/extlst" xmlns:r="http://schemas.openxmlformats.org/officeDocument/2006/relationships" xmlns:wp14="http://schemas.microsoft.com/office/word/2010/wordprocessingDrawing" xmlns:wp="http://schemas.openxmlformats.org/drawingml/2006/wordprocessingDrawing" xmlns:wpg="http://schemas.microsoft.com/office/word/2010/wordprocessingGroup" xmlns:wpi="http://schemas.microsoft.com/office/word/2010/wordprocessingInk" xmlns:wps="http://schemas.microsoft.com/office/word/2010/wordprocessingShape" xmlns:o="urn:schemas-microsoft-com:office:office" xmlns:v="urn:schemas-microsoft-com:vml" xmlns:w10="urn:schemas-microsoft-com:office:word" xmlns:w="http://schemas.openxmlformats.org/wordprocessingml/2006/main" xmlns:w14="http://schemas.microsoft.com/office/word/2010/wordml" xmlns:w15="http://schemas.microsoft.com/office/word/2012/wordml" xmlns:w16cex="http://schemas.microsoft.com/office/word/2018/wordml/cex" xmlns:w16cid="http://schemas.microsoft.com/office/word/2016/wordml/cid" xmlns:w16="http://schemas.microsoft.com/office/word/2018/wordml" xmlns:w16sdtdh="http://schemas.microsoft.com/office/word/2020/wordml/sdtdatahash" xmlns:w16sdtfl="http://schemas.microsoft.com/office/word/2024/wordml/sdtformatlock" xmlns:w16se="http://schemas.microsoft.com/office/word/2015/wordml/symex" xmlns:w16du="http://schemas.microsoft.com/office/word/2023/wordml/word16du" xmlns:wne="http://schemas.microsoft.com/office/word/2006/wordml" mc:Ignorable="w14 w15 w16se w16cid w16 w16cex w16sdtdh w16sdtfl w16du wp14">
   <w:footnote w:type="separator" w:id="-1">
     <w:p>
       <w:r>
@@ -6002,8 +6033,97 @@
 </file>
 
 <file path=word/numbering.xml><?xml version="1.0" encoding="utf-8"?>
-<w:numbering xmlns:wpc="http://schemas.microsoft.com/office/word/2010/wordprocessingCanvas" xmlns:cx="http://schemas.microsoft.com/office/drawing/2014/chartex" xmlns:cx1="http://schemas.microsoft.com/office/drawing/2015/9/8/chartex" xmlns:cx2="http://schemas.microsoft.com/office/drawing/2015/10/21/chartex" xmlns:cx3="http://schemas.microsoft.com/office/drawing/2016/5/9/chartex" xmlns:cx4="http://schemas.microsoft.com/office/drawing/2016/5/10/chartex" xmlns:cx5="http://schemas.microsoft.com/office/drawing/2016/5/11/chartex" xmlns:cx6="http://schemas.microsoft.com/office/drawing/2016/5/12/chartex" xmlns:cx7="http://schemas.microsoft.com/office/drawing/2016/5/13/chartex" xmlns:cx8="http://schemas.microsoft.com/office/drawing/2016/5/14/chartex" xmlns:mc="http://schemas.openxmlformats.org/markup-compatibility/2006" xmlns:aink="http://schemas.microsoft.com/office/drawing/2016/ink" xmlns:am3d="http://schemas.microsoft.com/office/drawing/2017/model3d" xmlns:o="urn:schemas-microsoft-com:office:office" xmlns:oel="http://schemas.microsoft.com/office/2019/extlst" xmlns:r="http://schemas.openxmlformats.org/officeDocument/2006/relationships" xmlns:m="http://schemas.openxmlformats.org/officeDocument/2006/math" xmlns:v="urn:schemas-microsoft-com:vml" xmlns:wp14="http://schemas.microsoft.com/office/word/2010/wordprocessingDrawing" xmlns:wp="http://schemas.openxmlformats.org/drawingml/2006/wordprocessingDrawing" xmlns:w10="urn:schemas-microsoft-com:office:word" xmlns:w="http://schemas.openxmlformats.org/wordprocessingml/2006/main" xmlns:w14="http://schemas.microsoft.com/office/word/2010/wordml" xmlns:w15="http://schemas.microsoft.com/office/word/2012/wordml" xmlns:w16cex="http://schemas.microsoft.com/office/word/2018/wordml/cex" xmlns:w16cid="http://schemas.microsoft.com/office/word/2016/wordml/cid" xmlns:w16="http://schemas.microsoft.com/office/word/2018/wordml" xmlns:w16du="http://schemas.microsoft.com/office/word/2023/wordml/word16du" xmlns:w16sdtdh="http://schemas.microsoft.com/office/word/2020/wordml/sdtdatahash" xmlns:w16sdtfl="http://schemas.microsoft.com/office/word/2024/wordml/sdtformatlock" xmlns:w16se="http://schemas.microsoft.com/office/word/2015/wordml/symex" xmlns:wpg="http://schemas.microsoft.com/office/word/2010/wordprocessingGroup" xmlns:wpi="http://schemas.microsoft.com/office/word/2010/wordprocessingInk" xmlns:wne="http://schemas.microsoft.com/office/word/2006/wordml" xmlns:wps="http://schemas.microsoft.com/office/word/2010/wordprocessingShape" mc:Ignorable="w14 w15 w16se w16cid w16 w16cex w16sdtdh w16sdtfl w16du wp14">
+<w:numbering xmlns:wpc="http://schemas.microsoft.com/office/word/2010/wordprocessingCanvas" xmlns:cx="http://schemas.microsoft.com/office/drawing/2014/chartex" xmlns:cx1="http://schemas.microsoft.com/office/drawing/2015/9/8/chartex" xmlns:cx2="http://schemas.microsoft.com/office/drawing/2015/10/21/chartex" xmlns:cx3="http://schemas.microsoft.com/office/drawing/2016/5/9/chartex" xmlns:cx4="http://schemas.microsoft.com/office/drawing/2016/5/10/chartex" xmlns:cx5="http://schemas.microsoft.com/office/drawing/2016/5/11/chartex" xmlns:cx6="http://schemas.microsoft.com/office/drawing/2016/5/12/chartex" xmlns:cx7="http://schemas.microsoft.com/office/drawing/2016/5/13/chartex" xmlns:cx8="http://schemas.microsoft.com/office/drawing/2016/5/14/chartex" xmlns:mc="http://schemas.openxmlformats.org/markup-compatibility/2006" xmlns:m="http://schemas.openxmlformats.org/officeDocument/2006/math" xmlns:aink="http://schemas.microsoft.com/office/drawing/2016/ink" xmlns:am3d="http://schemas.microsoft.com/office/drawing/2017/model3d" xmlns:oel="http://schemas.microsoft.com/office/2019/extlst" xmlns:r="http://schemas.openxmlformats.org/officeDocument/2006/relationships" xmlns:wp14="http://schemas.microsoft.com/office/word/2010/wordprocessingDrawing" xmlns:wp="http://schemas.openxmlformats.org/drawingml/2006/wordprocessingDrawing" xmlns:wpg="http://schemas.microsoft.com/office/word/2010/wordprocessingGroup" xmlns:wpi="http://schemas.microsoft.com/office/word/2010/wordprocessingInk" xmlns:wps="http://schemas.microsoft.com/office/word/2010/wordprocessingShape" xmlns:o="urn:schemas-microsoft-com:office:office" xmlns:v="urn:schemas-microsoft-com:vml" xmlns:w10="urn:schemas-microsoft-com:office:word" xmlns:w="http://schemas.openxmlformats.org/wordprocessingml/2006/main" xmlns:w14="http://schemas.microsoft.com/office/word/2010/wordml" xmlns:w15="http://schemas.microsoft.com/office/word/2012/wordml" xmlns:w16cex="http://schemas.microsoft.com/office/word/2018/wordml/cex" xmlns:w16cid="http://schemas.microsoft.com/office/word/2016/wordml/cid" xmlns:w16="http://schemas.microsoft.com/office/word/2018/wordml" xmlns:w16sdtdh="http://schemas.microsoft.com/office/word/2020/wordml/sdtdatahash" xmlns:w16sdtfl="http://schemas.microsoft.com/office/word/2024/wordml/sdtformatlock" xmlns:w16se="http://schemas.microsoft.com/office/word/2015/wordml/symex" xmlns:w16du="http://schemas.microsoft.com/office/word/2023/wordml/word16du" xmlns:wne="http://schemas.microsoft.com/office/word/2006/wordml" mc:Ignorable="w14 w15 w16se w16cid w16 w16cex w16sdtdh w16sdtfl w16du wp14">
   <w:abstractNum w:abstractNumId="0" w15:restartNumberingAfterBreak="0">
+    <w:nsid w:val="260A082B"/>
+    <w:multiLevelType w:val="hybridMultilevel"/>
+    <w:tmpl w:val="DF66D018"/>
+    <w:lvl w:ilvl="0" w:tplc="0809000F">
+      <w:start w:val="1"/>
+      <w:numFmt w:val="decimal"/>
+      <w:lvlText w:val="%1."/>
+      <w:lvlJc w:val="left"/>
+      <w:pPr>
+        <w:ind w:left="720" w:hanging="360"/>
+      </w:pPr>
+      <w:rPr>
+        <w:rFonts w:hint="default"/>
+      </w:rPr>
+    </w:lvl>
+    <w:lvl w:ilvl="1" w:tplc="08090019" w:tentative="1">
+      <w:start w:val="1"/>
+      <w:numFmt w:val="lowerLetter"/>
+      <w:lvlText w:val="%2."/>
+      <w:lvlJc w:val="left"/>
+      <w:pPr>
+        <w:ind w:left="1440" w:hanging="360"/>
+      </w:pPr>
+    </w:lvl>
+    <w:lvl w:ilvl="2" w:tplc="0809001B" w:tentative="1">
+      <w:start w:val="1"/>
+      <w:numFmt w:val="lowerRoman"/>
+      <w:lvlText w:val="%3."/>
+      <w:lvlJc w:val="right"/>
+      <w:pPr>
+        <w:ind w:left="2160" w:hanging="180"/>
+      </w:pPr>
+    </w:lvl>
+    <w:lvl w:ilvl="3" w:tplc="0809000F" w:tentative="1">
+      <w:start w:val="1"/>
+      <w:numFmt w:val="decimal"/>
+      <w:lvlText w:val="%4."/>
+      <w:lvlJc w:val="left"/>
+      <w:pPr>
+        <w:ind w:left="2880" w:hanging="360"/>
+      </w:pPr>
+    </w:lvl>
+    <w:lvl w:ilvl="4" w:tplc="08090019" w:tentative="1">
+      <w:start w:val="1"/>
+      <w:numFmt w:val="lowerLetter"/>
+      <w:lvlText w:val="%5."/>
+      <w:lvlJc w:val="left"/>
+      <w:pPr>
+        <w:ind w:left="3600" w:hanging="360"/>
+      </w:pPr>
+    </w:lvl>
+    <w:lvl w:ilvl="5" w:tplc="0809001B" w:tentative="1">
+      <w:start w:val="1"/>
+      <w:numFmt w:val="lowerRoman"/>
+      <w:lvlText w:val="%6."/>
+      <w:lvlJc w:val="right"/>
+      <w:pPr>
+        <w:ind w:left="4320" w:hanging="180"/>
+      </w:pPr>
+    </w:lvl>
+    <w:lvl w:ilvl="6" w:tplc="0809000F" w:tentative="1">
+      <w:start w:val="1"/>
+      <w:numFmt w:val="decimal"/>
+      <w:lvlText w:val="%7."/>
+      <w:lvlJc w:val="left"/>
+      <w:pPr>
+        <w:ind w:left="5040" w:hanging="360"/>
+      </w:pPr>
+    </w:lvl>
+    <w:lvl w:ilvl="7" w:tplc="08090019" w:tentative="1">
+      <w:start w:val="1"/>
+      <w:numFmt w:val="lowerLetter"/>
+      <w:lvlText w:val="%8."/>
+      <w:lvlJc w:val="left"/>
+      <w:pPr>
+        <w:ind w:left="5760" w:hanging="360"/>
+      </w:pPr>
+    </w:lvl>
+    <w:lvl w:ilvl="8" w:tplc="0809001B" w:tentative="1">
+      <w:start w:val="1"/>
+      <w:numFmt w:val="lowerRoman"/>
+      <w:lvlText w:val="%9."/>
+      <w:lvlJc w:val="right"/>
+      <w:pPr>
+        <w:ind w:left="6480" w:hanging="180"/>
+      </w:pPr>
+    </w:lvl>
+  </w:abstractNum>
+  <w:abstractNum w:abstractNumId="1" w15:restartNumberingAfterBreak="0">
     <w:nsid w:val="32232E53"/>
     <w:multiLevelType w:val="hybridMultilevel"/>
     <w:tmpl w:val="A18AD98E"/>
@@ -6057,7 +6177,7 @@
       <w:lvlJc w:val="left"/>
     </w:lvl>
   </w:abstractNum>
-  <w:abstractNum w:abstractNumId="1" w15:restartNumberingAfterBreak="0">
+  <w:abstractNum w:abstractNumId="2" w15:restartNumberingAfterBreak="0">
     <w:nsid w:val="390E7BDE"/>
     <w:multiLevelType w:val="hybridMultilevel"/>
     <w:tmpl w:val="89120742"/>
@@ -6111,7 +6231,7 @@
       <w:lvlJc w:val="left"/>
     </w:lvl>
   </w:abstractNum>
-  <w:abstractNum w:abstractNumId="2" w15:restartNumberingAfterBreak="0">
+  <w:abstractNum w:abstractNumId="3" w15:restartNumberingAfterBreak="0">
     <w:nsid w:val="3C136AD1"/>
     <w:multiLevelType w:val="hybridMultilevel"/>
     <w:tmpl w:val="561841A6"/>
@@ -6165,7 +6285,7 @@
       <w:lvlJc w:val="left"/>
     </w:lvl>
   </w:abstractNum>
-  <w:abstractNum w:abstractNumId="3" w15:restartNumberingAfterBreak="0">
+  <w:abstractNum w:abstractNumId="4" w15:restartNumberingAfterBreak="0">
     <w:nsid w:val="4D7D0219"/>
     <w:multiLevelType w:val="hybridMultilevel"/>
     <w:tmpl w:val="56C67584"/>
@@ -6219,7 +6339,7 @@
       <w:lvlJc w:val="left"/>
     </w:lvl>
   </w:abstractNum>
-  <w:abstractNum w:abstractNumId="4" w15:restartNumberingAfterBreak="0">
+  <w:abstractNum w:abstractNumId="5" w15:restartNumberingAfterBreak="0">
     <w:nsid w:val="5BF45D62"/>
     <w:multiLevelType w:val="hybridMultilevel"/>
     <w:tmpl w:val="84620FC2"/>
@@ -6277,7 +6397,7 @@
       <w:lvlJc w:val="left"/>
     </w:lvl>
   </w:abstractNum>
-  <w:abstractNum w:abstractNumId="5" w15:restartNumberingAfterBreak="0">
+  <w:abstractNum w:abstractNumId="6" w15:restartNumberingAfterBreak="0">
     <w:nsid w:val="6478163F"/>
     <w:multiLevelType w:val="hybridMultilevel"/>
     <w:tmpl w:val="595EBD3C"/>
@@ -6331,7 +6451,7 @@
       <w:lvlJc w:val="left"/>
     </w:lvl>
   </w:abstractNum>
-  <w:abstractNum w:abstractNumId="6" w15:restartNumberingAfterBreak="0">
+  <w:abstractNum w:abstractNumId="7" w15:restartNumberingAfterBreak="0">
     <w:nsid w:val="6B25353E"/>
     <w:multiLevelType w:val="hybridMultilevel"/>
     <w:tmpl w:val="D286DBF2"/>
@@ -6417,7 +6537,7 @@
       </w:pPr>
     </w:lvl>
   </w:abstractNum>
-  <w:abstractNum w:abstractNumId="7" w15:restartNumberingAfterBreak="0">
+  <w:abstractNum w:abstractNumId="8" w15:restartNumberingAfterBreak="0">
     <w:nsid w:val="771B1F7B"/>
     <w:multiLevelType w:val="hybridMultilevel"/>
     <w:tmpl w:val="B30A3670"/>
@@ -6472,16 +6592,19 @@
     </w:lvl>
   </w:abstractNum>
   <w:num w:numId="1" w16cid:durableId="1915315829">
-    <w:abstractNumId w:val="6"/>
+    <w:abstractNumId w:val="7"/>
     <w:lvlOverride w:ilvl="0">
       <w:startOverride w:val="1"/>
     </w:lvlOverride>
+  </w:num>
+  <w:num w:numId="2" w16cid:durableId="1911695768">
+    <w:abstractNumId w:val="0"/>
   </w:num>
 </w:numbering>
 </file>
 
 <file path=word/styles.xml><?xml version="1.0" encoding="utf-8"?>
-<w:styles xmlns:mc="http://schemas.openxmlformats.org/markup-compatibility/2006" xmlns:r="http://schemas.openxmlformats.org/officeDocument/2006/relationships" xmlns:w="http://schemas.openxmlformats.org/wordprocessingml/2006/main" xmlns:w14="http://schemas.microsoft.com/office/word/2010/wordml" xmlns:w15="http://schemas.microsoft.com/office/word/2012/wordml" xmlns:w16cex="http://schemas.microsoft.com/office/word/2018/wordml/cex" xmlns:w16cid="http://schemas.microsoft.com/office/word/2016/wordml/cid" xmlns:w16="http://schemas.microsoft.com/office/word/2018/wordml" xmlns:w16du="http://schemas.microsoft.com/office/word/2023/wordml/word16du" xmlns:w16sdtdh="http://schemas.microsoft.com/office/word/2020/wordml/sdtdatahash" xmlns:w16sdtfl="http://schemas.microsoft.com/office/word/2024/wordml/sdtformatlock" xmlns:w16se="http://schemas.microsoft.com/office/word/2015/wordml/symex" mc:Ignorable="w14 w15 w16se w16cid w16 w16cex w16sdtdh w16sdtfl w16du">
+<w:styles xmlns:mc="http://schemas.openxmlformats.org/markup-compatibility/2006" xmlns:r="http://schemas.openxmlformats.org/officeDocument/2006/relationships" xmlns:w="http://schemas.openxmlformats.org/wordprocessingml/2006/main" xmlns:w14="http://schemas.microsoft.com/office/word/2010/wordml" xmlns:w15="http://schemas.microsoft.com/office/word/2012/wordml" xmlns:w16cex="http://schemas.microsoft.com/office/word/2018/wordml/cex" xmlns:w16cid="http://schemas.microsoft.com/office/word/2016/wordml/cid" xmlns:w16="http://schemas.microsoft.com/office/word/2018/wordml" xmlns:w16sdtdh="http://schemas.microsoft.com/office/word/2020/wordml/sdtdatahash" xmlns:w16sdtfl="http://schemas.microsoft.com/office/word/2024/wordml/sdtformatlock" xmlns:w16se="http://schemas.microsoft.com/office/word/2015/wordml/symex" xmlns:w16du="http://schemas.microsoft.com/office/word/2023/wordml/word16du" mc:Ignorable="w14 w15 w16se w16cid w16 w16cex w16sdtdh w16sdtfl w16du">
   <w:docDefaults>
     <w:rPrDefault>
       <w:rPr>
@@ -6871,14 +6994,14 @@
     <w:lsdException w:name="Unresolved Mention" w:semiHidden="1" w:unhideWhenUsed="1"/>
     <w:lsdException w:name="Smart Link" w:semiHidden="1" w:unhideWhenUsed="1"/>
   </w:latentStyles>
-  <w:style w:type="paragraph" w:default="1" w:styleId="a">
+  <w:style w:type="paragraph" w:default="1" w:styleId="Normal">
     <w:name w:val="Normal"/>
     <w:qFormat/>
   </w:style>
-  <w:style w:type="paragraph" w:styleId="1">
+  <w:style w:type="paragraph" w:styleId="Heading1">
     <w:name w:val="heading 1"/>
-    <w:basedOn w:val="a"/>
-    <w:next w:val="a"/>
+    <w:basedOn w:val="Normal"/>
+    <w:next w:val="Normal"/>
     <w:uiPriority w:val="9"/>
     <w:qFormat/>
     <w:pPr>
@@ -6894,10 +7017,10 @@
       <w:szCs w:val="30"/>
     </w:rPr>
   </w:style>
-  <w:style w:type="paragraph" w:styleId="2">
+  <w:style w:type="paragraph" w:styleId="Heading2">
     <w:name w:val="heading 2"/>
-    <w:basedOn w:val="a"/>
-    <w:next w:val="a"/>
+    <w:basedOn w:val="Normal"/>
+    <w:next w:val="Normal"/>
     <w:uiPriority w:val="9"/>
     <w:semiHidden/>
     <w:unhideWhenUsed/>
@@ -6915,10 +7038,10 @@
       <w:szCs w:val="25"/>
     </w:rPr>
   </w:style>
-  <w:style w:type="paragraph" w:styleId="3">
+  <w:style w:type="paragraph" w:styleId="Heading3">
     <w:name w:val="heading 3"/>
-    <w:basedOn w:val="a"/>
-    <w:next w:val="a"/>
+    <w:basedOn w:val="Normal"/>
+    <w:next w:val="Normal"/>
     <w:uiPriority w:val="9"/>
     <w:semiHidden/>
     <w:unhideWhenUsed/>
@@ -6936,10 +7059,10 @@
       <w:szCs w:val="22"/>
     </w:rPr>
   </w:style>
-  <w:style w:type="paragraph" w:styleId="4">
+  <w:style w:type="paragraph" w:styleId="Heading4">
     <w:name w:val="heading 4"/>
-    <w:basedOn w:val="a"/>
-    <w:next w:val="a"/>
+    <w:basedOn w:val="Normal"/>
+    <w:next w:val="Normal"/>
     <w:uiPriority w:val="9"/>
     <w:semiHidden/>
     <w:unhideWhenUsed/>
@@ -6953,10 +7076,10 @@
       <w:color w:val="2E74B5"/>
     </w:rPr>
   </w:style>
-  <w:style w:type="paragraph" w:styleId="5">
+  <w:style w:type="paragraph" w:styleId="Heading5">
     <w:name w:val="heading 5"/>
-    <w:basedOn w:val="a"/>
-    <w:next w:val="a"/>
+    <w:basedOn w:val="Normal"/>
+    <w:next w:val="Normal"/>
     <w:uiPriority w:val="9"/>
     <w:semiHidden/>
     <w:unhideWhenUsed/>
@@ -6968,10 +7091,10 @@
       <w:color w:val="2E74B5"/>
     </w:rPr>
   </w:style>
-  <w:style w:type="paragraph" w:styleId="6">
+  <w:style w:type="paragraph" w:styleId="Heading6">
     <w:name w:val="heading 6"/>
-    <w:basedOn w:val="a"/>
-    <w:next w:val="a"/>
+    <w:basedOn w:val="Normal"/>
+    <w:next w:val="Normal"/>
     <w:uiPriority w:val="9"/>
     <w:semiHidden/>
     <w:unhideWhenUsed/>
@@ -6983,13 +7106,13 @@
       <w:color w:val="1F4D78"/>
     </w:rPr>
   </w:style>
-  <w:style w:type="character" w:default="1" w:styleId="a0">
+  <w:style w:type="character" w:default="1" w:styleId="DefaultParagraphFont">
     <w:name w:val="Default Paragraph Font"/>
     <w:uiPriority w:val="1"/>
     <w:semiHidden/>
     <w:unhideWhenUsed/>
   </w:style>
-  <w:style w:type="table" w:default="1" w:styleId="a1">
+  <w:style w:type="table" w:default="1" w:styleId="TableNormal">
     <w:name w:val="Normal Table"/>
     <w:uiPriority w:val="99"/>
     <w:semiHidden/>
@@ -7004,16 +7127,16 @@
       </w:tblCellMar>
     </w:tblPr>
   </w:style>
-  <w:style w:type="numbering" w:default="1" w:styleId="a2">
+  <w:style w:type="numbering" w:default="1" w:styleId="NoList">
     <w:name w:val="No List"/>
     <w:uiPriority w:val="99"/>
     <w:semiHidden/>
     <w:unhideWhenUsed/>
   </w:style>
-  <w:style w:type="paragraph" w:styleId="a3">
+  <w:style w:type="paragraph" w:styleId="Title">
     <w:name w:val="Title"/>
-    <w:basedOn w:val="a"/>
-    <w:next w:val="a"/>
+    <w:basedOn w:val="Normal"/>
+    <w:next w:val="Normal"/>
     <w:uiPriority w:val="10"/>
     <w:qFormat/>
     <w:rPr>
@@ -7021,22 +7144,22 @@
       <w:szCs w:val="56"/>
     </w:rPr>
   </w:style>
-  <w:style w:type="paragraph" w:customStyle="1" w:styleId="10">
+  <w:style w:type="paragraph" w:customStyle="1" w:styleId="1">
     <w:name w:val="要点1"/>
-    <w:basedOn w:val="a"/>
-    <w:next w:val="a"/>
+    <w:basedOn w:val="Normal"/>
+    <w:next w:val="Normal"/>
     <w:qFormat/>
     <w:rPr>
       <w:b/>
       <w:bCs/>
     </w:rPr>
   </w:style>
-  <w:style w:type="paragraph" w:styleId="a4">
+  <w:style w:type="paragraph" w:styleId="ListParagraph">
     <w:name w:val="List Paragraph"/>
-    <w:basedOn w:val="a"/>
+    <w:basedOn w:val="Normal"/>
     <w:qFormat/>
   </w:style>
-  <w:style w:type="character" w:styleId="a5">
+  <w:style w:type="character" w:styleId="Hyperlink">
     <w:name w:val="Hyperlink"/>
     <w:uiPriority w:val="99"/>
     <w:unhideWhenUsed/>
@@ -7045,7 +7168,7 @@
       <w:u w:val="single"/>
     </w:rPr>
   </w:style>
-  <w:style w:type="character" w:styleId="a6">
+  <w:style w:type="character" w:styleId="FootnoteReference">
     <w:name w:val="footnote reference"/>
     <w:uiPriority w:val="99"/>
     <w:semiHidden/>
@@ -7054,10 +7177,10 @@
       <w:vertAlign w:val="superscript"/>
     </w:rPr>
   </w:style>
-  <w:style w:type="paragraph" w:styleId="a7">
+  <w:style w:type="paragraph" w:styleId="FootnoteText">
     <w:name w:val="footnote text"/>
-    <w:basedOn w:val="a"/>
-    <w:link w:val="a8"/>
+    <w:basedOn w:val="Normal"/>
+    <w:link w:val="FootnoteTextChar"/>
     <w:uiPriority w:val="99"/>
     <w:semiHidden/>
     <w:unhideWhenUsed/>
@@ -7066,9 +7189,9 @@
       <w:szCs w:val="20"/>
     </w:rPr>
   </w:style>
-  <w:style w:type="character" w:customStyle="1" w:styleId="a8">
-    <w:name w:val="脚注文本 字符"/>
-    <w:link w:val="a7"/>
+  <w:style w:type="character" w:customStyle="1" w:styleId="FootnoteTextChar">
+    <w:name w:val="Footnote Text Char"/>
+    <w:link w:val="FootnoteText"/>
     <w:uiPriority w:val="99"/>
     <w:semiHidden/>
     <w:unhideWhenUsed/>
@@ -7077,7 +7200,7 @@
       <w:szCs w:val="20"/>
     </w:rPr>
   </w:style>
-  <w:style w:type="character" w:styleId="a9">
+  <w:style w:type="character" w:styleId="EndnoteReference">
     <w:name w:val="endnote reference"/>
     <w:uiPriority w:val="99"/>
     <w:semiHidden/>
@@ -7086,10 +7209,10 @@
       <w:vertAlign w:val="superscript"/>
     </w:rPr>
   </w:style>
-  <w:style w:type="paragraph" w:styleId="aa">
+  <w:style w:type="paragraph" w:styleId="EndnoteText">
     <w:name w:val="endnote text"/>
-    <w:basedOn w:val="a"/>
-    <w:link w:val="ab"/>
+    <w:basedOn w:val="Normal"/>
+    <w:link w:val="EndnoteTextChar"/>
     <w:uiPriority w:val="99"/>
     <w:semiHidden/>
     <w:unhideWhenUsed/>
@@ -7098,9 +7221,9 @@
       <w:szCs w:val="20"/>
     </w:rPr>
   </w:style>
-  <w:style w:type="character" w:customStyle="1" w:styleId="ab">
-    <w:name w:val="尾注文本 字符"/>
-    <w:link w:val="aa"/>
+  <w:style w:type="character" w:customStyle="1" w:styleId="EndnoteTextChar">
+    <w:name w:val="Endnote Text Char"/>
+    <w:link w:val="EndnoteText"/>
     <w:uiPriority w:val="99"/>
     <w:semiHidden/>
     <w:unhideWhenUsed/>

</xml_diff>